<commit_message>
feat: add multi-language support and order printing service configuration
</commit_message>
<xml_diff>
--- a/backend-app/samples/In Don dat hang.docx
+++ b/backend-app/samples/In Don dat hang.docx
@@ -1375,6 +1375,102 @@
         <w:ind w:left="173" w:right="0" w:firstLine="0"/>
         <w:jc w:val="left"/>
         <w:rPr>
+          <w:rFonts w:hint="default"/>
+          <w:b/>
+          <w:spacing w:val="-4"/>
+          <w:sz w:val="18"/>
+        </w:rPr>
+      </w:pPr>
+      <w:r>
+        <w:rPr>
+          <w:rFonts w:ascii="MS UI Gothic" w:hAnsi="MS UI Gothic"/>
+          <w:position w:val="1"/>
+          <w:sz w:val="18"/>
+        </w:rPr>
+        <w:t>Đ</w:t>
+      </w:r>
+      <w:r>
+        <w:rPr>
+          <w:rFonts w:ascii="Microsoft Sans Serif" w:hAnsi="Microsoft Sans Serif"/>
+          <w:position w:val="1"/>
+          <w:sz w:val="18"/>
+        </w:rPr>
+        <w:t>ị</w:t>
+      </w:r>
+      <w:r>
+        <w:rPr>
+          <w:position w:val="1"/>
+          <w:sz w:val="18"/>
+        </w:rPr>
+        <w:t>a</w:t>
+      </w:r>
+      <w:r>
+        <w:rPr>
+          <w:spacing w:val="-2"/>
+          <w:position w:val="1"/>
+          <w:sz w:val="18"/>
+        </w:rPr>
+        <w:t xml:space="preserve"> </w:t>
+      </w:r>
+      <w:r>
+        <w:rPr>
+          <w:position w:val="1"/>
+          <w:sz w:val="18"/>
+        </w:rPr>
+        <w:t>ch</w:t>
+      </w:r>
+      <w:r>
+        <w:rPr>
+          <w:rFonts w:ascii="Microsoft Sans Serif" w:hAnsi="Microsoft Sans Serif"/>
+          <w:position w:val="1"/>
+          <w:sz w:val="18"/>
+        </w:rPr>
+        <w:t>ỉ</w:t>
+      </w:r>
+      <w:r>
+        <w:rPr>
+          <w:rFonts w:ascii="Microsoft Sans Serif" w:hAnsi="Microsoft Sans Serif"/>
+          <w:spacing w:val="-3"/>
+          <w:position w:val="1"/>
+          <w:sz w:val="18"/>
+        </w:rPr>
+        <w:t xml:space="preserve"> </w:t>
+      </w:r>
+      <w:r>
+        <w:rPr>
+          <w:spacing w:val="-12"/>
+          <w:position w:val="1"/>
+          <w:sz w:val="18"/>
+        </w:rPr>
+        <w:t>:</w:t>
+      </w:r>
+      <w:r>
+        <w:rPr>
+          <w:position w:val="1"/>
+          <w:sz w:val="18"/>
+        </w:rPr>
+        <w:tab/>
+      </w:r>
+      <w:r>
+        <w:rPr>
+          <w:rFonts w:hint="default"/>
+          <w:b/>
+          <w:spacing w:val="-4"/>
+          <w:sz w:val="18"/>
+        </w:rPr>
+        <w:t>{DiaChi}</w:t>
+      </w:r>
+    </w:p>
+    <w:p>
+      <w:pPr>
+        <w:tabs>
+          <w:tab w:val="left" w:pos="1552"/>
+          <w:tab w:val="left" w:pos="7390"/>
+        </w:tabs>
+        <w:spacing w:before="175"/>
+        <w:ind w:left="173" w:right="0" w:firstLine="0"/>
+        <w:jc w:val="left"/>
+        <w:rPr>
           <w:b/>
           <w:spacing w:val="8"/>
           <w:position w:val="1"/>
@@ -1383,92 +1479,6 @@
       </w:pPr>
       <w:r>
         <w:rPr>
-          <w:rFonts w:ascii="MS UI Gothic" w:hAnsi="MS UI Gothic"/>
-          <w:position w:val="1"/>
-          <w:sz w:val="18"/>
-        </w:rPr>
-        <w:t>Đ</w:t>
-      </w:r>
-      <w:r>
-        <w:rPr>
-          <w:rFonts w:ascii="Microsoft Sans Serif" w:hAnsi="Microsoft Sans Serif"/>
-          <w:position w:val="1"/>
-          <w:sz w:val="18"/>
-        </w:rPr>
-        <w:t>ị</w:t>
-      </w:r>
-      <w:r>
-        <w:rPr>
-          <w:position w:val="1"/>
-          <w:sz w:val="18"/>
-        </w:rPr>
-        <w:t>a</w:t>
-      </w:r>
-      <w:r>
-        <w:rPr>
-          <w:spacing w:val="-2"/>
-          <w:position w:val="1"/>
-          <w:sz w:val="18"/>
-        </w:rPr>
-        <w:t xml:space="preserve"> </w:t>
-      </w:r>
-      <w:r>
-        <w:rPr>
-          <w:position w:val="1"/>
-          <w:sz w:val="18"/>
-        </w:rPr>
-        <w:t>ch</w:t>
-      </w:r>
-      <w:r>
-        <w:rPr>
-          <w:rFonts w:ascii="Microsoft Sans Serif" w:hAnsi="Microsoft Sans Serif"/>
-          <w:position w:val="1"/>
-          <w:sz w:val="18"/>
-        </w:rPr>
-        <w:t>ỉ</w:t>
-      </w:r>
-      <w:r>
-        <w:rPr>
-          <w:rFonts w:ascii="Microsoft Sans Serif" w:hAnsi="Microsoft Sans Serif"/>
-          <w:spacing w:val="-3"/>
-          <w:position w:val="1"/>
-          <w:sz w:val="18"/>
-        </w:rPr>
-        <w:t xml:space="preserve"> </w:t>
-      </w:r>
-      <w:r>
-        <w:rPr>
-          <w:spacing w:val="-12"/>
-          <w:position w:val="1"/>
-          <w:sz w:val="18"/>
-        </w:rPr>
-        <w:t>:</w:t>
-      </w:r>
-      <w:r>
-        <w:rPr>
-          <w:position w:val="1"/>
-          <w:sz w:val="18"/>
-        </w:rPr>
-        <w:tab/>
-      </w:r>
-      <w:r>
-        <w:rPr>
-          <w:rFonts w:hint="default"/>
-          <w:b/>
-          <w:spacing w:val="-4"/>
-          <w:sz w:val="18"/>
-        </w:rPr>
-        <w:t>{DiaChi}</w:t>
-      </w:r>
-      <w:r>
-        <w:rPr>
-          <w:b/>
-          <w:sz w:val="18"/>
-        </w:rPr>
-        <w:tab/>
-      </w:r>
-      <w:r>
-        <w:rPr>
           <w:position w:val="1"/>
           <w:sz w:val="18"/>
         </w:rPr>
@@ -1513,6 +1523,17 @@
         </w:rPr>
         <w:t xml:space="preserve"> </w:t>
       </w:r>
+      <w:r>
+        <w:rPr>
+          <w:rFonts w:hint="default"/>
+          <w:position w:val="1"/>
+          <w:sz w:val="18"/>
+          <w:lang w:val="en-US"/>
+        </w:rPr>
+        <w:tab/>
+      </w:r>
+      <w:bookmarkStart w:id="0" w:name="_GoBack"/>
+      <w:bookmarkEnd w:id="0"/>
       <w:r>
         <w:rPr>
           <w:rFonts w:hint="default"/>
@@ -1609,17 +1630,7 @@
           <w:sz w:val="18"/>
           <w:lang w:val="en-US"/>
         </w:rPr>
-        <w:t>{DienGiai</w:t>
-      </w:r>
-      <w:bookmarkStart w:id="0" w:name="_GoBack"/>
-      <w:bookmarkEnd w:id="0"/>
-      <w:r>
-        <w:rPr>
-          <w:rFonts w:hint="default"/>
-          <w:sz w:val="18"/>
-          <w:lang w:val="en-US"/>
-        </w:rPr>
-        <w:t>}</w:t>
+        <w:t>{DienGiai}</w:t>
       </w:r>
     </w:p>
     <w:p>

</xml_diff>

<commit_message>
feat: add bilingual localization support and order print template structure
</commit_message>
<xml_diff>
--- a/backend-app/samples/In Don dat hang.docx
+++ b/backend-app/samples/In Don dat hang.docx
@@ -750,501 +750,25 @@
             </w:tcBorders>
           </w:tcPr>
           <w:p>
-            <w:pPr>
-              <w:spacing w:before="0" w:after="0" w:line="240" w:lineRule="auto"/>
-              <w:jc w:val="left"/>
-            </w:pPr>
             <w:r/>
+          </w:p>
+          <w:p>
             <w:r>
               <w:rPr>
-                <w:rFonts w:ascii="Times New Roman" w:hAnsi="Times New Roman" w:eastAsia="Times New Roman"/>
                 <w:b/>
-                <w:i w:val="0"/>
-                <w:color w:val="000000"/>
-                <w:sz w:val="17"/>
               </w:rPr>
-              <w:t xml:space="preserve">Màu: </w:t>
-            </w:r>
-            <w:r>
-              <w:rPr>
-                <w:rFonts w:ascii="Times New Roman" w:hAnsi="Times New Roman" w:eastAsia="Times New Roman"/>
-                <w:b/>
-                <w:i w:val="0"/>
-                <w:color w:val="000000"/>
-                <w:sz w:val="18"/>
-              </w:rPr>
-              <w:t>{mau}</w:t>
+              <w:t>{ten_hang_goc}</w:t>
             </w:r>
           </w:p>
-          <w:tbl>
-            <w:tblPr>
-              <w:tblW w:type="auto" w:w="0"/>
-              <w:jc w:val="left"/>
-              <w:tblLayout w:type="fixed"/>
-              <w:tblLook w:firstColumn="1" w:firstRow="1" w:lastColumn="0" w:lastRow="0" w:noHBand="0" w:noVBand="1" w:val="04A0"/>
-            </w:tblPr>
-            <w:tblGrid>
-              <w:gridCol w:w="1800"/>
-              <w:gridCol w:w="1800"/>
-              <w:gridCol w:w="1800"/>
-            </w:tblGrid>
-            <w:tr>
-              <w:trPr>
-                <w:trHeight w:val="180" w:hRule="atLeast"/>
-              </w:trPr>
-              <w:tc>
-                <w:tcPr>
-                  <w:tcW w:type="dxa" w:w="1800"/>
-                  <w:tcMar>
-                    <w:top w:w="20" w:type="dxa"/>
-                    <w:start w:w="25" w:type="dxa"/>
-                    <w:bottom w:w="20" w:type="dxa"/>
-                    <w:end w:w="25" w:type="dxa"/>
-                  </w:tcMar>
-                  <w:vAlign w:val="center"/>
-                  <w:shd w:val="clear" w:fill="FFFFFF"/>
-                  <w:tcBorders>
-                    <w:top w:val="nil"/>
-                    <w:left w:val="nil"/>
-                    <w:bottom w:val="nil"/>
-                    <w:right w:val="nil"/>
-                  </w:tcBorders>
-                </w:tcPr>
-                <w:p>
-                  <w:pPr>
-                    <w:spacing w:after="0" w:before="0" w:line="240" w:lineRule="auto"/>
-                    <w:jc w:val="center"/>
-                  </w:pPr>
-                  <w:r/>
-                  <w:r>
-                    <w:rPr>
-                      <w:rFonts w:ascii="Times New Roman" w:hAnsi="Times New Roman" w:eastAsia="Times New Roman"/>
-                      <w:b/>
-                      <w:i w:val="0"/>
-                      <w:color w:val="000000"/>
-                      <w:sz w:val="16"/>
-                    </w:rPr>
-                    <w:t>38</w:t>
-                  </w:r>
-                </w:p>
-              </w:tc>
-              <w:tc>
-                <w:tcPr>
-                  <w:tcW w:type="dxa" w:w="1800"/>
-                  <w:tcMar>
-                    <w:top w:w="20" w:type="dxa"/>
-                    <w:start w:w="25" w:type="dxa"/>
-                    <w:bottom w:w="20" w:type="dxa"/>
-                    <w:end w:w="25" w:type="dxa"/>
-                  </w:tcMar>
-                  <w:vAlign w:val="center"/>
-                  <w:shd w:val="clear" w:fill="FFFFFF"/>
-                  <w:tcBorders>
-                    <w:top w:val="nil"/>
-                    <w:left w:val="nil"/>
-                    <w:bottom w:val="nil"/>
-                    <w:right w:val="nil"/>
-                  </w:tcBorders>
-                </w:tcPr>
-                <w:p>
-                  <w:pPr>
-                    <w:spacing w:after="0" w:before="0" w:line="240" w:lineRule="auto"/>
-                    <w:jc w:val="center"/>
-                  </w:pPr>
-                  <w:r/>
-                  <w:r>
-                    <w:rPr>
-                      <w:rFonts w:ascii="Times New Roman" w:hAnsi="Times New Roman" w:eastAsia="Times New Roman"/>
-                      <w:b/>
-                      <w:i w:val="0"/>
-                      <w:color w:val="000000"/>
-                      <w:sz w:val="16"/>
-                    </w:rPr>
-                    <w:t>39</w:t>
-                  </w:r>
-                </w:p>
-              </w:tc>
-              <w:tc>
-                <w:tcPr>
-                  <w:tcW w:type="dxa" w:w="1800"/>
-                  <w:tcMar>
-                    <w:top w:w="20" w:type="dxa"/>
-                    <w:start w:w="25" w:type="dxa"/>
-                    <w:bottom w:w="20" w:type="dxa"/>
-                    <w:end w:w="25" w:type="dxa"/>
-                  </w:tcMar>
-                  <w:vAlign w:val="center"/>
-                  <w:shd w:val="clear" w:fill="FFFFFF"/>
-                  <w:tcBorders>
-                    <w:top w:val="nil"/>
-                    <w:left w:val="nil"/>
-                    <w:bottom w:val="nil"/>
-                    <w:right w:val="nil"/>
-                  </w:tcBorders>
-                </w:tcPr>
-                <w:p>
-                  <w:pPr>
-                    <w:spacing w:after="0" w:before="0" w:line="240" w:lineRule="auto"/>
-                    <w:jc w:val="center"/>
-                  </w:pPr>
-                  <w:r/>
-                  <w:r>
-                    <w:rPr>
-                      <w:rFonts w:ascii="Times New Roman" w:hAnsi="Times New Roman" w:eastAsia="Times New Roman"/>
-                      <w:b/>
-                      <w:i w:val="0"/>
-                      <w:color w:val="000000"/>
-                      <w:sz w:val="16"/>
-                    </w:rPr>
-                    <w:t>40</w:t>
-                  </w:r>
-                </w:p>
-              </w:tc>
-            </w:tr>
-            <w:tr>
-              <w:trPr>
-                <w:trHeight w:val="260" w:hRule="atLeast"/>
-              </w:trPr>
-              <w:tc>
-                <w:tcPr>
-                  <w:tcW w:type="dxa" w:w="1800"/>
-                  <w:tcMar>
-                    <w:top w:w="20" w:type="dxa"/>
-                    <w:start w:w="25" w:type="dxa"/>
-                    <w:bottom w:w="20" w:type="dxa"/>
-                    <w:end w:w="25" w:type="dxa"/>
-                  </w:tcMar>
-                  <w:vAlign w:val="center"/>
-                  <w:shd w:val="clear" w:fill="FFFFFF"/>
-                  <w:tcBorders>
-                    <w:top w:val="single" w:sz="5" w:color="A6A6A6"/>
-                    <w:left w:val="single" w:sz="5" w:color="A6A6A6"/>
-                    <w:bottom w:val="single" w:sz="5" w:color="A6A6A6"/>
-                    <w:right w:val="single" w:sz="5" w:color="A6A6A6"/>
-                  </w:tcBorders>
-                </w:tcPr>
-                <w:p>
-                  <w:pPr>
-                    <w:spacing w:after="0" w:before="0" w:line="240" w:lineRule="auto"/>
-                    <w:jc w:val="center"/>
-                  </w:pPr>
-                  <w:r/>
-                  <w:r>
-                    <w:rPr>
-                      <w:rFonts w:ascii="Times New Roman" w:hAnsi="Times New Roman" w:eastAsia="Times New Roman"/>
-                      <w:b/>
-                      <w:i w:val="0"/>
-                      <w:color w:val="000000"/>
-                      <w:sz w:val="18"/>
-                    </w:rPr>
-                    <w:t>{sz38}</w:t>
-                  </w:r>
-                </w:p>
-              </w:tc>
-              <w:tc>
-                <w:tcPr>
-                  <w:tcW w:type="dxa" w:w="1800"/>
-                  <w:tcMar>
-                    <w:top w:w="20" w:type="dxa"/>
-                    <w:start w:w="25" w:type="dxa"/>
-                    <w:bottom w:w="20" w:type="dxa"/>
-                    <w:end w:w="25" w:type="dxa"/>
-                  </w:tcMar>
-                  <w:vAlign w:val="center"/>
-                  <w:shd w:val="clear" w:fill="FFFFFF"/>
-                  <w:tcBorders>
-                    <w:top w:val="single" w:sz="5" w:color="A6A6A6"/>
-                    <w:left w:val="single" w:sz="5" w:color="A6A6A6"/>
-                    <w:bottom w:val="single" w:sz="5" w:color="A6A6A6"/>
-                    <w:right w:val="single" w:sz="5" w:color="A6A6A6"/>
-                  </w:tcBorders>
-                </w:tcPr>
-                <w:p>
-                  <w:pPr>
-                    <w:spacing w:after="0" w:before="0" w:line="240" w:lineRule="auto"/>
-                    <w:jc w:val="center"/>
-                  </w:pPr>
-                  <w:r/>
-                  <w:r>
-                    <w:rPr>
-                      <w:rFonts w:ascii="Times New Roman" w:hAnsi="Times New Roman" w:eastAsia="Times New Roman"/>
-                      <w:b/>
-                      <w:i w:val="0"/>
-                      <w:color w:val="000000"/>
-                      <w:sz w:val="18"/>
-                    </w:rPr>
-                    <w:t>{sz39}</w:t>
-                  </w:r>
-                </w:p>
-              </w:tc>
-              <w:tc>
-                <w:tcPr>
-                  <w:tcW w:type="dxa" w:w="1800"/>
-                  <w:tcMar>
-                    <w:top w:w="20" w:type="dxa"/>
-                    <w:start w:w="25" w:type="dxa"/>
-                    <w:bottom w:w="20" w:type="dxa"/>
-                    <w:end w:w="25" w:type="dxa"/>
-                  </w:tcMar>
-                  <w:vAlign w:val="center"/>
-                  <w:shd w:val="clear" w:fill="FFFFFF"/>
-                  <w:tcBorders>
-                    <w:top w:val="single" w:sz="5" w:color="A6A6A6"/>
-                    <w:left w:val="single" w:sz="5" w:color="A6A6A6"/>
-                    <w:bottom w:val="single" w:sz="5" w:color="A6A6A6"/>
-                    <w:right w:val="single" w:sz="5" w:color="A6A6A6"/>
-                  </w:tcBorders>
-                </w:tcPr>
-                <w:p>
-                  <w:pPr>
-                    <w:spacing w:after="0" w:before="0" w:line="240" w:lineRule="auto"/>
-                    <w:jc w:val="center"/>
-                  </w:pPr>
-                  <w:r/>
-                  <w:r>
-                    <w:rPr>
-                      <w:rFonts w:ascii="Times New Roman" w:hAnsi="Times New Roman" w:eastAsia="Times New Roman"/>
-                      <w:b/>
-                      <w:i w:val="0"/>
-                      <w:color w:val="000000"/>
-                      <w:sz w:val="18"/>
-                    </w:rPr>
-                    <w:t>{sz40}</w:t>
-                  </w:r>
-                </w:p>
-              </w:tc>
-            </w:tr>
-            <w:tr>
-              <w:trPr>
-                <w:trHeight w:val="180" w:hRule="atLeast"/>
-              </w:trPr>
-              <w:tc>
-                <w:tcPr>
-                  <w:tcW w:type="dxa" w:w="1800"/>
-                  <w:tcMar>
-                    <w:top w:w="20" w:type="dxa"/>
-                    <w:start w:w="25" w:type="dxa"/>
-                    <w:bottom w:w="20" w:type="dxa"/>
-                    <w:end w:w="25" w:type="dxa"/>
-                  </w:tcMar>
-                  <w:vAlign w:val="center"/>
-                  <w:shd w:val="clear" w:fill="FFFFFF"/>
-                  <w:tcBorders>
-                    <w:top w:val="nil"/>
-                    <w:left w:val="nil"/>
-                    <w:bottom w:val="nil"/>
-                    <w:right w:val="nil"/>
-                  </w:tcBorders>
-                </w:tcPr>
-                <w:p>
-                  <w:pPr>
-                    <w:spacing w:after="0" w:before="0" w:line="240" w:lineRule="auto"/>
-                    <w:jc w:val="center"/>
-                  </w:pPr>
-                  <w:r/>
-                  <w:r>
-                    <w:rPr>
-                      <w:rFonts w:ascii="Times New Roman" w:hAnsi="Times New Roman" w:eastAsia="Times New Roman"/>
-                      <w:b/>
-                      <w:i w:val="0"/>
-                      <w:color w:val="000000"/>
-                      <w:sz w:val="16"/>
-                    </w:rPr>
-                    <w:t>41</w:t>
-                  </w:r>
-                </w:p>
-              </w:tc>
-              <w:tc>
-                <w:tcPr>
-                  <w:tcW w:type="dxa" w:w="1800"/>
-                  <w:tcMar>
-                    <w:top w:w="20" w:type="dxa"/>
-                    <w:start w:w="25" w:type="dxa"/>
-                    <w:bottom w:w="20" w:type="dxa"/>
-                    <w:end w:w="25" w:type="dxa"/>
-                  </w:tcMar>
-                  <w:vAlign w:val="center"/>
-                  <w:shd w:val="clear" w:fill="FFFFFF"/>
-                  <w:tcBorders>
-                    <w:top w:val="nil"/>
-                    <w:left w:val="nil"/>
-                    <w:bottom w:val="nil"/>
-                    <w:right w:val="nil"/>
-                  </w:tcBorders>
-                </w:tcPr>
-                <w:p>
-                  <w:pPr>
-                    <w:spacing w:after="0" w:before="0" w:line="240" w:lineRule="auto"/>
-                    <w:jc w:val="center"/>
-                  </w:pPr>
-                  <w:r/>
-                  <w:r>
-                    <w:rPr>
-                      <w:rFonts w:ascii="Times New Roman" w:hAnsi="Times New Roman" w:eastAsia="Times New Roman"/>
-                      <w:b/>
-                      <w:i w:val="0"/>
-                      <w:color w:val="000000"/>
-                      <w:sz w:val="16"/>
-                    </w:rPr>
-                    <w:t>42</w:t>
-                  </w:r>
-                </w:p>
-              </w:tc>
-              <w:tc>
-                <w:tcPr>
-                  <w:tcW w:type="dxa" w:w="1800"/>
-                  <w:tcMar>
-                    <w:top w:w="20" w:type="dxa"/>
-                    <w:start w:w="25" w:type="dxa"/>
-                    <w:bottom w:w="20" w:type="dxa"/>
-                    <w:end w:w="25" w:type="dxa"/>
-                  </w:tcMar>
-                  <w:vAlign w:val="center"/>
-                  <w:shd w:val="clear" w:fill="FFFFFF"/>
-                  <w:tcBorders>
-                    <w:top w:val="nil"/>
-                    <w:left w:val="nil"/>
-                    <w:bottom w:val="nil"/>
-                    <w:right w:val="nil"/>
-                  </w:tcBorders>
-                </w:tcPr>
-                <w:p>
-                  <w:pPr>
-                    <w:spacing w:after="0" w:before="0" w:line="240" w:lineRule="auto"/>
-                    <w:jc w:val="center"/>
-                  </w:pPr>
-                  <w:r/>
-                  <w:r>
-                    <w:rPr>
-                      <w:rFonts w:ascii="Times New Roman" w:hAnsi="Times New Roman" w:eastAsia="Times New Roman"/>
-                      <w:b/>
-                      <w:i w:val="0"/>
-                      <w:color w:val="000000"/>
-                      <w:sz w:val="16"/>
-                    </w:rPr>
-                    <w:t>43</w:t>
-                  </w:r>
-                </w:p>
-              </w:tc>
-            </w:tr>
-            <w:tr>
-              <w:trPr>
-                <w:trHeight w:val="260" w:hRule="atLeast"/>
-              </w:trPr>
-              <w:tc>
-                <w:tcPr>
-                  <w:tcW w:type="dxa" w:w="1800"/>
-                  <w:tcMar>
-                    <w:top w:w="20" w:type="dxa"/>
-                    <w:start w:w="25" w:type="dxa"/>
-                    <w:bottom w:w="20" w:type="dxa"/>
-                    <w:end w:w="25" w:type="dxa"/>
-                  </w:tcMar>
-                  <w:vAlign w:val="center"/>
-                  <w:shd w:val="clear" w:fill="FFFFFF"/>
-                  <w:tcBorders>
-                    <w:top w:val="single" w:sz="5" w:color="A6A6A6"/>
-                    <w:left w:val="single" w:sz="5" w:color="A6A6A6"/>
-                    <w:bottom w:val="single" w:sz="5" w:color="A6A6A6"/>
-                    <w:right w:val="single" w:sz="5" w:color="A6A6A6"/>
-                  </w:tcBorders>
-                </w:tcPr>
-                <w:p>
-                  <w:pPr>
-                    <w:spacing w:after="0" w:before="0" w:line="240" w:lineRule="auto"/>
-                    <w:jc w:val="center"/>
-                  </w:pPr>
-                  <w:r/>
-                  <w:r>
-                    <w:rPr>
-                      <w:rFonts w:ascii="Times New Roman" w:hAnsi="Times New Roman" w:eastAsia="Times New Roman"/>
-                      <w:b/>
-                      <w:i w:val="0"/>
-                      <w:color w:val="000000"/>
-                      <w:sz w:val="18"/>
-                    </w:rPr>
-                    <w:t>{sz41}</w:t>
-                  </w:r>
-                </w:p>
-              </w:tc>
-              <w:tc>
-                <w:tcPr>
-                  <w:tcW w:type="dxa" w:w="1800"/>
-                  <w:tcMar>
-                    <w:top w:w="20" w:type="dxa"/>
-                    <w:start w:w="25" w:type="dxa"/>
-                    <w:bottom w:w="20" w:type="dxa"/>
-                    <w:end w:w="25" w:type="dxa"/>
-                  </w:tcMar>
-                  <w:vAlign w:val="center"/>
-                  <w:shd w:val="clear" w:fill="FFFFFF"/>
-                  <w:tcBorders>
-                    <w:top w:val="single" w:sz="5" w:color="A6A6A6"/>
-                    <w:left w:val="single" w:sz="5" w:color="A6A6A6"/>
-                    <w:bottom w:val="single" w:sz="5" w:color="A6A6A6"/>
-                    <w:right w:val="single" w:sz="5" w:color="A6A6A6"/>
-                  </w:tcBorders>
-                </w:tcPr>
-                <w:p>
-                  <w:pPr>
-                    <w:spacing w:after="0" w:before="0" w:line="240" w:lineRule="auto"/>
-                    <w:jc w:val="center"/>
-                  </w:pPr>
-                  <w:r/>
-                  <w:r>
-                    <w:rPr>
-                      <w:rFonts w:ascii="Times New Roman" w:hAnsi="Times New Roman" w:eastAsia="Times New Roman"/>
-                      <w:b/>
-                      <w:i w:val="0"/>
-                      <w:color w:val="000000"/>
-                      <w:sz w:val="18"/>
-                    </w:rPr>
-                    <w:t>{sz42}</w:t>
-                  </w:r>
-                </w:p>
-              </w:tc>
-              <w:tc>
-                <w:tcPr>
-                  <w:tcW w:type="dxa" w:w="1800"/>
-                  <w:tcMar>
-                    <w:top w:w="20" w:type="dxa"/>
-                    <w:start w:w="25" w:type="dxa"/>
-                    <w:bottom w:w="20" w:type="dxa"/>
-                    <w:end w:w="25" w:type="dxa"/>
-                  </w:tcMar>
-                  <w:vAlign w:val="center"/>
-                  <w:shd w:val="clear" w:fill="FFFFFF"/>
-                  <w:tcBorders>
-                    <w:top w:val="single" w:sz="5" w:color="A6A6A6"/>
-                    <w:left w:val="single" w:sz="5" w:color="A6A6A6"/>
-                    <w:bottom w:val="single" w:sz="5" w:color="A6A6A6"/>
-                    <w:right w:val="single" w:sz="5" w:color="A6A6A6"/>
-                  </w:tcBorders>
-                </w:tcPr>
-                <w:p>
-                  <w:pPr>
-                    <w:spacing w:after="0" w:before="0" w:line="240" w:lineRule="auto"/>
-                    <w:jc w:val="center"/>
-                  </w:pPr>
-                  <w:r/>
-                  <w:r>
-                    <w:rPr>
-                      <w:rFonts w:ascii="Times New Roman" w:hAnsi="Times New Roman" w:eastAsia="Times New Roman"/>
-                      <w:b/>
-                      <w:i w:val="0"/>
-                      <w:color w:val="000000"/>
-                      <w:sz w:val="18"/>
-                    </w:rPr>
-                    <w:t>{sz43}</w:t>
-                  </w:r>
-                </w:p>
-              </w:tc>
-            </w:tr>
-          </w:tbl>
           <w:p>
-            <w:pPr>
-              <w:spacing w:after="0"/>
-            </w:pPr>
+            <w:r>
+              <w:t>Màu: {mau}</w:t>
+            </w:r>
+          </w:p>
+          <w:p>
+            <w:r>
+              <w:t>Size: {#sizes_list}{sz}({q})  {/sizes_list}</w:t>
+            </w:r>
           </w:p>
         </w:tc>
         <w:tc>

</xml_diff>

<commit_message>
feat: add script to generate DOCX order templates and initialize associated SQL and UI bundle files
</commit_message>
<xml_diff>
--- a/backend-app/samples/In Don dat hang.docx
+++ b/backend-app/samples/In Don dat hang.docx
@@ -8,38 +8,33 @@
         <w:jc w:val="center"/>
         <w:tblLayout w:type="fixed"/>
         <w:tblLook w:firstColumn="1" w:firstRow="1" w:lastColumn="0" w:lastRow="0" w:noHBand="0" w:noVBand="1" w:val="04A0"/>
+        <w:tblBorders>
+          <w:top w:val="nil"/>
+          <w:left w:val="nil"/>
+          <w:bottom w:val="nil"/>
+          <w:right w:val="nil"/>
+          <w:insideH w:val="nil"/>
+          <w:insideV w:val="nil"/>
+        </w:tblBorders>
       </w:tblPr>
       <w:tblGrid>
-        <w:gridCol w:w="2500"/>
-        <w:gridCol w:w="8000"/>
+        <w:gridCol w:w="5553"/>
+        <w:gridCol w:w="5553"/>
       </w:tblGrid>
       <w:tr>
         <w:tc>
           <w:tcPr>
-            <w:tcW w:type="dxa" w:w="2500"/>
-            <w:tcBorders>
-              <w:top w:val="nil"/>
-              <w:left w:val="nil"/>
-              <w:bottom w:val="nil"/>
-              <w:right w:val="nil"/>
-            </w:tcBorders>
+            <w:tcW w:type="dxa" w:w="3401"/>
             <w:vAlign w:val="center"/>
-            <w:tcMar>
-              <w:top w:w="0" w:type="dxa"/>
-              <w:start w:w="0" w:type="dxa"/>
-              <w:bottom w:w="0" w:type="dxa"/>
-              <w:end w:w="0" w:type="dxa"/>
-            </w:tcMar>
           </w:tcPr>
           <w:p>
             <w:pPr>
-              <w:spacing w:after="0"/>
               <w:jc w:val="left"/>
             </w:pPr>
             <w:r>
               <w:drawing>
                 <wp:inline xmlns:a="http://schemas.openxmlformats.org/drawingml/2006/main" xmlns:pic="http://schemas.openxmlformats.org/drawingml/2006/picture">
-                  <wp:extent cx="1044000" cy="1201205"/>
+                  <wp:extent cx="1260000" cy="793274"/>
                   <wp:docPr id="1" name="Picture 1"/>
                   <wp:cNvGraphicFramePr>
                     <a:graphicFrameLocks noChangeAspect="1"/>
@@ -48,7 +43,7 @@
                     <a:graphicData uri="http://schemas.openxmlformats.org/drawingml/2006/picture">
                       <pic:pic>
                         <pic:nvPicPr>
-                          <pic:cNvPr id="0" name="image1.png"/>
+                          <pic:cNvPr id="0" name="logo.png"/>
                           <pic:cNvPicPr/>
                         </pic:nvPicPr>
                         <pic:blipFill>
@@ -60,7 +55,7 @@
                         <pic:spPr>
                           <a:xfrm>
                             <a:off x="0" y="0"/>
-                            <a:ext cx="1044000" cy="1201205"/>
+                            <a:ext cx="1260000" cy="793274"/>
                           </a:xfrm>
                           <a:prstGeom prst="rect"/>
                         </pic:spPr>
@@ -74,41 +69,27 @@
         </w:tc>
         <w:tc>
           <w:tcPr>
-            <w:tcW w:type="dxa" w:w="8000"/>
-            <w:tcBorders>
-              <w:top w:val="nil"/>
-              <w:left w:val="nil"/>
-              <w:bottom w:val="nil"/>
-              <w:right w:val="nil"/>
-            </w:tcBorders>
+            <w:tcW w:type="dxa" w:w="7370"/>
             <w:vAlign w:val="center"/>
-            <w:tcMar>
-              <w:top w:w="0" w:type="dxa"/>
-              <w:start w:w="0" w:type="dxa"/>
-              <w:bottom w:w="0" w:type="dxa"/>
-              <w:end w:w="0" w:type="dxa"/>
-            </w:tcMar>
           </w:tcPr>
           <w:p>
             <w:pPr>
-              <w:spacing w:before="0" w:after="0" w:line="240" w:lineRule="auto"/>
+              <w:spacing w:before="0" w:after="0" w:line="264" w:lineRule="auto"/>
               <w:jc w:val="right"/>
             </w:pPr>
-            <w:r/>
             <w:r>
               <w:rPr>
                 <w:rFonts w:ascii="Times New Roman" w:hAnsi="Times New Roman" w:eastAsia="Times New Roman"/>
                 <w:b/>
                 <w:i w:val="0"/>
-                <w:color w:val="000000"/>
-                <w:sz w:val="24"/>
+                <w:sz w:val="22"/>
               </w:rPr>
               <w:t>CÔNG TY CP LSP VIỆT NAM</w:t>
             </w:r>
           </w:p>
           <w:p>
             <w:pPr>
-              <w:spacing w:before="0" w:after="0" w:line="240" w:lineRule="auto"/>
+              <w:spacing w:after="0"/>
               <w:jc w:val="right"/>
             </w:pPr>
             <w:r>
@@ -116,15 +97,15 @@
                 <w:rFonts w:ascii="Times New Roman" w:hAnsi="Times New Roman" w:eastAsia="Times New Roman"/>
                 <w:b w:val="0"/>
                 <w:i w:val="0"/>
-                <w:color w:val="000000"/>
-                <w:sz w:val="18"/>
+                <w:color w:val="505050"/>
+                <w:sz w:val="17"/>
               </w:rPr>
               <w:t>Số 48, Phố Lạc Trung, Q. Hai Bà Trưng, Hà Nội</w:t>
             </w:r>
           </w:p>
           <w:p>
             <w:pPr>
-              <w:spacing w:before="0" w:after="0" w:line="240" w:lineRule="auto"/>
+              <w:spacing w:after="0"/>
               <w:jc w:val="right"/>
             </w:pPr>
             <w:r>
@@ -132,15 +113,15 @@
                 <w:rFonts w:ascii="Times New Roman" w:hAnsi="Times New Roman" w:eastAsia="Times New Roman"/>
                 <w:b w:val="0"/>
                 <w:i w:val="0"/>
-                <w:color w:val="000000"/>
-                <w:sz w:val="18"/>
+                <w:color w:val="505050"/>
+                <w:sz w:val="17"/>
               </w:rPr>
               <w:t>Tel: (024) 3204 9988  |  Fax: (024) 3215 1142</w:t>
             </w:r>
           </w:p>
           <w:p>
             <w:pPr>
-              <w:spacing w:before="0" w:after="0" w:line="240" w:lineRule="auto"/>
+              <w:spacing w:after="0"/>
               <w:jc w:val="right"/>
             </w:pPr>
             <w:r>
@@ -148,10 +129,10 @@
                 <w:rFonts w:ascii="Times New Roman" w:hAnsi="Times New Roman" w:eastAsia="Times New Roman"/>
                 <w:b w:val="0"/>
                 <w:i w:val="0"/>
-                <w:color w:val="000000"/>
-                <w:sz w:val="18"/>
+                <w:color w:val="505050"/>
+                <w:sz w:val="17"/>
               </w:rPr>
-              <w:t>Email: info@santino.com.vn  |  Web: www.santino.com.vn</w:t>
+              <w:t>Email: info@santino.com.vn  |  www.santino.com.vn</w:t>
             </w:r>
           </w:p>
         </w:tc>
@@ -159,16 +140,7 @@
     </w:tbl>
     <w:p>
       <w:pPr>
-        <w:spacing w:before="40" w:after="80" w:line="240" w:lineRule="auto"/>
-        <w:jc w:val="center"/>
-        <w:pBdr>
-          <w:bottom w:val="single" w:sz="8" w:space="1" w:color="595959"/>
-        </w:pBdr>
-      </w:pPr>
-    </w:p>
-    <w:p>
-      <w:pPr>
-        <w:spacing w:before="0" w:after="40" w:line="240" w:lineRule="auto"/>
+        <w:spacing w:before="80" w:after="40"/>
         <w:jc w:val="center"/>
       </w:pPr>
       <w:r>
@@ -176,7 +148,6 @@
           <w:rFonts w:ascii="Times New Roman" w:hAnsi="Times New Roman" w:eastAsia="Times New Roman"/>
           <w:b/>
           <w:i w:val="0"/>
-          <w:color w:val="000000"/>
           <w:sz w:val="32"/>
         </w:rPr>
         <w:t>PHIẾU ĐẶT HÀNG</w:t>
@@ -188,77 +159,635 @@
         <w:jc w:val="center"/>
         <w:tblLayout w:type="fixed"/>
         <w:tblLook w:firstColumn="1" w:firstRow="1" w:lastColumn="0" w:lastRow="0" w:noHBand="0" w:noVBand="1" w:val="04A0"/>
+        <w:tblBorders>
+          <w:top w:val="nil"/>
+          <w:left w:val="nil"/>
+          <w:bottom w:val="nil"/>
+          <w:right w:val="nil"/>
+          <w:insideH w:val="nil"/>
+          <w:insideV w:val="nil"/>
+        </w:tblBorders>
       </w:tblPr>
       <w:tblGrid>
-        <w:gridCol w:w="6500"/>
-        <w:gridCol w:w="4000"/>
+        <w:gridCol w:w="5553"/>
+        <w:gridCol w:w="5553"/>
       </w:tblGrid>
       <w:tr>
         <w:tc>
           <w:tcPr>
-            <w:tcW w:type="dxa" w:w="6500"/>
-            <w:tcBorders>
-              <w:top w:val="nil"/>
-              <w:left w:val="nil"/>
-              <w:bottom w:val="nil"/>
-              <w:right w:val="nil"/>
-            </w:tcBorders>
-            <w:tcMar>
-              <w:top w:w="0" w:type="dxa"/>
-              <w:start w:w="0" w:type="dxa"/>
-              <w:bottom w:w="0" w:type="dxa"/>
-              <w:end w:w="0" w:type="dxa"/>
-            </w:tcMar>
+            <w:tcW w:type="dxa" w:w="7086"/>
+            <w:vAlign w:val="center"/>
           </w:tcPr>
           <w:p>
             <w:pPr>
-              <w:spacing w:after="0" w:before="0" w:line="240" w:lineRule="auto"/>
+              <w:spacing w:before="0" w:after="0" w:line="264" w:lineRule="auto"/>
               <w:jc w:val="center"/>
             </w:pPr>
-            <w:r/>
             <w:r>
               <w:rPr>
                 <w:rFonts w:ascii="Times New Roman" w:hAnsi="Times New Roman" w:eastAsia="Times New Roman"/>
                 <w:b w:val="0"/>
                 <w:i/>
-                <w:color w:val="000000"/>
-                <w:sz w:val="20"/>
+                <w:sz w:val="19"/>
               </w:rPr>
-              <w:t>{NgayLap}</w:t>
+              <w:t>Ngày {NgayLap}</w:t>
             </w:r>
           </w:p>
         </w:tc>
         <w:tc>
           <w:tcPr>
-            <w:tcW w:type="dxa" w:w="4000"/>
-            <w:tcBorders>
-              <w:top w:val="nil"/>
-              <w:left w:val="nil"/>
-              <w:bottom w:val="nil"/>
-              <w:right w:val="nil"/>
-            </w:tcBorders>
+            <w:tcW w:type="dxa" w:w="3685"/>
+            <w:vAlign w:val="center"/>
+            <w:shd w:fill="F5F0E6"/>
             <w:tcMar>
-              <w:top w:w="0" w:type="dxa"/>
-              <w:start w:w="0" w:type="dxa"/>
-              <w:bottom w:w="0" w:type="dxa"/>
-              <w:end w:w="0" w:type="dxa"/>
+              <w:top w:w="40" w:type="dxa"/>
+              <w:start w:w="80" w:type="dxa"/>
+              <w:bottom w:w="40" w:type="dxa"/>
+              <w:end w:w="80" w:type="dxa"/>
             </w:tcMar>
           </w:tcPr>
           <w:p>
             <w:pPr>
-              <w:spacing w:after="0" w:before="0" w:line="240" w:lineRule="auto"/>
-              <w:jc w:val="right"/>
+              <w:spacing w:before="0" w:after="0" w:line="264" w:lineRule="auto"/>
+              <w:jc w:val="center"/>
             </w:pPr>
-            <w:r/>
+            <w:r>
+              <w:rPr>
+                <w:rFonts w:ascii="Times New Roman" w:hAnsi="Times New Roman" w:eastAsia="Times New Roman"/>
+                <w:b/>
+                <w:i w:val="0"/>
+                <w:sz w:val="19"/>
+              </w:rPr>
+              <w:t>Số: {SoPhieu}</w:t>
+            </w:r>
+          </w:p>
+        </w:tc>
+      </w:tr>
+    </w:tbl>
+    <w:p>
+      <w:pPr>
+        <w:spacing w:before="40" w:after="40"/>
+      </w:pPr>
+    </w:p>
+    <w:tbl>
+      <w:tblPr>
+        <w:tblW w:type="auto" w:w="0"/>
+        <w:jc w:val="center"/>
+        <w:tblLayout w:type="fixed"/>
+        <w:tblLook w:firstColumn="1" w:firstRow="1" w:lastColumn="0" w:lastRow="0" w:noHBand="0" w:noVBand="1" w:val="04A0"/>
+        <w:tblBorders>
+          <w:top w:val="single" w:sz="4" w:space="0" w:color="E0E0E0"/>
+          <w:left w:val="single" w:sz="4" w:space="0" w:color="E0E0E0"/>
+          <w:bottom w:val="single" w:sz="4" w:space="0" w:color="E0E0E0"/>
+          <w:right w:val="single" w:sz="4" w:space="0" w:color="E0E0E0"/>
+          <w:insideH w:val="single" w:sz="4" w:space="0" w:color="E0E0E0"/>
+          <w:insideV w:val="single" w:sz="4" w:space="0" w:color="E0E0E0"/>
+        </w:tblBorders>
+      </w:tblPr>
+      <w:tblGrid>
+        <w:gridCol w:w="5553"/>
+        <w:gridCol w:w="5553"/>
+      </w:tblGrid>
+      <w:tr>
+        <w:tc>
+          <w:tcPr>
+            <w:tcW w:type="dxa" w:w="6803"/>
+            <w:vAlign w:val="center"/>
+            <w:tcMar>
+              <w:top w:w="40" w:type="dxa"/>
+              <w:start w:w="80" w:type="dxa"/>
+              <w:bottom w:w="40" w:type="dxa"/>
+              <w:end w:w="80" w:type="dxa"/>
+            </w:tcMar>
+            <w:shd w:fill="F9F9F8"/>
+          </w:tcPr>
+          <w:p>
+            <w:pPr>
+              <w:spacing w:before="0" w:after="0" w:line="264" w:lineRule="auto"/>
+              <w:jc w:val="left"/>
+            </w:pPr>
+            <w:r>
+              <w:rPr>
+                <w:rFonts w:ascii="Times New Roman" w:hAnsi="Times New Roman" w:eastAsia="Times New Roman"/>
+                <w:b/>
+                <w:i w:val="0"/>
+                <w:color w:val="646464"/>
+                <w:sz w:val="17"/>
+              </w:rPr>
+              <w:t xml:space="preserve">KHÁCH HÀNG  </w:t>
+            </w:r>
+            <w:r>
+              <w:rPr>
+                <w:rFonts w:ascii="Times New Roman" w:hAnsi="Times New Roman" w:eastAsia="Times New Roman"/>
+                <w:b/>
+                <w:i w:val="0"/>
+                <w:sz w:val="18"/>
+              </w:rPr>
+              <w:t>{TenKhachHang}</w:t>
+            </w:r>
+          </w:p>
+        </w:tc>
+        <w:tc>
+          <w:tcPr>
+            <w:tcW w:type="dxa" w:w="3968"/>
+            <w:vAlign w:val="center"/>
+            <w:tcMar>
+              <w:top w:w="40" w:type="dxa"/>
+              <w:start w:w="80" w:type="dxa"/>
+              <w:bottom w:w="40" w:type="dxa"/>
+              <w:end w:w="80" w:type="dxa"/>
+            </w:tcMar>
+            <w:shd w:fill="F9F9F8"/>
+          </w:tcPr>
+          <w:p>
+            <w:pPr>
+              <w:spacing w:before="0" w:after="0" w:line="264" w:lineRule="auto"/>
+              <w:jc w:val="left"/>
+            </w:pPr>
+            <w:r>
+              <w:rPr>
+                <w:rFonts w:ascii="Times New Roman" w:hAnsi="Times New Roman" w:eastAsia="Times New Roman"/>
+                <w:b/>
+                <w:i w:val="0"/>
+                <w:color w:val="646464"/>
+                <w:sz w:val="17"/>
+              </w:rPr>
+              <w:t xml:space="preserve">MÃ KHÁCH HÀNG  </w:t>
+            </w:r>
+            <w:r>
+              <w:rPr>
+                <w:rFonts w:ascii="Times New Roman" w:hAnsi="Times New Roman" w:eastAsia="Times New Roman"/>
+                <w:b/>
+                <w:i w:val="0"/>
+                <w:sz w:val="18"/>
+              </w:rPr>
+              <w:t>{MaKH}</w:t>
+            </w:r>
+          </w:p>
+        </w:tc>
+      </w:tr>
+      <w:tr>
+        <w:tc>
+          <w:tcPr>
+            <w:tcW w:type="dxa" w:w="6803"/>
+            <w:vAlign w:val="center"/>
+            <w:tcMar>
+              <w:top w:w="40" w:type="dxa"/>
+              <w:start w:w="80" w:type="dxa"/>
+              <w:bottom w:w="40" w:type="dxa"/>
+              <w:end w:w="80" w:type="dxa"/>
+            </w:tcMar>
+            <w:shd w:fill="F9F9F8"/>
+          </w:tcPr>
+          <w:p>
+            <w:pPr>
+              <w:spacing w:before="0" w:after="0" w:line="264" w:lineRule="auto"/>
+              <w:jc w:val="left"/>
+            </w:pPr>
+            <w:r>
+              <w:rPr>
+                <w:rFonts w:ascii="Times New Roman" w:hAnsi="Times New Roman" w:eastAsia="Times New Roman"/>
+                <w:b/>
+                <w:i w:val="0"/>
+                <w:color w:val="646464"/>
+                <w:sz w:val="17"/>
+              </w:rPr>
+              <w:t xml:space="preserve">ĐỊA CHỈ  </w:t>
+            </w:r>
+            <w:r>
+              <w:rPr>
+                <w:rFonts w:ascii="Times New Roman" w:hAnsi="Times New Roman" w:eastAsia="Times New Roman"/>
+                <w:b/>
+                <w:i w:val="0"/>
+                <w:sz w:val="18"/>
+              </w:rPr>
+              <w:t>{DiaChi}</w:t>
+            </w:r>
+          </w:p>
+        </w:tc>
+        <w:tc>
+          <w:tcPr>
+            <w:tcW w:type="dxa" w:w="3968"/>
+            <w:vAlign w:val="center"/>
+            <w:tcMar>
+              <w:top w:w="40" w:type="dxa"/>
+              <w:start w:w="80" w:type="dxa"/>
+              <w:bottom w:w="40" w:type="dxa"/>
+              <w:end w:w="80" w:type="dxa"/>
+            </w:tcMar>
+            <w:shd w:fill="F9F9F8"/>
+          </w:tcPr>
+          <w:p>
+            <w:pPr>
+              <w:spacing w:before="0" w:after="0" w:line="264" w:lineRule="auto"/>
+              <w:jc w:val="left"/>
+            </w:pPr>
+            <w:r>
+              <w:rPr>
+                <w:rFonts w:ascii="Times New Roman" w:hAnsi="Times New Roman" w:eastAsia="Times New Roman"/>
+                <w:b/>
+                <w:i w:val="0"/>
+                <w:color w:val="646464"/>
+                <w:sz w:val="17"/>
+              </w:rPr>
+              <w:t xml:space="preserve">SỐ ĐIỆN THOẠI  </w:t>
+            </w:r>
+            <w:r>
+              <w:rPr>
+                <w:rFonts w:ascii="Times New Roman" w:hAnsi="Times New Roman" w:eastAsia="Times New Roman"/>
+                <w:b/>
+                <w:i w:val="0"/>
+                <w:sz w:val="18"/>
+              </w:rPr>
+              <w:t>{SDT}</w:t>
+            </w:r>
+          </w:p>
+        </w:tc>
+      </w:tr>
+      <w:tr>
+        <w:tc>
+          <w:tcPr>
+            <w:tcW w:type="dxa" w:w="6803"/>
+            <w:vAlign w:val="center"/>
+            <w:tcMar>
+              <w:top w:w="40" w:type="dxa"/>
+              <w:start w:w="80" w:type="dxa"/>
+              <w:bottom w:w="40" w:type="dxa"/>
+              <w:end w:w="80" w:type="dxa"/>
+            </w:tcMar>
+            <w:shd w:fill="FAF7F0"/>
+          </w:tcPr>
+          <w:p>
+            <w:pPr>
+              <w:spacing w:before="0" w:after="0" w:line="264" w:lineRule="auto"/>
+              <w:jc w:val="left"/>
+            </w:pPr>
+            <w:r>
+              <w:rPr>
+                <w:rFonts w:ascii="Times New Roman" w:hAnsi="Times New Roman" w:eastAsia="Times New Roman"/>
+                <w:b/>
+                <w:i w:val="0"/>
+                <w:color w:val="646464"/>
+                <w:sz w:val="17"/>
+              </w:rPr>
+              <w:t xml:space="preserve">DIỄN GIẢI  </w:t>
+            </w:r>
+            <w:r>
+              <w:rPr>
+                <w:rFonts w:ascii="Times New Roman" w:hAnsi="Times New Roman" w:eastAsia="Times New Roman"/>
+                <w:b w:val="0"/>
+                <w:i w:val="0"/>
+                <w:sz w:val="18"/>
+              </w:rPr>
+              <w:t>{DienGiai}</w:t>
+            </w:r>
+          </w:p>
+        </w:tc>
+        <w:tc>
+          <w:tcPr>
+            <w:tcW w:type="dxa" w:w="3968"/>
+            <w:vAlign w:val="center"/>
+            <w:tcMar>
+              <w:top w:w="40" w:type="dxa"/>
+              <w:start w:w="80" w:type="dxa"/>
+              <w:bottom w:w="40" w:type="dxa"/>
+              <w:end w:w="80" w:type="dxa"/>
+            </w:tcMar>
+            <w:shd w:fill="FAF7F0"/>
+          </w:tcPr>
+          <w:p/>
+        </w:tc>
+      </w:tr>
+    </w:tbl>
+    <w:p>
+      <w:pPr>
+        <w:spacing w:before="60" w:after="60"/>
+      </w:pPr>
+    </w:p>
+    <w:tbl>
+      <w:tblPr>
+        <w:tblW w:type="auto" w:w="0"/>
+        <w:jc w:val="center"/>
+        <w:tblLayout w:type="fixed"/>
+        <w:tblLook w:firstColumn="1" w:firstRow="1" w:lastColumn="0" w:lastRow="0" w:noHBand="0" w:noVBand="1" w:val="04A0"/>
+        <w:tblBorders>
+          <w:top w:val="single" w:sz="6" w:space="0" w:color="B0B0B0"/>
+          <w:left w:val="single" w:sz="6" w:space="0" w:color="B0B0B0"/>
+          <w:bottom w:val="single" w:sz="6" w:space="0" w:color="B0B0B0"/>
+          <w:right w:val="single" w:sz="6" w:space="0" w:color="B0B0B0"/>
+          <w:insideH w:val="single" w:sz="6" w:space="0" w:color="B0B0B0"/>
+          <w:insideV w:val="single" w:sz="6" w:space="0" w:color="B0B0B0"/>
+        </w:tblBorders>
+      </w:tblPr>
+      <w:tblGrid>
+        <w:gridCol w:w="2221"/>
+        <w:gridCol w:w="2221"/>
+        <w:gridCol w:w="2221"/>
+        <w:gridCol w:w="2221"/>
+        <w:gridCol w:w="2221"/>
+      </w:tblGrid>
+      <w:tr>
+        <w:tc>
+          <w:tcPr>
+            <w:tcW w:type="dxa" w:w="510"/>
+            <w:vAlign w:val="center"/>
+            <w:shd w:fill="FFFFFF"/>
+            <w:tcMar>
+              <w:top w:w="80" w:type="dxa"/>
+              <w:start w:w="80" w:type="dxa"/>
+              <w:bottom w:w="80" w:type="dxa"/>
+              <w:end w:w="80" w:type="dxa"/>
+            </w:tcMar>
+          </w:tcPr>
+          <w:p>
+            <w:pPr>
+              <w:spacing w:before="0" w:after="0" w:line="264" w:lineRule="auto"/>
+              <w:jc w:val="center"/>
+            </w:pPr>
             <w:r>
               <w:rPr>
                 <w:rFonts w:ascii="Times New Roman" w:hAnsi="Times New Roman" w:eastAsia="Times New Roman"/>
                 <w:b/>
                 <w:i w:val="0"/>
                 <w:color w:val="000000"/>
-                <w:sz w:val="20"/>
+                <w:sz w:val="18"/>
               </w:rPr>
-              <w:t>Số: {SoPhieu}</w:t>
+              <w:t>STT</w:t>
+            </w:r>
+          </w:p>
+        </w:tc>
+        <w:tc>
+          <w:tcPr>
+            <w:tcW w:type="dxa" w:w="3288"/>
+            <w:vAlign w:val="center"/>
+            <w:shd w:fill="FFFFFF"/>
+            <w:tcMar>
+              <w:top w:w="80" w:type="dxa"/>
+              <w:start w:w="80" w:type="dxa"/>
+              <w:bottom w:w="80" w:type="dxa"/>
+              <w:end w:w="80" w:type="dxa"/>
+            </w:tcMar>
+          </w:tcPr>
+          <w:p>
+            <w:pPr>
+              <w:spacing w:before="0" w:after="0" w:line="264" w:lineRule="auto"/>
+              <w:jc w:val="left"/>
+            </w:pPr>
+            <w:r>
+              <w:rPr>
+                <w:rFonts w:ascii="Times New Roman" w:hAnsi="Times New Roman" w:eastAsia="Times New Roman"/>
+                <w:b/>
+                <w:i w:val="0"/>
+                <w:color w:val="000000"/>
+                <w:sz w:val="18"/>
+              </w:rPr>
+              <w:t>SẢN PHẨM</w:t>
+            </w:r>
+          </w:p>
+        </w:tc>
+        <w:tc>
+          <w:tcPr>
+            <w:tcW w:type="dxa" w:w="3685"/>
+            <w:vAlign w:val="center"/>
+            <w:shd w:fill="FFFFFF"/>
+            <w:tcMar>
+              <w:top w:w="80" w:type="dxa"/>
+              <w:start w:w="80" w:type="dxa"/>
+              <w:bottom w:w="80" w:type="dxa"/>
+              <w:end w:w="80" w:type="dxa"/>
+            </w:tcMar>
+          </w:tcPr>
+          <w:p>
+            <w:pPr>
+              <w:spacing w:before="0" w:after="0" w:line="264" w:lineRule="auto"/>
+              <w:jc w:val="center"/>
+            </w:pPr>
+            <w:r>
+              <w:rPr>
+                <w:rFonts w:ascii="Times New Roman" w:hAnsi="Times New Roman" w:eastAsia="Times New Roman"/>
+                <w:b/>
+                <w:i w:val="0"/>
+                <w:color w:val="000000"/>
+                <w:sz w:val="18"/>
+              </w:rPr>
+              <w:t>SIZE × SỐ LƯỢNG</w:t>
+            </w:r>
+          </w:p>
+        </w:tc>
+        <w:tc>
+          <w:tcPr>
+            <w:tcW w:type="dxa" w:w="1077"/>
+            <w:vAlign w:val="center"/>
+            <w:shd w:fill="FFFFFF"/>
+            <w:tcMar>
+              <w:top w:w="80" w:type="dxa"/>
+              <w:start w:w="80" w:type="dxa"/>
+              <w:bottom w:w="80" w:type="dxa"/>
+              <w:end w:w="80" w:type="dxa"/>
+            </w:tcMar>
+          </w:tcPr>
+          <w:p>
+            <w:pPr>
+              <w:spacing w:before="0" w:after="0" w:line="264" w:lineRule="auto"/>
+              <w:jc w:val="center"/>
+            </w:pPr>
+            <w:r>
+              <w:rPr>
+                <w:rFonts w:ascii="Times New Roman" w:hAnsi="Times New Roman" w:eastAsia="Times New Roman"/>
+                <w:b/>
+                <w:i w:val="0"/>
+                <w:color w:val="000000"/>
+                <w:sz w:val="18"/>
+              </w:rPr>
+              <w:t>TỔNG</w:t>
+            </w:r>
+          </w:p>
+        </w:tc>
+        <w:tc>
+          <w:tcPr>
+            <w:tcW w:type="dxa" w:w="2211"/>
+            <w:vAlign w:val="center"/>
+            <w:shd w:fill="FFFFFF"/>
+            <w:tcMar>
+              <w:top w:w="80" w:type="dxa"/>
+              <w:start w:w="80" w:type="dxa"/>
+              <w:bottom w:w="80" w:type="dxa"/>
+              <w:end w:w="80" w:type="dxa"/>
+            </w:tcMar>
+          </w:tcPr>
+          <w:p>
+            <w:pPr>
+              <w:spacing w:before="0" w:after="0" w:line="264" w:lineRule="auto"/>
+              <w:jc w:val="right"/>
+            </w:pPr>
+            <w:r>
+              <w:rPr>
+                <w:rFonts w:ascii="Times New Roman" w:hAnsi="Times New Roman" w:eastAsia="Times New Roman"/>
+                <w:b/>
+                <w:i w:val="0"/>
+                <w:color w:val="000000"/>
+                <w:sz w:val="18"/>
+              </w:rPr>
+              <w:t>THÀNH TIỀN</w:t>
+            </w:r>
+          </w:p>
+        </w:tc>
+      </w:tr>
+      <w:tr>
+        <w:tc>
+          <w:tcPr>
+            <w:tcW w:type="dxa" w:w="510"/>
+            <w:vAlign w:val="center"/>
+            <w:tcMar>
+              <w:top w:w="60" w:type="dxa"/>
+              <w:start w:w="90" w:type="dxa"/>
+              <w:bottom w:w="60" w:type="dxa"/>
+              <w:end w:w="90" w:type="dxa"/>
+            </w:tcMar>
+          </w:tcPr>
+          <w:p>
+            <w:pPr>
+              <w:spacing w:before="0" w:after="0" w:line="264" w:lineRule="auto"/>
+              <w:jc w:val="center"/>
+            </w:pPr>
+            <w:r>
+              <w:rPr>
+                <w:rFonts w:ascii="Times New Roman" w:hAnsi="Times New Roman" w:eastAsia="Times New Roman"/>
+                <w:b/>
+                <w:i w:val="0"/>
+                <w:sz w:val="18"/>
+              </w:rPr>
+              <w:t>{#ChiTietDonHang}{STT}</w:t>
+            </w:r>
+          </w:p>
+        </w:tc>
+        <w:tc>
+          <w:tcPr>
+            <w:tcW w:type="dxa" w:w="3288"/>
+            <w:vAlign w:val="center"/>
+            <w:tcMar>
+              <w:top w:w="60" w:type="dxa"/>
+              <w:start w:w="80" w:type="dxa"/>
+              <w:bottom w:w="60" w:type="dxa"/>
+              <w:end w:w="80" w:type="dxa"/>
+            </w:tcMar>
+          </w:tcPr>
+          <w:p>
+            <w:pPr>
+              <w:spacing w:before="0" w:after="0" w:line="276" w:lineRule="auto"/>
+            </w:pPr>
+            <w:r>
+              <w:rPr>
+                <w:rFonts w:ascii="Times New Roman" w:hAnsi="Times New Roman" w:eastAsia="Times New Roman"/>
+                <w:b/>
+                <w:i w:val="0"/>
+                <w:color w:val="8B5E2B"/>
+                <w:sz w:val="19"/>
+              </w:rPr>
+              <w:t>{MaHang}</w:t>
+              <w:br/>
+            </w:r>
+            <w:r>
+              <w:rPr>
+                <w:rFonts w:ascii="Times New Roman" w:hAnsi="Times New Roman" w:eastAsia="Times New Roman"/>
+                <w:b w:val="0"/>
+                <w:i w:val="0"/>
+                <w:color w:val="323232"/>
+                <w:sz w:val="17"/>
+              </w:rPr>
+              <w:t>{ten_hang_goc}</w:t>
+              <w:br/>
+            </w:r>
+            <w:r>
+              <w:rPr>
+                <w:rFonts w:ascii="Times New Roman" w:hAnsi="Times New Roman" w:eastAsia="Times New Roman"/>
+                <w:b w:val="0"/>
+                <w:i w:val="0"/>
+                <w:color w:val="646464"/>
+                <w:sz w:val="17"/>
+              </w:rPr>
+              <w:t>Màu: {mau}</w:t>
+            </w:r>
+          </w:p>
+        </w:tc>
+        <w:tc>
+          <w:tcPr>
+            <w:tcW w:type="dxa" w:w="3685"/>
+            <w:vAlign w:val="center"/>
+            <w:tcMar>
+              <w:top w:w="60" w:type="dxa"/>
+              <w:start w:w="80" w:type="dxa"/>
+              <w:bottom w:w="60" w:type="dxa"/>
+              <w:end w:w="80" w:type="dxa"/>
+            </w:tcMar>
+          </w:tcPr>
+          <w:p>
+            <w:pPr>
+              <w:spacing w:before="0" w:after="0" w:line="264" w:lineRule="auto"/>
+              <w:jc w:val="left"/>
+            </w:pPr>
+            <w:r>
+              <w:rPr>
+                <w:rFonts w:ascii="Times New Roman" w:hAnsi="Times New Roman" w:eastAsia="Times New Roman"/>
+                <w:b w:val="0"/>
+                <w:i w:val="0"/>
+                <w:sz w:val="18"/>
+              </w:rPr>
+              <w:t>{size_qty_text}</w:t>
+            </w:r>
+          </w:p>
+        </w:tc>
+        <w:tc>
+          <w:tcPr>
+            <w:tcW w:type="dxa" w:w="1077"/>
+            <w:vAlign w:val="center"/>
+            <w:tcMar>
+              <w:top w:w="60" w:type="dxa"/>
+              <w:start w:w="90" w:type="dxa"/>
+              <w:bottom w:w="60" w:type="dxa"/>
+              <w:end w:w="90" w:type="dxa"/>
+            </w:tcMar>
+          </w:tcPr>
+          <w:p>
+            <w:pPr>
+              <w:spacing w:before="0" w:after="0" w:line="264" w:lineRule="auto"/>
+              <w:jc w:val="center"/>
+            </w:pPr>
+            <w:r>
+              <w:rPr>
+                <w:rFonts w:ascii="Times New Roman" w:hAnsi="Times New Roman" w:eastAsia="Times New Roman"/>
+                <w:b/>
+                <w:i w:val="0"/>
+                <w:sz w:val="19"/>
+              </w:rPr>
+              <w:t>{SoLuong}</w:t>
+            </w:r>
+          </w:p>
+        </w:tc>
+        <w:tc>
+          <w:tcPr>
+            <w:tcW w:type="dxa" w:w="2211"/>
+            <w:vAlign w:val="center"/>
+            <w:tcMar>
+              <w:top w:w="60" w:type="dxa"/>
+              <w:start w:w="80" w:type="dxa"/>
+              <w:bottom w:w="60" w:type="dxa"/>
+              <w:end w:w="80" w:type="dxa"/>
+            </w:tcMar>
+          </w:tcPr>
+          <w:p>
+            <w:pPr>
+              <w:spacing w:before="0" w:after="0" w:line="264" w:lineRule="auto"/>
+              <w:jc w:val="right"/>
+            </w:pPr>
+            <w:r>
+              <w:rPr>
+                <w:rFonts w:ascii="Times New Roman" w:hAnsi="Times New Roman" w:eastAsia="Times New Roman"/>
+                <w:b/>
+                <w:i w:val="0"/>
+                <w:sz w:val="19"/>
+              </w:rPr>
+              <w:t>{ThanhTien} đ{/ChiTietDonHang}</w:t>
             </w:r>
           </w:p>
         </w:tc>
@@ -270,35 +799,34 @@
         <w:jc w:val="center"/>
         <w:tblLayout w:type="fixed"/>
         <w:tblLook w:firstColumn="1" w:firstRow="1" w:lastColumn="0" w:lastRow="0" w:noHBand="0" w:noVBand="1" w:val="04A0"/>
+        <w:tblBorders>
+          <w:top w:val="single" w:sz="6" w:space="0" w:color="B0B0B0"/>
+          <w:left w:val="single" w:sz="6" w:space="0" w:color="B0B0B0"/>
+          <w:bottom w:val="single" w:sz="6" w:space="0" w:color="B0B0B0"/>
+          <w:right w:val="single" w:sz="6" w:space="0" w:color="B0B0B0"/>
+          <w:insideH w:val="single" w:sz="6" w:space="0" w:color="B0B0B0"/>
+          <w:insideV w:val="single" w:sz="6" w:space="0" w:color="B0B0B0"/>
+        </w:tblBorders>
       </w:tblPr>
       <w:tblGrid>
-        <w:gridCol w:w="6500"/>
-        <w:gridCol w:w="4000"/>
+        <w:gridCol w:w="11106"/>
       </w:tblGrid>
       <w:tr>
-        <w:trPr>
-          <w:trHeight w:val="350" w:hRule="atLeast"/>
-        </w:trPr>
         <w:tc>
           <w:tcPr>
-            <w:tcW w:type="dxa" w:w="6500"/>
-            <w:shd w:val="clear" w:fill="FFFFFF"/>
+            <w:tcW w:type="dxa" w:w="10771"/>
+            <w:vAlign w:val="center"/>
+            <w:shd w:fill="F3F3F3"/>
             <w:tcMar>
-              <w:top w:w="55" w:type="dxa"/>
-              <w:start w:w="120" w:type="dxa"/>
-              <w:bottom w:w="55" w:type="dxa"/>
-              <w:end w:w="120" w:type="dxa"/>
+              <w:top w:w="70" w:type="dxa"/>
+              <w:start w:w="100" w:type="dxa"/>
+              <w:bottom w:w="70" w:type="dxa"/>
+              <w:end w:w="100" w:type="dxa"/>
             </w:tcMar>
-            <w:tcBorders>
-              <w:top w:val="single" w:sz="6" w:color="A6A6A6"/>
-              <w:left w:val="single" w:sz="6" w:color="A6A6A6"/>
-              <w:bottom w:val="single" w:sz="6" w:color="A6A6A6"/>
-              <w:right w:val="single" w:sz="6" w:color="A6A6A6"/>
-            </w:tcBorders>
           </w:tcPr>
           <w:p>
             <w:pPr>
-              <w:spacing w:after="0" w:before="0" w:line="240" w:lineRule="auto"/>
+              <w:spacing w:before="0" w:after="0"/>
               <w:jc w:val="left"/>
             </w:pPr>
             <w:r>
@@ -306,207 +834,20 @@
                 <w:rFonts w:ascii="Times New Roman" w:hAnsi="Times New Roman" w:eastAsia="Times New Roman"/>
                 <w:b/>
                 <w:i w:val="0"/>
-                <w:color w:val="000000"/>
-                <w:sz w:val="19"/>
+                <w:color w:val="1E1E1E"/>
+                <w:sz w:val="18"/>
               </w:rPr>
-              <w:t xml:space="preserve">Khách hàng: </w:t>
-            </w:r>
-            <w:r>
-              <w:rPr>
-                <w:rFonts w:ascii="Times New Roman" w:hAnsi="Times New Roman" w:eastAsia="Times New Roman"/>
-                <w:b/>
-                <w:i w:val="0"/>
-                <w:color w:val="000000"/>
-                <w:sz w:val="19"/>
-              </w:rPr>
-              <w:t>{TenKhachHang}</w:t>
-            </w:r>
-          </w:p>
-        </w:tc>
-        <w:tc>
-          <w:tcPr>
-            <w:tcW w:type="dxa" w:w="4000"/>
-            <w:shd w:val="clear" w:fill="FFFFFF"/>
-            <w:tcMar>
-              <w:top w:w="55" w:type="dxa"/>
-              <w:start w:w="120" w:type="dxa"/>
-              <w:bottom w:w="55" w:type="dxa"/>
-              <w:end w:w="120" w:type="dxa"/>
-            </w:tcMar>
-            <w:tcBorders>
-              <w:top w:val="single" w:sz="6" w:color="A6A6A6"/>
-              <w:left w:val="single" w:sz="6" w:color="A6A6A6"/>
-              <w:bottom w:val="single" w:sz="6" w:color="A6A6A6"/>
-              <w:right w:val="single" w:sz="6" w:color="A6A6A6"/>
-            </w:tcBorders>
-          </w:tcPr>
-          <w:p>
-            <w:pPr>
-              <w:spacing w:before="0" w:after="0" w:line="240" w:lineRule="auto"/>
-              <w:jc w:val="left"/>
-            </w:pPr>
-            <w:r>
-              <w:rPr>
-                <w:rFonts w:ascii="Times New Roman" w:hAnsi="Times New Roman" w:eastAsia="Times New Roman"/>
-                <w:b/>
-                <w:i w:val="0"/>
-                <w:color w:val="000000"/>
-                <w:sz w:val="19"/>
-              </w:rPr>
-              <w:t xml:space="preserve">MKH: </w:t>
-            </w:r>
-            <w:r>
-              <w:rPr>
-                <w:rFonts w:ascii="Times New Roman" w:hAnsi="Times New Roman" w:eastAsia="Times New Roman"/>
-                <w:b/>
-                <w:i w:val="0"/>
-                <w:color w:val="000000"/>
-                <w:sz w:val="19"/>
-              </w:rPr>
-              <w:t>{MaKH}</w:t>
-            </w:r>
-          </w:p>
-        </w:tc>
-      </w:tr>
-      <w:tr>
-        <w:trPr>
-          <w:trHeight w:val="350" w:hRule="atLeast"/>
-        </w:trPr>
-        <w:tc>
-          <w:tcPr>
-            <w:tcW w:type="dxa" w:w="6500"/>
-            <w:shd w:val="clear" w:fill="FFFFFF"/>
-            <w:tcMar>
-              <w:top w:w="55" w:type="dxa"/>
-              <w:start w:w="120" w:type="dxa"/>
-              <w:bottom w:w="55" w:type="dxa"/>
-              <w:end w:w="120" w:type="dxa"/>
-            </w:tcMar>
-            <w:tcBorders>
-              <w:top w:val="single" w:sz="6" w:color="A6A6A6"/>
-              <w:left w:val="single" w:sz="6" w:color="A6A6A6"/>
-              <w:bottom w:val="single" w:sz="6" w:color="A6A6A6"/>
-              <w:right w:val="single" w:sz="6" w:color="A6A6A6"/>
-            </w:tcBorders>
-          </w:tcPr>
-          <w:p>
-            <w:pPr>
-              <w:spacing w:before="0" w:after="0" w:line="240" w:lineRule="auto"/>
-              <w:jc w:val="left"/>
-            </w:pPr>
-            <w:r>
-              <w:rPr>
-                <w:rFonts w:ascii="Times New Roman" w:hAnsi="Times New Roman" w:eastAsia="Times New Roman"/>
-                <w:b/>
-                <w:i w:val="0"/>
-                <w:color w:val="000000"/>
-                <w:sz w:val="19"/>
-              </w:rPr>
-              <w:t xml:space="preserve">Địa chỉ: </w:t>
-            </w:r>
-            <w:r>
-              <w:rPr>
-                <w:rFonts w:ascii="Times New Roman" w:hAnsi="Times New Roman" w:eastAsia="Times New Roman"/>
-                <w:b/>
-                <w:i w:val="0"/>
-                <w:color w:val="000000"/>
-                <w:sz w:val="19"/>
-              </w:rPr>
-              <w:t>{DiaChi}</w:t>
-            </w:r>
-          </w:p>
-        </w:tc>
-        <w:tc>
-          <w:tcPr>
-            <w:tcW w:type="dxa" w:w="4000"/>
-            <w:shd w:val="clear" w:fill="FFFFFF"/>
-            <w:tcMar>
-              <w:top w:w="55" w:type="dxa"/>
-              <w:start w:w="120" w:type="dxa"/>
-              <w:bottom w:w="55" w:type="dxa"/>
-              <w:end w:w="120" w:type="dxa"/>
-            </w:tcMar>
-            <w:tcBorders>
-              <w:top w:val="single" w:sz="6" w:color="A6A6A6"/>
-              <w:left w:val="single" w:sz="6" w:color="A6A6A6"/>
-              <w:bottom w:val="single" w:sz="6" w:color="A6A6A6"/>
-              <w:right w:val="single" w:sz="6" w:color="A6A6A6"/>
-            </w:tcBorders>
-          </w:tcPr>
-          <w:p>
-            <w:pPr>
-              <w:spacing w:before="0" w:after="0" w:line="240" w:lineRule="auto"/>
-              <w:jc w:val="left"/>
-            </w:pPr>
-            <w:r>
-              <w:rPr>
-                <w:rFonts w:ascii="Times New Roman" w:hAnsi="Times New Roman" w:eastAsia="Times New Roman"/>
-                <w:b/>
-                <w:i w:val="0"/>
-                <w:color w:val="000000"/>
-                <w:sz w:val="19"/>
-              </w:rPr>
-              <w:t xml:space="preserve">SĐT: </w:t>
-            </w:r>
-            <w:r>
-              <w:rPr>
-                <w:rFonts w:ascii="Times New Roman" w:hAnsi="Times New Roman" w:eastAsia="Times New Roman"/>
-                <w:b/>
-                <w:i w:val="0"/>
-                <w:color w:val="000000"/>
-                <w:sz w:val="19"/>
-              </w:rPr>
-              <w:t>{SDT}</w:t>
-            </w:r>
-          </w:p>
-        </w:tc>
-      </w:tr>
-      <w:tr>
-        <w:trPr>
-          <w:trHeight w:val="350" w:hRule="atLeast"/>
-        </w:trPr>
-        <w:tc>
-          <w:tcPr>
-            <w:tcW w:type="dxa" w:w="10500"/>
-            <w:shd w:val="clear" w:fill="FFFFFF"/>
-            <w:tcMar>
-              <w:top w:w="55" w:type="dxa"/>
-              <w:start w:w="120" w:type="dxa"/>
-              <w:bottom w:w="55" w:type="dxa"/>
-              <w:end w:w="120" w:type="dxa"/>
-            </w:tcMar>
-            <w:gridSpan w:val="2"/>
-            <w:tcBorders>
-              <w:top w:val="single" w:sz="6" w:color="A6A6A6"/>
-              <w:left w:val="single" w:sz="6" w:color="A6A6A6"/>
-              <w:bottom w:val="single" w:sz="6" w:color="A6A6A6"/>
-              <w:right w:val="single" w:sz="6" w:color="A6A6A6"/>
-            </w:tcBorders>
-          </w:tcPr>
-          <w:p>
-            <w:pPr>
-              <w:spacing w:before="0" w:after="0" w:line="240" w:lineRule="auto"/>
-              <w:jc w:val="left"/>
-            </w:pPr>
-            <w:r>
-              <w:rPr>
-                <w:rFonts w:ascii="Times New Roman" w:hAnsi="Times New Roman" w:eastAsia="Times New Roman"/>
-                <w:b/>
-                <w:i w:val="0"/>
-                <w:color w:val="000000"/>
-                <w:sz w:val="19"/>
-              </w:rPr>
-              <w:t xml:space="preserve">Diễn giải: </w:t>
+              <w:t xml:space="preserve">Tổng theo size: </w:t>
             </w:r>
             <w:r>
               <w:rPr>
                 <w:rFonts w:ascii="Times New Roman" w:hAnsi="Times New Roman" w:eastAsia="Times New Roman"/>
                 <w:b w:val="0"/>
                 <w:i w:val="0"/>
-                <w:color w:val="000000"/>
-                <w:sz w:val="19"/>
+                <w:color w:val="141414"/>
+                <w:sz w:val="18"/>
               </w:rPr>
-              <w:t>{DienGiai}</w:t>
+              <w:t>{tong_theo_size}</w:t>
             </w:r>
           </w:p>
         </w:tc>
@@ -514,8 +855,7 @@
     </w:tbl>
     <w:p>
       <w:pPr>
-        <w:spacing w:before="0" w:after="40" w:line="240" w:lineRule="auto"/>
-        <w:jc w:val="left"/>
+        <w:spacing w:before="80" w:after="80"/>
       </w:pPr>
     </w:p>
     <w:tbl>
@@ -524,309 +864,63 @@
         <w:jc w:val="center"/>
         <w:tblLayout w:type="fixed"/>
         <w:tblLook w:firstColumn="1" w:firstRow="1" w:lastColumn="0" w:lastRow="0" w:noHBand="0" w:noVBand="1" w:val="04A0"/>
+        <w:tblBorders>
+          <w:top w:val="nil"/>
+          <w:left w:val="nil"/>
+          <w:bottom w:val="nil"/>
+          <w:right w:val="nil"/>
+          <w:insideH w:val="nil"/>
+          <w:insideV w:val="nil"/>
+        </w:tblBorders>
       </w:tblPr>
       <w:tblGrid>
-        <w:gridCol w:w="650"/>
-        <w:gridCol w:w="5900"/>
-        <w:gridCol w:w="1200"/>
-        <w:gridCol w:w="2750"/>
+        <w:gridCol w:w="5553"/>
+        <w:gridCol w:w="5553"/>
       </w:tblGrid>
       <w:tr>
-        <w:trPr>
-          <w:tblHeader w:val="true"/>
-          <w:trHeight w:val="430" w:hRule="atLeast"/>
-        </w:trPr>
         <w:tc>
           <w:tcPr>
-            <w:tcW w:type="dxa" w:w="650"/>
-            <w:vAlign w:val="center"/>
+            <w:tcW w:type="dxa" w:w="6519"/>
             <w:tcMar>
-              <w:top w:w="65" w:type="dxa"/>
-              <w:start w:w="80" w:type="dxa"/>
-              <w:bottom w:w="65" w:type="dxa"/>
-              <w:end w:w="80" w:type="dxa"/>
+              <w:top w:w="20" w:type="dxa"/>
+              <w:start w:w="90" w:type="dxa"/>
+              <w:bottom w:w="20" w:type="dxa"/>
+              <w:end w:w="90" w:type="dxa"/>
             </w:tcMar>
-            <w:shd w:val="clear" w:fill="FFFFFF"/>
-            <w:tcBorders>
-              <w:top w:val="single" w:sz="6" w:color="7F7F7F"/>
-              <w:left w:val="single" w:sz="6" w:color="7F7F7F"/>
-              <w:bottom w:val="single" w:sz="6" w:color="7F7F7F"/>
-              <w:right w:val="single" w:sz="6" w:color="7F7F7F"/>
-            </w:tcBorders>
           </w:tcPr>
           <w:p>
-            <w:pPr>
-              <w:spacing w:after="0" w:before="0" w:line="240" w:lineRule="auto"/>
-              <w:jc w:val="center"/>
-            </w:pPr>
-            <w:r/>
             <w:r>
               <w:rPr>
                 <w:rFonts w:ascii="Times New Roman" w:hAnsi="Times New Roman" w:eastAsia="Times New Roman"/>
                 <w:b/>
                 <w:i w:val="0"/>
-                <w:color w:val="000000"/>
-                <w:sz w:val="17"/>
+                <w:sz w:val="19"/>
               </w:rPr>
-              <w:t>STT</w:t>
-            </w:r>
-          </w:p>
-        </w:tc>
-        <w:tc>
-          <w:tcPr>
-            <w:tcW w:type="dxa" w:w="5900"/>
-            <w:vAlign w:val="center"/>
-            <w:tcMar>
-              <w:top w:w="65" w:type="dxa"/>
-              <w:start w:w="80" w:type="dxa"/>
-              <w:bottom w:w="65" w:type="dxa"/>
-              <w:end w:w="80" w:type="dxa"/>
-            </w:tcMar>
-            <w:shd w:val="clear" w:fill="FFFFFF"/>
-            <w:tcBorders>
-              <w:top w:val="single" w:sz="6" w:color="7F7F7F"/>
-              <w:left w:val="single" w:sz="6" w:color="7F7F7F"/>
-              <w:bottom w:val="single" w:sz="6" w:color="7F7F7F"/>
-              <w:right w:val="single" w:sz="6" w:color="7F7F7F"/>
-            </w:tcBorders>
-          </w:tcPr>
-          <w:p>
-            <w:pPr>
-              <w:spacing w:after="0" w:before="0" w:line="240" w:lineRule="auto"/>
-              <w:jc w:val="center"/>
-            </w:pPr>
-            <w:r/>
-            <w:r>
-              <w:rPr>
-                <w:rFonts w:ascii="Times New Roman" w:hAnsi="Times New Roman" w:eastAsia="Times New Roman"/>
-                <w:b/>
-                <w:i w:val="0"/>
-                <w:color w:val="000000"/>
-                <w:sz w:val="17"/>
-              </w:rPr>
-              <w:t>SẢN PHẨM</w:t>
-            </w:r>
-          </w:p>
-        </w:tc>
-        <w:tc>
-          <w:tcPr>
-            <w:tcW w:type="dxa" w:w="1200"/>
-            <w:vAlign w:val="center"/>
-            <w:tcMar>
-              <w:top w:w="65" w:type="dxa"/>
-              <w:start w:w="80" w:type="dxa"/>
-              <w:bottom w:w="65" w:type="dxa"/>
-              <w:end w:w="80" w:type="dxa"/>
-            </w:tcMar>
-            <w:shd w:val="clear" w:fill="FFFFFF"/>
-            <w:tcBorders>
-              <w:top w:val="single" w:sz="6" w:color="7F7F7F"/>
-              <w:left w:val="single" w:sz="6" w:color="7F7F7F"/>
-              <w:bottom w:val="single" w:sz="6" w:color="7F7F7F"/>
-              <w:right w:val="single" w:sz="6" w:color="7F7F7F"/>
-            </w:tcBorders>
-          </w:tcPr>
-          <w:p>
-            <w:pPr>
-              <w:spacing w:after="0" w:before="0" w:line="240" w:lineRule="auto"/>
-              <w:jc w:val="center"/>
-            </w:pPr>
-            <w:r/>
-            <w:r>
-              <w:rPr>
-                <w:rFonts w:ascii="Times New Roman" w:hAnsi="Times New Roman" w:eastAsia="Times New Roman"/>
-                <w:b/>
-                <w:i w:val="0"/>
-                <w:color w:val="000000"/>
-                <w:sz w:val="17"/>
-              </w:rPr>
-              <w:t>TỔNG</w:t>
-            </w:r>
-          </w:p>
-        </w:tc>
-        <w:tc>
-          <w:tcPr>
-            <w:tcW w:type="dxa" w:w="2750"/>
-            <w:vAlign w:val="center"/>
-            <w:tcMar>
-              <w:top w:w="65" w:type="dxa"/>
-              <w:start w:w="80" w:type="dxa"/>
-              <w:bottom w:w="65" w:type="dxa"/>
-              <w:end w:w="80" w:type="dxa"/>
-            </w:tcMar>
-            <w:shd w:val="clear" w:fill="FFFFFF"/>
-            <w:tcBorders>
-              <w:top w:val="single" w:sz="6" w:color="7F7F7F"/>
-              <w:left w:val="single" w:sz="6" w:color="7F7F7F"/>
-              <w:bottom w:val="single" w:sz="6" w:color="7F7F7F"/>
-              <w:right w:val="single" w:sz="6" w:color="7F7F7F"/>
-            </w:tcBorders>
-          </w:tcPr>
-          <w:p>
-            <w:pPr>
-              <w:spacing w:after="0" w:before="0" w:line="240" w:lineRule="auto"/>
-              <w:jc w:val="center"/>
-            </w:pPr>
-            <w:r/>
-            <w:r>
-              <w:rPr>
-                <w:rFonts w:ascii="Times New Roman" w:hAnsi="Times New Roman" w:eastAsia="Times New Roman"/>
-                <w:b/>
-                <w:i w:val="0"/>
-                <w:color w:val="000000"/>
-                <w:sz w:val="17"/>
-              </w:rPr>
-              <w:t>THÀNH TIỀN</w:t>
-            </w:r>
-          </w:p>
-        </w:tc>
-      </w:tr>
-      <w:tr>
-        <w:trPr>
-          <w:cantSplit/>
-          <w:trHeight w:val="1080" w:hRule="atLeast"/>
-        </w:trPr>
-        <w:tc>
-          <w:tcPr>
-            <w:tcW w:type="dxa" w:w="650"/>
-            <w:vAlign w:val="center"/>
-            <w:tcMar>
-              <w:top w:w="65" w:type="dxa"/>
-              <w:start w:w="80" w:type="dxa"/>
-              <w:bottom w:w="65" w:type="dxa"/>
-              <w:end w:w="80" w:type="dxa"/>
-            </w:tcMar>
-            <w:shd w:val="clear" w:fill="FFFFFF"/>
-            <w:tcBorders>
-              <w:top w:val="single" w:sz="6" w:color="7F7F7F"/>
-              <w:left w:val="single" w:sz="6" w:color="7F7F7F"/>
-              <w:bottom w:val="single" w:sz="6" w:color="7F7F7F"/>
-              <w:right w:val="single" w:sz="6" w:color="7F7F7F"/>
-            </w:tcBorders>
-          </w:tcPr>
-          <w:p>
-            <w:pPr>
-              <w:spacing w:before="0" w:after="0" w:line="240" w:lineRule="auto"/>
-              <w:jc w:val="center"/>
-            </w:pPr>
-            <w:r>
-              <w:rPr>
-                <w:rFonts w:ascii="Times New Roman" w:hAnsi="Times New Roman" w:eastAsia="Times New Roman"/>
-                <w:b w:val="0"/>
-                <w:i w:val="0"/>
-                <w:color w:val="000000"/>
-                <w:sz w:val="16"/>
-              </w:rPr>
-              <w:t>{#ChiTietDonHang}</w:t>
+              <w:t xml:space="preserve">Tổng số lượng: </w:t>
             </w:r>
             <w:r>
               <w:rPr>
                 <w:rFonts w:ascii="Times New Roman" w:hAnsi="Times New Roman" w:eastAsia="Times New Roman"/>
                 <w:b/>
                 <w:i w:val="0"/>
-                <w:color w:val="000000"/>
-                <w:sz w:val="20"/>
+                <w:sz w:val="19"/>
               </w:rPr>
-              <w:t>{STT}</w:t>
+              <w:t>{TongSoLuong} sản phẩm</w:t>
             </w:r>
           </w:p>
         </w:tc>
         <w:tc>
           <w:tcPr>
-            <w:tcW w:type="dxa" w:w="5900"/>
-            <w:vAlign w:val="center"/>
+            <w:tcW w:type="dxa" w:w="4251"/>
             <w:tcMar>
-              <w:top w:w="65" w:type="dxa"/>
-              <w:start w:w="80" w:type="dxa"/>
-              <w:bottom w:w="65" w:type="dxa"/>
-              <w:end w:w="80" w:type="dxa"/>
+              <w:top w:w="20" w:type="dxa"/>
+              <w:start w:w="90" w:type="dxa"/>
+              <w:bottom w:w="20" w:type="dxa"/>
+              <w:end w:w="90" w:type="dxa"/>
             </w:tcMar>
-            <w:shd w:val="clear" w:fill="FFFFFF"/>
-            <w:tcBorders>
-              <w:top w:val="single" w:sz="6" w:color="7F7F7F"/>
-              <w:left w:val="single" w:sz="6" w:color="7F7F7F"/>
-              <w:bottom w:val="single" w:sz="6" w:color="7F7F7F"/>
-              <w:right w:val="single" w:sz="6" w:color="7F7F7F"/>
-            </w:tcBorders>
-          </w:tcPr>
-          <w:p>
-            <w:r/>
-          </w:p>
-          <w:p>
-            <w:r>
-              <w:rPr>
-                <w:b/>
-              </w:rPr>
-              <w:t>{ten_hang_goc}</w:t>
-            </w:r>
-          </w:p>
-          <w:p>
-            <w:r>
-              <w:t>Màu: {mau}</w:t>
-            </w:r>
-          </w:p>
-          <w:p>
-            <w:r>
-              <w:t>Size: {#sizes_list}{sz}({q})  {/sizes_list}</w:t>
-            </w:r>
-          </w:p>
-        </w:tc>
-        <w:tc>
-          <w:tcPr>
-            <w:tcW w:type="dxa" w:w="1200"/>
-            <w:vAlign w:val="center"/>
-            <w:tcMar>
-              <w:top w:w="65" w:type="dxa"/>
-              <w:start w:w="80" w:type="dxa"/>
-              <w:bottom w:w="65" w:type="dxa"/>
-              <w:end w:w="80" w:type="dxa"/>
-            </w:tcMar>
-            <w:shd w:val="clear" w:fill="FFFFFF"/>
-            <w:tcBorders>
-              <w:top w:val="single" w:sz="6" w:color="7F7F7F"/>
-              <w:left w:val="single" w:sz="6" w:color="7F7F7F"/>
-              <w:bottom w:val="single" w:sz="6" w:color="7F7F7F"/>
-              <w:right w:val="single" w:sz="6" w:color="7F7F7F"/>
-            </w:tcBorders>
           </w:tcPr>
           <w:p>
             <w:pPr>
-              <w:spacing w:before="0" w:after="0" w:line="240" w:lineRule="auto"/>
-              <w:jc w:val="center"/>
-            </w:pPr>
-            <w:r>
-              <w:rPr>
-                <w:rFonts w:ascii="Times New Roman" w:hAnsi="Times New Roman" w:eastAsia="Times New Roman"/>
-                <w:b/>
-                <w:i w:val="0"/>
-                <w:color w:val="000000"/>
-                <w:sz w:val="22"/>
-              </w:rPr>
-              <w:t>{SoLuong}</w:t>
-            </w:r>
-          </w:p>
-        </w:tc>
-        <w:tc>
-          <w:tcPr>
-            <w:tcW w:type="dxa" w:w="2750"/>
-            <w:vAlign w:val="center"/>
-            <w:tcMar>
-              <w:top w:w="65" w:type="dxa"/>
-              <w:start w:w="80" w:type="dxa"/>
-              <w:bottom w:w="65" w:type="dxa"/>
-              <w:end w:w="80" w:type="dxa"/>
-            </w:tcMar>
-            <w:shd w:val="clear" w:fill="FFFFFF"/>
-            <w:tcBorders>
-              <w:top w:val="single" w:sz="6" w:color="7F7F7F"/>
-              <w:left w:val="single" w:sz="6" w:color="7F7F7F"/>
-              <w:bottom w:val="single" w:sz="6" w:color="7F7F7F"/>
-              <w:right w:val="single" w:sz="6" w:color="7F7F7F"/>
-            </w:tcBorders>
-          </w:tcPr>
-          <w:p>
-            <w:pPr>
-              <w:spacing w:before="0" w:after="0" w:line="240" w:lineRule="auto"/>
               <w:jc w:val="right"/>
             </w:pPr>
             <w:r>
@@ -834,20 +928,186 @@
                 <w:rFonts w:ascii="Times New Roman" w:hAnsi="Times New Roman" w:eastAsia="Times New Roman"/>
                 <w:b/>
                 <w:i w:val="0"/>
-                <w:color w:val="000000"/>
-                <w:sz w:val="20"/>
+                <w:color w:val="505050"/>
+                <w:sz w:val="19"/>
               </w:rPr>
-              <w:t>{ThanhTien}</w:t>
+              <w:t xml:space="preserve">Tổng tiền hàng: </w:t>
+            </w:r>
+            <w:r>
+              <w:rPr>
+                <w:rFonts w:ascii="Times New Roman" w:hAnsi="Times New Roman" w:eastAsia="Times New Roman"/>
+                <w:b/>
+                <w:i w:val="0"/>
+                <w:sz w:val="19"/>
+              </w:rPr>
+              <w:t>{TongTienHang} đ</w:t>
+            </w:r>
+          </w:p>
+        </w:tc>
+      </w:tr>
+      <w:tr>
+        <w:tc>
+          <w:tcPr>
+            <w:tcW w:type="dxa" w:w="6519"/>
+            <w:tcMar>
+              <w:top w:w="20" w:type="dxa"/>
+              <w:start w:w="90" w:type="dxa"/>
+              <w:bottom w:w="20" w:type="dxa"/>
+              <w:end w:w="90" w:type="dxa"/>
+            </w:tcMar>
+          </w:tcPr>
+          <w:p>
+            <w:r>
+              <w:rPr>
+                <w:rFonts w:ascii="Times New Roman" w:hAnsi="Times New Roman" w:eastAsia="Times New Roman"/>
+                <w:b w:val="0"/>
+                <w:i/>
+                <w:sz w:val="18"/>
+              </w:rPr>
+              <w:t xml:space="preserve">Bằng chữ: </w:t>
             </w:r>
             <w:r>
               <w:rPr>
                 <w:rFonts w:ascii="Times New Roman" w:hAnsi="Times New Roman" w:eastAsia="Times New Roman"/>
                 <w:b w:val="0"/>
+                <w:i/>
+                <w:sz w:val="18"/>
+              </w:rPr>
+              <w:t>{TienBangChu}</w:t>
+            </w:r>
+          </w:p>
+        </w:tc>
+        <w:tc>
+          <w:tcPr>
+            <w:tcW w:type="dxa" w:w="4251"/>
+            <w:tcMar>
+              <w:top w:w="20" w:type="dxa"/>
+              <w:start w:w="90" w:type="dxa"/>
+              <w:bottom w:w="20" w:type="dxa"/>
+              <w:end w:w="90" w:type="dxa"/>
+            </w:tcMar>
+          </w:tcPr>
+          <w:p>
+            <w:pPr>
+              <w:jc w:val="right"/>
+            </w:pPr>
+            <w:r>
+              <w:rPr>
+                <w:rFonts w:ascii="Times New Roman" w:hAnsi="Times New Roman" w:eastAsia="Times New Roman"/>
+                <w:b w:val="0"/>
                 <w:i w:val="0"/>
-                <w:color w:val="000000"/>
-                <w:sz w:val="16"/>
+                <w:color w:val="505050"/>
+                <w:sz w:val="18"/>
               </w:rPr>
-              <w:t>{/ChiTietDonHang}</w:t>
+              <w:t xml:space="preserve">Chiết khấu: </w:t>
+            </w:r>
+            <w:r>
+              <w:rPr>
+                <w:rFonts w:ascii="Times New Roman" w:hAnsi="Times New Roman" w:eastAsia="Times New Roman"/>
+                <w:b/>
+                <w:i w:val="0"/>
+                <w:sz w:val="18"/>
+              </w:rPr>
+              <w:t>{TienChietKhau} đ</w:t>
+            </w:r>
+          </w:p>
+        </w:tc>
+      </w:tr>
+      <w:tr>
+        <w:tc>
+          <w:tcPr>
+            <w:tcW w:type="dxa" w:w="6519"/>
+            <w:tcMar>
+              <w:top w:w="20" w:type="dxa"/>
+              <w:start w:w="90" w:type="dxa"/>
+              <w:bottom w:w="20" w:type="dxa"/>
+              <w:end w:w="90" w:type="dxa"/>
+            </w:tcMar>
+          </w:tcPr>
+          <w:p/>
+        </w:tc>
+        <w:tc>
+          <w:tcPr>
+            <w:tcW w:type="dxa" w:w="4251"/>
+            <w:tcMar>
+              <w:top w:w="20" w:type="dxa"/>
+              <w:start w:w="90" w:type="dxa"/>
+              <w:bottom w:w="20" w:type="dxa"/>
+              <w:end w:w="90" w:type="dxa"/>
+            </w:tcMar>
+          </w:tcPr>
+          <w:p>
+            <w:pPr>
+              <w:jc w:val="right"/>
+            </w:pPr>
+            <w:r>
+              <w:rPr>
+                <w:rFonts w:ascii="Times New Roman" w:hAnsi="Times New Roman" w:eastAsia="Times New Roman"/>
+                <w:b w:val="0"/>
+                <w:i w:val="0"/>
+                <w:color w:val="505050"/>
+                <w:sz w:val="18"/>
+              </w:rPr>
+              <w:t xml:space="preserve">Chiết khấu khác: </w:t>
+            </w:r>
+            <w:r>
+              <w:rPr>
+                <w:rFonts w:ascii="Times New Roman" w:hAnsi="Times New Roman" w:eastAsia="Times New Roman"/>
+                <w:b/>
+                <w:i w:val="0"/>
+                <w:sz w:val="18"/>
+              </w:rPr>
+              <w:t>{ChietKhauKhac} đ</w:t>
+            </w:r>
+          </w:p>
+        </w:tc>
+      </w:tr>
+      <w:tr>
+        <w:tc>
+          <w:tcPr>
+            <w:tcW w:type="dxa" w:w="6519"/>
+            <w:tcMar>
+              <w:top w:w="20" w:type="dxa"/>
+              <w:start w:w="90" w:type="dxa"/>
+              <w:bottom w:w="20" w:type="dxa"/>
+              <w:end w:w="90" w:type="dxa"/>
+            </w:tcMar>
+          </w:tcPr>
+          <w:p/>
+        </w:tc>
+        <w:tc>
+          <w:tcPr>
+            <w:tcW w:type="dxa" w:w="4251"/>
+            <w:tcMar>
+              <w:top w:w="20" w:type="dxa"/>
+              <w:start w:w="90" w:type="dxa"/>
+              <w:bottom w:w="20" w:type="dxa"/>
+              <w:end w:w="90" w:type="dxa"/>
+            </w:tcMar>
+          </w:tcPr>
+          <w:p>
+            <w:pPr>
+              <w:jc w:val="right"/>
+            </w:pPr>
+            <w:r>
+              <w:rPr>
+                <w:rFonts w:ascii="Times New Roman" w:hAnsi="Times New Roman" w:eastAsia="Times New Roman"/>
+                <w:b/>
+                <w:i w:val="0"/>
+                <w:sz w:val="20"/>
+              </w:rPr>
+              <w:t>TỔNG THANH TOÁN:</w:t>
+              <w:br/>
+            </w:r>
+            <w:r>
+              <w:rPr>
+                <w:rFonts w:ascii="Times New Roman" w:hAnsi="Times New Roman" w:eastAsia="Times New Roman"/>
+                <w:b/>
+                <w:i w:val="0"/>
+                <w:color w:val="8B5E2B"/>
+                <w:sz w:val="24"/>
+              </w:rPr>
+              <w:t>{TongThanhToan} đ</w:t>
             </w:r>
           </w:p>
         </w:tc>
@@ -855,314 +1115,7 @@
     </w:tbl>
     <w:p>
       <w:pPr>
-        <w:spacing w:before="0" w:after="20" w:line="240" w:lineRule="auto"/>
-        <w:jc w:val="left"/>
-      </w:pPr>
-    </w:p>
-    <w:tbl>
-      <w:tblPr>
-        <w:tblW w:type="auto" w:w="0"/>
-        <w:jc w:val="right"/>
-        <w:tblLayout w:type="fixed"/>
-        <w:tblLook w:firstColumn="1" w:firstRow="1" w:lastColumn="0" w:lastRow="0" w:noHBand="0" w:noVBand="1" w:val="04A0"/>
-      </w:tblPr>
-      <w:tblGrid>
-        <w:gridCol w:w="2500"/>
-        <w:gridCol w:w="2500"/>
-      </w:tblGrid>
-      <w:tr>
-        <w:tc>
-          <w:tcPr>
-            <w:tcW w:type="dxa" w:w="2500"/>
-            <w:tcMar>
-              <w:top w:w="15" w:type="dxa"/>
-              <w:start w:w="35" w:type="dxa"/>
-              <w:bottom w:w="15" w:type="dxa"/>
-              <w:end w:w="35" w:type="dxa"/>
-            </w:tcMar>
-            <w:shd w:val="clear" w:fill="FFFFFF"/>
-            <w:tcBorders>
-              <w:top w:val="nil"/>
-              <w:left w:val="nil"/>
-              <w:bottom w:val="nil"/>
-              <w:right w:val="nil"/>
-            </w:tcBorders>
-          </w:tcPr>
-          <w:p>
-            <w:pPr>
-              <w:spacing w:after="0" w:before="0" w:line="240" w:lineRule="auto"/>
-              <w:jc w:val="right"/>
-            </w:pPr>
-            <w:r/>
-            <w:r>
-              <w:rPr>
-                <w:rFonts w:ascii="Times New Roman" w:hAnsi="Times New Roman" w:eastAsia="Times New Roman"/>
-                <w:b/>
-                <w:i w:val="0"/>
-                <w:color w:val="000000"/>
-                <w:sz w:val="19"/>
-              </w:rPr>
-              <w:t>Tổng tiền hàng:</w:t>
-            </w:r>
-          </w:p>
-        </w:tc>
-        <w:tc>
-          <w:tcPr>
-            <w:tcW w:type="dxa" w:w="2500"/>
-            <w:tcMar>
-              <w:top w:w="15" w:type="dxa"/>
-              <w:start w:w="35" w:type="dxa"/>
-              <w:bottom w:w="15" w:type="dxa"/>
-              <w:end w:w="35" w:type="dxa"/>
-            </w:tcMar>
-            <w:shd w:val="clear" w:fill="FFFFFF"/>
-            <w:tcBorders>
-              <w:top w:val="nil"/>
-              <w:left w:val="nil"/>
-              <w:bottom w:val="nil"/>
-              <w:right w:val="nil"/>
-            </w:tcBorders>
-          </w:tcPr>
-          <w:p>
-            <w:pPr>
-              <w:spacing w:after="0" w:before="0" w:line="240" w:lineRule="auto"/>
-              <w:jc w:val="right"/>
-            </w:pPr>
-            <w:r/>
-            <w:r>
-              <w:rPr>
-                <w:rFonts w:ascii="Times New Roman" w:hAnsi="Times New Roman" w:eastAsia="Times New Roman"/>
-                <w:b/>
-                <w:i w:val="0"/>
-                <w:color w:val="000000"/>
-                <w:sz w:val="21"/>
-              </w:rPr>
-              <w:t>{TongTienHang}</w:t>
-            </w:r>
-          </w:p>
-        </w:tc>
-      </w:tr>
-      <w:tr>
-        <w:tc>
-          <w:tcPr>
-            <w:tcW w:type="dxa" w:w="2500"/>
-            <w:tcMar>
-              <w:top w:w="15" w:type="dxa"/>
-              <w:start w:w="35" w:type="dxa"/>
-              <w:bottom w:w="15" w:type="dxa"/>
-              <w:end w:w="35" w:type="dxa"/>
-            </w:tcMar>
-            <w:shd w:val="clear" w:fill="FFFFFF"/>
-            <w:tcBorders>
-              <w:top w:val="nil"/>
-              <w:left w:val="nil"/>
-              <w:bottom w:val="nil"/>
-              <w:right w:val="nil"/>
-            </w:tcBorders>
-          </w:tcPr>
-          <w:p>
-            <w:pPr>
-              <w:spacing w:after="0" w:before="0" w:line="240" w:lineRule="auto"/>
-              <w:jc w:val="right"/>
-            </w:pPr>
-            <w:r/>
-            <w:r>
-              <w:rPr>
-                <w:rFonts w:ascii="Times New Roman" w:hAnsi="Times New Roman" w:eastAsia="Times New Roman"/>
-                <w:b w:val="0"/>
-                <w:i w:val="0"/>
-                <w:color w:val="000000"/>
-                <w:sz w:val="19"/>
-              </w:rPr>
-              <w:t>Chiết khấu:</w:t>
-            </w:r>
-          </w:p>
-        </w:tc>
-        <w:tc>
-          <w:tcPr>
-            <w:tcW w:type="dxa" w:w="2500"/>
-            <w:tcMar>
-              <w:top w:w="15" w:type="dxa"/>
-              <w:start w:w="35" w:type="dxa"/>
-              <w:bottom w:w="15" w:type="dxa"/>
-              <w:end w:w="35" w:type="dxa"/>
-            </w:tcMar>
-            <w:shd w:val="clear" w:fill="FFFFFF"/>
-            <w:tcBorders>
-              <w:top w:val="nil"/>
-              <w:left w:val="nil"/>
-              <w:bottom w:val="nil"/>
-              <w:right w:val="nil"/>
-            </w:tcBorders>
-          </w:tcPr>
-          <w:p>
-            <w:pPr>
-              <w:spacing w:after="0" w:before="0" w:line="240" w:lineRule="auto"/>
-              <w:jc w:val="right"/>
-            </w:pPr>
-            <w:r/>
-            <w:r>
-              <w:rPr>
-                <w:rFonts w:ascii="Times New Roman" w:hAnsi="Times New Roman" w:eastAsia="Times New Roman"/>
-                <w:b w:val="0"/>
-                <w:i w:val="0"/>
-                <w:color w:val="000000"/>
-                <w:sz w:val="19"/>
-              </w:rPr>
-              <w:t>{TienChietKhau}</w:t>
-            </w:r>
-          </w:p>
-        </w:tc>
-      </w:tr>
-      <w:tr>
-        <w:tc>
-          <w:tcPr>
-            <w:tcW w:type="dxa" w:w="2500"/>
-            <w:tcMar>
-              <w:top w:w="15" w:type="dxa"/>
-              <w:start w:w="35" w:type="dxa"/>
-              <w:bottom w:w="15" w:type="dxa"/>
-              <w:end w:w="35" w:type="dxa"/>
-            </w:tcMar>
-            <w:shd w:val="clear" w:fill="FFFFFF"/>
-            <w:tcBorders>
-              <w:top w:val="nil"/>
-              <w:left w:val="nil"/>
-              <w:bottom w:val="nil"/>
-              <w:right w:val="nil"/>
-            </w:tcBorders>
-          </w:tcPr>
-          <w:p>
-            <w:pPr>
-              <w:spacing w:after="0" w:before="0" w:line="240" w:lineRule="auto"/>
-              <w:jc w:val="right"/>
-            </w:pPr>
-            <w:r/>
-            <w:r>
-              <w:rPr>
-                <w:rFonts w:ascii="Times New Roman" w:hAnsi="Times New Roman" w:eastAsia="Times New Roman"/>
-                <w:b w:val="0"/>
-                <w:i w:val="0"/>
-                <w:color w:val="000000"/>
-                <w:sz w:val="19"/>
-              </w:rPr>
-              <w:t>Chiết khấu khác:</w:t>
-            </w:r>
-          </w:p>
-        </w:tc>
-        <w:tc>
-          <w:tcPr>
-            <w:tcW w:type="dxa" w:w="2500"/>
-            <w:tcMar>
-              <w:top w:w="15" w:type="dxa"/>
-              <w:start w:w="35" w:type="dxa"/>
-              <w:bottom w:w="15" w:type="dxa"/>
-              <w:end w:w="35" w:type="dxa"/>
-            </w:tcMar>
-            <w:shd w:val="clear" w:fill="FFFFFF"/>
-            <w:tcBorders>
-              <w:top w:val="nil"/>
-              <w:left w:val="nil"/>
-              <w:bottom w:val="nil"/>
-              <w:right w:val="nil"/>
-            </w:tcBorders>
-          </w:tcPr>
-          <w:p>
-            <w:pPr>
-              <w:spacing w:after="0" w:before="0" w:line="240" w:lineRule="auto"/>
-              <w:jc w:val="right"/>
-            </w:pPr>
-            <w:r/>
-            <w:r>
-              <w:rPr>
-                <w:rFonts w:ascii="Times New Roman" w:hAnsi="Times New Roman" w:eastAsia="Times New Roman"/>
-                <w:b w:val="0"/>
-                <w:i w:val="0"/>
-                <w:color w:val="000000"/>
-                <w:sz w:val="19"/>
-              </w:rPr>
-              <w:t>{ChietKhauKhac}</w:t>
-            </w:r>
-          </w:p>
-        </w:tc>
-      </w:tr>
-      <w:tr>
-        <w:tc>
-          <w:tcPr>
-            <w:tcW w:type="dxa" w:w="2500"/>
-            <w:tcMar>
-              <w:top w:w="15" w:type="dxa"/>
-              <w:start w:w="35" w:type="dxa"/>
-              <w:bottom w:w="15" w:type="dxa"/>
-              <w:end w:w="35" w:type="dxa"/>
-            </w:tcMar>
-            <w:shd w:val="clear" w:fill="FFFFFF"/>
-            <w:tcBorders>
-              <w:top w:val="single" w:sz="7" w:color="595959"/>
-              <w:left w:val="nil"/>
-              <w:bottom w:val="nil"/>
-              <w:right w:val="nil"/>
-            </w:tcBorders>
-          </w:tcPr>
-          <w:p>
-            <w:pPr>
-              <w:spacing w:after="0" w:before="0" w:line="240" w:lineRule="auto"/>
-              <w:jc w:val="right"/>
-            </w:pPr>
-            <w:r/>
-            <w:r>
-              <w:rPr>
-                <w:rFonts w:ascii="Times New Roman" w:hAnsi="Times New Roman" w:eastAsia="Times New Roman"/>
-                <w:b/>
-                <w:i w:val="0"/>
-                <w:color w:val="000000"/>
-                <w:sz w:val="19"/>
-              </w:rPr>
-              <w:t>Tổng thanh toán:</w:t>
-            </w:r>
-          </w:p>
-        </w:tc>
-        <w:tc>
-          <w:tcPr>
-            <w:tcW w:type="dxa" w:w="2500"/>
-            <w:tcMar>
-              <w:top w:w="15" w:type="dxa"/>
-              <w:start w:w="35" w:type="dxa"/>
-              <w:bottom w:w="15" w:type="dxa"/>
-              <w:end w:w="35" w:type="dxa"/>
-            </w:tcMar>
-            <w:shd w:val="clear" w:fill="FFFFFF"/>
-            <w:tcBorders>
-              <w:top w:val="single" w:sz="7" w:color="595959"/>
-              <w:left w:val="nil"/>
-              <w:bottom w:val="nil"/>
-              <w:right w:val="nil"/>
-            </w:tcBorders>
-          </w:tcPr>
-          <w:p>
-            <w:pPr>
-              <w:spacing w:after="0" w:before="0" w:line="240" w:lineRule="auto"/>
-              <w:jc w:val="right"/>
-            </w:pPr>
-            <w:r/>
-            <w:r>
-              <w:rPr>
-                <w:rFonts w:ascii="Times New Roman" w:hAnsi="Times New Roman" w:eastAsia="Times New Roman"/>
-                <w:b/>
-                <w:i w:val="0"/>
-                <w:color w:val="000000"/>
-                <w:sz w:val="21"/>
-              </w:rPr>
-              <w:t>{TongThanhToan}</w:t>
-            </w:r>
-          </w:p>
-        </w:tc>
-      </w:tr>
-    </w:tbl>
-    <w:p>
-      <w:pPr>
-        <w:spacing w:before="0" w:after="40" w:line="240" w:lineRule="auto"/>
-        <w:jc w:val="left"/>
+        <w:spacing w:before="120" w:after="80"/>
       </w:pPr>
     </w:p>
     <w:tbl>
@@ -1171,45 +1124,39 @@
         <w:jc w:val="center"/>
         <w:tblLayout w:type="fixed"/>
         <w:tblLook w:firstColumn="1" w:firstRow="1" w:lastColumn="0" w:lastRow="0" w:noHBand="0" w:noVBand="1" w:val="04A0"/>
+        <w:tblBorders>
+          <w:top w:val="nil"/>
+          <w:left w:val="nil"/>
+          <w:bottom w:val="nil"/>
+          <w:right w:val="nil"/>
+          <w:insideH w:val="nil"/>
+          <w:insideV w:val="nil"/>
+        </w:tblBorders>
       </w:tblPr>
       <w:tblGrid>
-        <w:gridCol w:w="2100"/>
-        <w:gridCol w:w="2100"/>
-        <w:gridCol w:w="2100"/>
-        <w:gridCol w:w="2100"/>
-        <w:gridCol w:w="2100"/>
+        <w:gridCol w:w="2221"/>
+        <w:gridCol w:w="2221"/>
+        <w:gridCol w:w="2221"/>
+        <w:gridCol w:w="2221"/>
+        <w:gridCol w:w="2221"/>
       </w:tblGrid>
       <w:tr>
         <w:tc>
           <w:tcPr>
-            <w:tcW w:type="dxa" w:w="2100"/>
-            <w:tcMar>
-              <w:top w:w="0" w:type="dxa"/>
-              <w:start w:w="20" w:type="dxa"/>
-              <w:bottom w:w="0" w:type="dxa"/>
-              <w:end w:w="20" w:type="dxa"/>
-            </w:tcMar>
-            <w:tcBorders>
-              <w:top w:val="nil"/>
-              <w:left w:val="nil"/>
-              <w:bottom w:val="nil"/>
-              <w:right w:val="nil"/>
-            </w:tcBorders>
-            <w:shd w:val="clear" w:fill="FFFFFF"/>
+            <w:tcW w:type="dxa" w:w="2154"/>
+            <w:vAlign w:val="center"/>
           </w:tcPr>
           <w:p>
             <w:pPr>
-              <w:spacing w:after="0" w:before="0" w:line="240" w:lineRule="auto"/>
+              <w:spacing w:before="0" w:after="0" w:line="264" w:lineRule="auto"/>
               <w:jc w:val="center"/>
             </w:pPr>
-            <w:r/>
             <w:r>
               <w:rPr>
                 <w:rFonts w:ascii="Times New Roman" w:hAnsi="Times New Roman" w:eastAsia="Times New Roman"/>
                 <w:b/>
                 <w:i w:val="0"/>
-                <w:color w:val="000000"/>
-                <w:sz w:val="18"/>
+                <w:sz w:val="19"/>
               </w:rPr>
               <w:t>Người nhận</w:t>
             </w:r>
@@ -1217,34 +1164,20 @@
         </w:tc>
         <w:tc>
           <w:tcPr>
-            <w:tcW w:type="dxa" w:w="2100"/>
-            <w:tcMar>
-              <w:top w:w="0" w:type="dxa"/>
-              <w:start w:w="20" w:type="dxa"/>
-              <w:bottom w:w="0" w:type="dxa"/>
-              <w:end w:w="20" w:type="dxa"/>
-            </w:tcMar>
-            <w:tcBorders>
-              <w:top w:val="nil"/>
-              <w:left w:val="nil"/>
-              <w:bottom w:val="nil"/>
-              <w:right w:val="nil"/>
-            </w:tcBorders>
-            <w:shd w:val="clear" w:fill="FFFFFF"/>
+            <w:tcW w:type="dxa" w:w="2154"/>
+            <w:vAlign w:val="center"/>
           </w:tcPr>
           <w:p>
             <w:pPr>
-              <w:spacing w:after="0" w:before="0" w:line="240" w:lineRule="auto"/>
+              <w:spacing w:before="0" w:after="0" w:line="264" w:lineRule="auto"/>
               <w:jc w:val="center"/>
             </w:pPr>
-            <w:r/>
             <w:r>
               <w:rPr>
                 <w:rFonts w:ascii="Times New Roman" w:hAnsi="Times New Roman" w:eastAsia="Times New Roman"/>
                 <w:b/>
                 <w:i w:val="0"/>
-                <w:color w:val="000000"/>
-                <w:sz w:val="18"/>
+                <w:sz w:val="19"/>
               </w:rPr>
               <w:t>Người giao</w:t>
             </w:r>
@@ -1252,34 +1185,20 @@
         </w:tc>
         <w:tc>
           <w:tcPr>
-            <w:tcW w:type="dxa" w:w="2100"/>
-            <w:tcMar>
-              <w:top w:w="0" w:type="dxa"/>
-              <w:start w:w="20" w:type="dxa"/>
-              <w:bottom w:w="0" w:type="dxa"/>
-              <w:end w:w="20" w:type="dxa"/>
-            </w:tcMar>
-            <w:tcBorders>
-              <w:top w:val="nil"/>
-              <w:left w:val="nil"/>
-              <w:bottom w:val="nil"/>
-              <w:right w:val="nil"/>
-            </w:tcBorders>
-            <w:shd w:val="clear" w:fill="FFFFFF"/>
+            <w:tcW w:type="dxa" w:w="2154"/>
+            <w:vAlign w:val="center"/>
           </w:tcPr>
           <w:p>
             <w:pPr>
-              <w:spacing w:after="0" w:before="0" w:line="240" w:lineRule="auto"/>
+              <w:spacing w:before="0" w:after="0" w:line="264" w:lineRule="auto"/>
               <w:jc w:val="center"/>
             </w:pPr>
-            <w:r/>
             <w:r>
               <w:rPr>
                 <w:rFonts w:ascii="Times New Roman" w:hAnsi="Times New Roman" w:eastAsia="Times New Roman"/>
                 <w:b/>
                 <w:i w:val="0"/>
-                <w:color w:val="000000"/>
-                <w:sz w:val="18"/>
+                <w:sz w:val="19"/>
               </w:rPr>
               <w:t>Thủ kho</w:t>
             </w:r>
@@ -1287,34 +1206,20 @@
         </w:tc>
         <w:tc>
           <w:tcPr>
-            <w:tcW w:type="dxa" w:w="2100"/>
-            <w:tcMar>
-              <w:top w:w="0" w:type="dxa"/>
-              <w:start w:w="20" w:type="dxa"/>
-              <w:bottom w:w="0" w:type="dxa"/>
-              <w:end w:w="20" w:type="dxa"/>
-            </w:tcMar>
-            <w:tcBorders>
-              <w:top w:val="nil"/>
-              <w:left w:val="nil"/>
-              <w:bottom w:val="nil"/>
-              <w:right w:val="nil"/>
-            </w:tcBorders>
-            <w:shd w:val="clear" w:fill="FFFFFF"/>
+            <w:tcW w:type="dxa" w:w="2154"/>
+            <w:vAlign w:val="center"/>
           </w:tcPr>
           <w:p>
             <w:pPr>
-              <w:spacing w:after="0" w:before="0" w:line="240" w:lineRule="auto"/>
+              <w:spacing w:before="0" w:after="0" w:line="264" w:lineRule="auto"/>
               <w:jc w:val="center"/>
             </w:pPr>
-            <w:r/>
             <w:r>
               <w:rPr>
                 <w:rFonts w:ascii="Times New Roman" w:hAnsi="Times New Roman" w:eastAsia="Times New Roman"/>
                 <w:b/>
                 <w:i w:val="0"/>
-                <w:color w:val="000000"/>
-                <w:sz w:val="18"/>
+                <w:sz w:val="19"/>
               </w:rPr>
               <w:t>Kế toán</w:t>
             </w:r>
@@ -1322,34 +1227,20 @@
         </w:tc>
         <w:tc>
           <w:tcPr>
-            <w:tcW w:type="dxa" w:w="2100"/>
-            <w:tcMar>
-              <w:top w:w="0" w:type="dxa"/>
-              <w:start w:w="20" w:type="dxa"/>
-              <w:bottom w:w="0" w:type="dxa"/>
-              <w:end w:w="20" w:type="dxa"/>
-            </w:tcMar>
-            <w:tcBorders>
-              <w:top w:val="nil"/>
-              <w:left w:val="nil"/>
-              <w:bottom w:val="nil"/>
-              <w:right w:val="nil"/>
-            </w:tcBorders>
-            <w:shd w:val="clear" w:fill="FFFFFF"/>
+            <w:tcW w:type="dxa" w:w="2154"/>
+            <w:vAlign w:val="center"/>
           </w:tcPr>
           <w:p>
             <w:pPr>
-              <w:spacing w:after="0" w:before="0" w:line="240" w:lineRule="auto"/>
+              <w:spacing w:before="0" w:after="0" w:line="264" w:lineRule="auto"/>
               <w:jc w:val="center"/>
             </w:pPr>
-            <w:r/>
             <w:r>
               <w:rPr>
                 <w:rFonts w:ascii="Times New Roman" w:hAnsi="Times New Roman" w:eastAsia="Times New Roman"/>
                 <w:b/>
                 <w:i w:val="0"/>
-                <w:color w:val="000000"/>
-                <w:sz w:val="18"/>
+                <w:sz w:val="19"/>
               </w:rPr>
               <w:t>Thủ trưởng</w:t>
             </w:r>
@@ -1357,42 +1248,22 @@
         </w:tc>
       </w:tr>
       <w:tr>
-        <w:trPr>
-          <w:trHeight w:val="700" w:hRule="atLeast"/>
-          <w:trHeight w:val="700" w:hRule="atLeast"/>
-          <w:trHeight w:val="700" w:hRule="atLeast"/>
-          <w:trHeight w:val="700" w:hRule="atLeast"/>
-          <w:trHeight w:val="700" w:hRule="atLeast"/>
-        </w:trPr>
         <w:tc>
           <w:tcPr>
-            <w:tcW w:type="dxa" w:w="2100"/>
-            <w:tcMar>
-              <w:top w:w="0" w:type="dxa"/>
-              <w:start w:w="20" w:type="dxa"/>
-              <w:bottom w:w="0" w:type="dxa"/>
-              <w:end w:w="20" w:type="dxa"/>
-            </w:tcMar>
-            <w:tcBorders>
-              <w:top w:val="nil"/>
-              <w:left w:val="nil"/>
-              <w:bottom w:val="nil"/>
-              <w:right w:val="nil"/>
-            </w:tcBorders>
-            <w:shd w:val="clear" w:fill="FFFFFF"/>
+            <w:tcW w:type="dxa" w:w="2154"/>
+            <w:vAlign w:val="center"/>
           </w:tcPr>
           <w:p>
             <w:pPr>
-              <w:spacing w:after="0" w:before="0" w:line="240" w:lineRule="auto"/>
+              <w:spacing w:before="0" w:after="0" w:line="264" w:lineRule="auto"/>
               <w:jc w:val="center"/>
             </w:pPr>
-            <w:r/>
             <w:r>
               <w:rPr>
                 <w:rFonts w:ascii="Times New Roman" w:hAnsi="Times New Roman" w:eastAsia="Times New Roman"/>
                 <w:b w:val="0"/>
                 <w:i/>
-                <w:color w:val="000000"/>
+                <w:color w:val="646464"/>
                 <w:sz w:val="17"/>
               </w:rPr>
               <w:t>(Ký / họ tên)</w:t>
@@ -1401,33 +1272,20 @@
         </w:tc>
         <w:tc>
           <w:tcPr>
-            <w:tcW w:type="dxa" w:w="2100"/>
-            <w:tcMar>
-              <w:top w:w="0" w:type="dxa"/>
-              <w:start w:w="20" w:type="dxa"/>
-              <w:bottom w:w="0" w:type="dxa"/>
-              <w:end w:w="20" w:type="dxa"/>
-            </w:tcMar>
-            <w:tcBorders>
-              <w:top w:val="nil"/>
-              <w:left w:val="nil"/>
-              <w:bottom w:val="nil"/>
-              <w:right w:val="nil"/>
-            </w:tcBorders>
-            <w:shd w:val="clear" w:fill="FFFFFF"/>
+            <w:tcW w:type="dxa" w:w="2154"/>
+            <w:vAlign w:val="center"/>
           </w:tcPr>
           <w:p>
             <w:pPr>
-              <w:spacing w:after="0" w:before="0" w:line="240" w:lineRule="auto"/>
+              <w:spacing w:before="0" w:after="0" w:line="264" w:lineRule="auto"/>
               <w:jc w:val="center"/>
             </w:pPr>
-            <w:r/>
             <w:r>
               <w:rPr>
                 <w:rFonts w:ascii="Times New Roman" w:hAnsi="Times New Roman" w:eastAsia="Times New Roman"/>
                 <w:b w:val="0"/>
                 <w:i/>
-                <w:color w:val="000000"/>
+                <w:color w:val="646464"/>
                 <w:sz w:val="17"/>
               </w:rPr>
               <w:t>(Ký / họ tên)</w:t>
@@ -1436,33 +1294,20 @@
         </w:tc>
         <w:tc>
           <w:tcPr>
-            <w:tcW w:type="dxa" w:w="2100"/>
-            <w:tcMar>
-              <w:top w:w="0" w:type="dxa"/>
-              <w:start w:w="20" w:type="dxa"/>
-              <w:bottom w:w="0" w:type="dxa"/>
-              <w:end w:w="20" w:type="dxa"/>
-            </w:tcMar>
-            <w:tcBorders>
-              <w:top w:val="nil"/>
-              <w:left w:val="nil"/>
-              <w:bottom w:val="nil"/>
-              <w:right w:val="nil"/>
-            </w:tcBorders>
-            <w:shd w:val="clear" w:fill="FFFFFF"/>
+            <w:tcW w:type="dxa" w:w="2154"/>
+            <w:vAlign w:val="center"/>
           </w:tcPr>
           <w:p>
             <w:pPr>
-              <w:spacing w:after="0" w:before="0" w:line="240" w:lineRule="auto"/>
+              <w:spacing w:before="0" w:after="0" w:line="264" w:lineRule="auto"/>
               <w:jc w:val="center"/>
             </w:pPr>
-            <w:r/>
             <w:r>
               <w:rPr>
                 <w:rFonts w:ascii="Times New Roman" w:hAnsi="Times New Roman" w:eastAsia="Times New Roman"/>
                 <w:b w:val="0"/>
                 <w:i/>
-                <w:color w:val="000000"/>
+                <w:color w:val="646464"/>
                 <w:sz w:val="17"/>
               </w:rPr>
               <w:t>(Ký / họ tên)</w:t>
@@ -1471,33 +1316,20 @@
         </w:tc>
         <w:tc>
           <w:tcPr>
-            <w:tcW w:type="dxa" w:w="2100"/>
-            <w:tcMar>
-              <w:top w:w="0" w:type="dxa"/>
-              <w:start w:w="20" w:type="dxa"/>
-              <w:bottom w:w="0" w:type="dxa"/>
-              <w:end w:w="20" w:type="dxa"/>
-            </w:tcMar>
-            <w:tcBorders>
-              <w:top w:val="nil"/>
-              <w:left w:val="nil"/>
-              <w:bottom w:val="nil"/>
-              <w:right w:val="nil"/>
-            </w:tcBorders>
-            <w:shd w:val="clear" w:fill="FFFFFF"/>
+            <w:tcW w:type="dxa" w:w="2154"/>
+            <w:vAlign w:val="center"/>
           </w:tcPr>
           <w:p>
             <w:pPr>
-              <w:spacing w:after="0" w:before="0" w:line="240" w:lineRule="auto"/>
+              <w:spacing w:before="0" w:after="0" w:line="264" w:lineRule="auto"/>
               <w:jc w:val="center"/>
             </w:pPr>
-            <w:r/>
             <w:r>
               <w:rPr>
                 <w:rFonts w:ascii="Times New Roman" w:hAnsi="Times New Roman" w:eastAsia="Times New Roman"/>
                 <w:b w:val="0"/>
                 <w:i/>
-                <w:color w:val="000000"/>
+                <w:color w:val="646464"/>
                 <w:sz w:val="17"/>
               </w:rPr>
               <w:t>(Ký / họ tên)</w:t>
@@ -1506,33 +1338,20 @@
         </w:tc>
         <w:tc>
           <w:tcPr>
-            <w:tcW w:type="dxa" w:w="2100"/>
-            <w:tcMar>
-              <w:top w:w="0" w:type="dxa"/>
-              <w:start w:w="20" w:type="dxa"/>
-              <w:bottom w:w="0" w:type="dxa"/>
-              <w:end w:w="20" w:type="dxa"/>
-            </w:tcMar>
-            <w:tcBorders>
-              <w:top w:val="nil"/>
-              <w:left w:val="nil"/>
-              <w:bottom w:val="nil"/>
-              <w:right w:val="nil"/>
-            </w:tcBorders>
-            <w:shd w:val="clear" w:fill="FFFFFF"/>
+            <w:tcW w:type="dxa" w:w="2154"/>
+            <w:vAlign w:val="center"/>
           </w:tcPr>
           <w:p>
             <w:pPr>
-              <w:spacing w:after="0" w:before="0" w:line="240" w:lineRule="auto"/>
+              <w:spacing w:before="0" w:after="0" w:line="264" w:lineRule="auto"/>
               <w:jc w:val="center"/>
             </w:pPr>
-            <w:r/>
             <w:r>
               <w:rPr>
                 <w:rFonts w:ascii="Times New Roman" w:hAnsi="Times New Roman" w:eastAsia="Times New Roman"/>
                 <w:b w:val="0"/>
                 <w:i/>
-                <w:color w:val="000000"/>
+                <w:color w:val="646464"/>
                 <w:sz w:val="17"/>
               </w:rPr>
               <w:t>(Ký / họ tên)</w:t>
@@ -1541,9 +1360,30 @@
         </w:tc>
       </w:tr>
     </w:tbl>
+    <w:p>
+      <w:pPr>
+        <w:spacing w:before="280" w:after="40"/>
+      </w:pPr>
+    </w:p>
+    <w:p>
+      <w:pPr>
+        <w:spacing w:before="80" w:after="40"/>
+        <w:jc w:val="center"/>
+      </w:pPr>
+      <w:r>
+        <w:rPr>
+          <w:rFonts w:ascii="Times New Roman" w:hAnsi="Times New Roman" w:eastAsia="Times New Roman"/>
+          <w:b w:val="0"/>
+          <w:i/>
+          <w:color w:val="787878"/>
+          <w:sz w:val="16"/>
+        </w:rPr>
+        <w:t>Mẫu trình bày gọn "Size × Số lượng" giúp giữ hóa đơn trong một trang A4 mà không thu nhỏ chữ quá mức.</w:t>
+      </w:r>
+    </w:p>
     <w:sectPr>
-      <w:pgSz w:w="11906" w:h="16838"/>
-      <w:pgMar w:top="567" w:right="680" w:bottom="567" w:left="680" w:header="170" w:footer="283" w:gutter="0"/>
+      <w:pgSz w:w="12240" w:h="15840"/>
+      <w:pgMar w:top="567" w:right="567" w:bottom="567" w:left="567" w:header="283" w:footer="283" w:gutter="0"/>
       <w:cols w:space="720"/>
       <w:docGrid w:linePitch="360"/>
     </w:sectPr>
@@ -1914,12 +1754,9 @@
     <w:name w:val="Normal"/>
     <w:qFormat/>
     <w:rsid w:val="00FC693F"/>
-    <w:pPr>
-      <w:spacing w:after="0" w:before="0"/>
-    </w:pPr>
     <w:rPr>
       <w:rFonts w:ascii="Times New Roman" w:hAnsi="Times New Roman" w:eastAsia="Times New Roman"/>
-      <w:sz w:val="18"/>
+      <w:sz w:val="19"/>
     </w:rPr>
   </w:style>
   <w:style w:type="paragraph" w:styleId="Header">

</xml_diff>

<commit_message>
feat: implement dynamic order document generation with SQL stored procedure and template service
</commit_message>
<xml_diff>
--- a/backend-app/samples/In Don dat hang.docx
+++ b/backend-app/samples/In Don dat hang.docx
@@ -34,7 +34,7 @@
             <w:r>
               <w:drawing>
                 <wp:inline xmlns:a="http://schemas.openxmlformats.org/drawingml/2006/main" xmlns:pic="http://schemas.openxmlformats.org/drawingml/2006/picture">
-                  <wp:extent cx="1260000" cy="793274"/>
+                  <wp:extent cx="1296000" cy="815939"/>
                   <wp:docPr id="1" name="Picture 1"/>
                   <wp:cNvGraphicFramePr>
                     <a:graphicFrameLocks noChangeAspect="1"/>
@@ -55,7 +55,7 @@
                         <pic:spPr>
                           <a:xfrm>
                             <a:off x="0" y="0"/>
-                            <a:ext cx="1260000" cy="793274"/>
+                            <a:ext cx="1296000" cy="815939"/>
                           </a:xfrm>
                           <a:prstGeom prst="rect"/>
                         </pic:spPr>
@@ -79,10 +79,10 @@
             </w:pPr>
             <w:r>
               <w:rPr>
-                <w:rFonts w:ascii="Segoe UI" w:hAnsi="Segoe UI" w:eastAsia="Segoe UI"/>
+                <w:rFonts w:ascii="Times New Roman" w:hAnsi="Times New Roman" w:eastAsia="Times New Roman"/>
                 <w:b/>
                 <w:i w:val="0"/>
-                <w:color w:val="141414"/>
+                <w:color w:val="000000"/>
                 <w:sz w:val="22"/>
               </w:rPr>
               <w:t>CÔNG TY CP LSP VIỆT NAM</w:t>
@@ -95,10 +95,10 @@
             </w:pPr>
             <w:r>
               <w:rPr>
-                <w:rFonts w:ascii="Segoe UI" w:hAnsi="Segoe UI" w:eastAsia="Segoe UI"/>
+                <w:rFonts w:ascii="Times New Roman" w:hAnsi="Times New Roman" w:eastAsia="Times New Roman"/>
                 <w:b w:val="0"/>
                 <w:i w:val="0"/>
-                <w:color w:val="646464"/>
+                <w:color w:val="505050"/>
                 <w:sz w:val="17"/>
               </w:rPr>
               <w:t>Số 48, Phố Lạc Trung, Q. Hai Bà Trưng, Hà Nội</w:t>
@@ -111,10 +111,10 @@
             </w:pPr>
             <w:r>
               <w:rPr>
-                <w:rFonts w:ascii="Segoe UI" w:hAnsi="Segoe UI" w:eastAsia="Segoe UI"/>
+                <w:rFonts w:ascii="Times New Roman" w:hAnsi="Times New Roman" w:eastAsia="Times New Roman"/>
                 <w:b w:val="0"/>
                 <w:i w:val="0"/>
-                <w:color w:val="646464"/>
+                <w:color w:val="505050"/>
                 <w:sz w:val="17"/>
               </w:rPr>
               <w:t>Tel: (024) 3204 9988  |  Fax: (024) 3215 1142</w:t>
@@ -127,10 +127,10 @@
             </w:pPr>
             <w:r>
               <w:rPr>
-                <w:rFonts w:ascii="Segoe UI" w:hAnsi="Segoe UI" w:eastAsia="Segoe UI"/>
+                <w:rFonts w:ascii="Times New Roman" w:hAnsi="Times New Roman" w:eastAsia="Times New Roman"/>
                 <w:b w:val="0"/>
                 <w:i w:val="0"/>
-                <w:color w:val="646464"/>
+                <w:color w:val="505050"/>
                 <w:sz w:val="17"/>
               </w:rPr>
               <w:t>Email: info@santino.com.vn  |  www.santino.com.vn</w:t>
@@ -141,15 +141,15 @@
     </w:tbl>
     <w:p>
       <w:pPr>
-        <w:spacing w:before="80" w:after="40"/>
+        <w:spacing w:before="120" w:after="40"/>
         <w:jc w:val="center"/>
       </w:pPr>
       <w:r>
         <w:rPr>
-          <w:rFonts w:ascii="Segoe UI" w:hAnsi="Segoe UI" w:eastAsia="Segoe UI"/>
+          <w:rFonts w:ascii="Times New Roman" w:hAnsi="Times New Roman" w:eastAsia="Times New Roman"/>
           <w:b/>
           <w:i w:val="0"/>
-          <w:color w:val="111111"/>
+          <w:color w:val="000000"/>
           <w:sz w:val="32"/>
         </w:rPr>
         <w:t>PHIẾU ĐẶT HÀNG</w:t>
@@ -187,10 +187,10 @@
             </w:pPr>
             <w:r>
               <w:rPr>
-                <w:rFonts w:ascii="Segoe UI" w:hAnsi="Segoe UI" w:eastAsia="Segoe UI"/>
+                <w:rFonts w:ascii="Times New Roman" w:hAnsi="Times New Roman" w:eastAsia="Times New Roman"/>
                 <w:b w:val="0"/>
                 <w:i/>
-                <w:color w:val="505050"/>
+                <w:color w:val="3C3C3C"/>
                 <w:sz w:val="19"/>
               </w:rPr>
               <w:t>{NgayLap}</w:t>
@@ -201,7 +201,7 @@
           <w:tcPr>
             <w:tcW w:type="dxa" w:w="3685"/>
             <w:vAlign w:val="center"/>
-            <w:shd w:fill="F4EFE5"/>
+            <w:shd w:fill="F4EFE4"/>
             <w:tcMar>
               <w:top w:w="40" w:type="dxa"/>
               <w:start w:w="80" w:type="dxa"/>
@@ -216,10 +216,10 @@
             </w:pPr>
             <w:r>
               <w:rPr>
-                <w:rFonts w:ascii="Segoe UI" w:hAnsi="Segoe UI" w:eastAsia="Segoe UI"/>
+                <w:rFonts w:ascii="Times New Roman" w:hAnsi="Times New Roman" w:eastAsia="Times New Roman"/>
                 <w:b/>
                 <w:i w:val="0"/>
-                <w:color w:val="111111"/>
+                <w:color w:val="000000"/>
                 <w:sz w:val="19"/>
               </w:rPr>
               <w:t>Số: {SoPhieu}</w:t>
@@ -240,12 +240,12 @@
         <w:tblLayout w:type="fixed"/>
         <w:tblLook w:firstColumn="1" w:firstRow="1" w:lastColumn="0" w:lastRow="0" w:noHBand="0" w:noVBand="1" w:val="04A0"/>
         <w:tblBorders>
-          <w:top w:val="single" w:sz="4" w:space="0" w:color="E5E5E5"/>
-          <w:left w:val="single" w:sz="4" w:space="0" w:color="E5E5E5"/>
-          <w:bottom w:val="single" w:sz="4" w:space="0" w:color="E5E5E5"/>
-          <w:right w:val="single" w:sz="4" w:space="0" w:color="E5E5E5"/>
-          <w:insideH w:val="single" w:sz="4" w:space="0" w:color="E5E5E5"/>
-          <w:insideV w:val="single" w:sz="4" w:space="0" w:color="E5E5E5"/>
+          <w:top w:val="single" w:sz="4" w:space="0" w:color="E0E0E0"/>
+          <w:left w:val="single" w:sz="4" w:space="0" w:color="E0E0E0"/>
+          <w:bottom w:val="single" w:sz="4" w:space="0" w:color="E0E0E0"/>
+          <w:right w:val="single" w:sz="4" w:space="0" w:color="E0E0E0"/>
+          <w:insideH w:val="single" w:sz="4" w:space="0" w:color="E0E0E0"/>
+          <w:insideV w:val="single" w:sz="4" w:space="0" w:color="E0E0E0"/>
         </w:tblBorders>
       </w:tblPr>
       <w:tblGrid>
@@ -256,36 +256,31 @@
         <w:tc>
           <w:tcPr>
             <w:tcW w:type="dxa" w:w="6803"/>
-            <w:vAlign w:val="center"/>
             <w:tcMar>
               <w:top w:w="40" w:type="dxa"/>
               <w:start w:w="80" w:type="dxa"/>
               <w:bottom w:w="40" w:type="dxa"/>
               <w:end w:w="80" w:type="dxa"/>
             </w:tcMar>
-            <w:shd w:fill="F8F8F6"/>
+            <w:shd w:fill="F7F7F5"/>
           </w:tcPr>
           <w:p>
-            <w:pPr>
-              <w:spacing w:before="0" w:after="0" w:line="276" w:lineRule="auto"/>
-              <w:jc w:val="left"/>
-            </w:pPr>
             <w:r>
               <w:rPr>
-                <w:rFonts w:ascii="Segoe UI" w:hAnsi="Segoe UI" w:eastAsia="Segoe UI"/>
-                <w:b/>
+                <w:rFonts w:ascii="Times New Roman" w:hAnsi="Times New Roman" w:eastAsia="Times New Roman"/>
+                <w:b w:val="0"/>
                 <w:i w:val="0"/>
-                <w:color w:val="646464"/>
+                <w:color w:val="5A5A5A"/>
                 <w:sz w:val="17"/>
               </w:rPr>
               <w:t xml:space="preserve">KHÁCH HÀNG  </w:t>
             </w:r>
             <w:r>
               <w:rPr>
-                <w:rFonts w:ascii="Segoe UI" w:hAnsi="Segoe UI" w:eastAsia="Segoe UI"/>
-                <w:b/>
+                <w:rFonts w:ascii="Times New Roman" w:hAnsi="Times New Roman" w:eastAsia="Times New Roman"/>
+                <w:b w:val="0"/>
                 <w:i w:val="0"/>
-                <w:color w:val="111111"/>
+                <w:color w:val="000000"/>
                 <w:sz w:val="18"/>
               </w:rPr>
               <w:t>{TenKhachHang}</w:t>
@@ -295,36 +290,31 @@
         <w:tc>
           <w:tcPr>
             <w:tcW w:type="dxa" w:w="3968"/>
-            <w:vAlign w:val="center"/>
             <w:tcMar>
               <w:top w:w="40" w:type="dxa"/>
               <w:start w:w="80" w:type="dxa"/>
               <w:bottom w:w="40" w:type="dxa"/>
               <w:end w:w="80" w:type="dxa"/>
             </w:tcMar>
-            <w:shd w:fill="F8F8F6"/>
+            <w:shd w:fill="F7F7F5"/>
           </w:tcPr>
           <w:p>
-            <w:pPr>
-              <w:spacing w:before="0" w:after="0" w:line="276" w:lineRule="auto"/>
-              <w:jc w:val="left"/>
-            </w:pPr>
             <w:r>
               <w:rPr>
-                <w:rFonts w:ascii="Segoe UI" w:hAnsi="Segoe UI" w:eastAsia="Segoe UI"/>
-                <w:b/>
+                <w:rFonts w:ascii="Times New Roman" w:hAnsi="Times New Roman" w:eastAsia="Times New Roman"/>
+                <w:b w:val="0"/>
                 <w:i w:val="0"/>
-                <w:color w:val="646464"/>
+                <w:color w:val="5A5A5A"/>
                 <w:sz w:val="17"/>
               </w:rPr>
               <w:t xml:space="preserve">MÃ KHÁCH HÀNG  </w:t>
             </w:r>
             <w:r>
               <w:rPr>
-                <w:rFonts w:ascii="Segoe UI" w:hAnsi="Segoe UI" w:eastAsia="Segoe UI"/>
-                <w:b/>
+                <w:rFonts w:ascii="Times New Roman" w:hAnsi="Times New Roman" w:eastAsia="Times New Roman"/>
+                <w:b w:val="0"/>
                 <w:i w:val="0"/>
-                <w:color w:val="111111"/>
+                <w:color w:val="000000"/>
                 <w:sz w:val="18"/>
               </w:rPr>
               <w:t>{MaKH}</w:t>
@@ -336,36 +326,31 @@
         <w:tc>
           <w:tcPr>
             <w:tcW w:type="dxa" w:w="6803"/>
-            <w:vAlign w:val="center"/>
             <w:tcMar>
               <w:top w:w="40" w:type="dxa"/>
               <w:start w:w="80" w:type="dxa"/>
               <w:bottom w:w="40" w:type="dxa"/>
               <w:end w:w="80" w:type="dxa"/>
             </w:tcMar>
-            <w:shd w:fill="F8F8F6"/>
+            <w:shd w:fill="F7F7F5"/>
           </w:tcPr>
           <w:p>
-            <w:pPr>
-              <w:spacing w:before="0" w:after="0" w:line="276" w:lineRule="auto"/>
-              <w:jc w:val="left"/>
-            </w:pPr>
             <w:r>
               <w:rPr>
-                <w:rFonts w:ascii="Segoe UI" w:hAnsi="Segoe UI" w:eastAsia="Segoe UI"/>
-                <w:b/>
+                <w:rFonts w:ascii="Times New Roman" w:hAnsi="Times New Roman" w:eastAsia="Times New Roman"/>
+                <w:b w:val="0"/>
                 <w:i w:val="0"/>
-                <w:color w:val="646464"/>
+                <w:color w:val="5A5A5A"/>
                 <w:sz w:val="17"/>
               </w:rPr>
               <w:t xml:space="preserve">ĐỊA CHỈ  </w:t>
             </w:r>
             <w:r>
               <w:rPr>
-                <w:rFonts w:ascii="Segoe UI" w:hAnsi="Segoe UI" w:eastAsia="Segoe UI"/>
-                <w:b/>
+                <w:rFonts w:ascii="Times New Roman" w:hAnsi="Times New Roman" w:eastAsia="Times New Roman"/>
+                <w:b w:val="0"/>
                 <w:i w:val="0"/>
-                <w:color w:val="111111"/>
+                <w:color w:val="000000"/>
                 <w:sz w:val="18"/>
               </w:rPr>
               <w:t>{DiaChi}</w:t>
@@ -375,36 +360,31 @@
         <w:tc>
           <w:tcPr>
             <w:tcW w:type="dxa" w:w="3968"/>
-            <w:vAlign w:val="center"/>
             <w:tcMar>
               <w:top w:w="40" w:type="dxa"/>
               <w:start w:w="80" w:type="dxa"/>
               <w:bottom w:w="40" w:type="dxa"/>
               <w:end w:w="80" w:type="dxa"/>
             </w:tcMar>
-            <w:shd w:fill="F8F8F6"/>
+            <w:shd w:fill="F7F7F5"/>
           </w:tcPr>
           <w:p>
-            <w:pPr>
-              <w:spacing w:before="0" w:after="0" w:line="276" w:lineRule="auto"/>
-              <w:jc w:val="left"/>
-            </w:pPr>
             <w:r>
               <w:rPr>
-                <w:rFonts w:ascii="Segoe UI" w:hAnsi="Segoe UI" w:eastAsia="Segoe UI"/>
-                <w:b/>
+                <w:rFonts w:ascii="Times New Roman" w:hAnsi="Times New Roman" w:eastAsia="Times New Roman"/>
+                <w:b w:val="0"/>
                 <w:i w:val="0"/>
-                <w:color w:val="646464"/>
+                <w:color w:val="5A5A5A"/>
                 <w:sz w:val="17"/>
               </w:rPr>
               <w:t xml:space="preserve">SỐ ĐIỆN THOẠI  </w:t>
             </w:r>
             <w:r>
               <w:rPr>
-                <w:rFonts w:ascii="Segoe UI" w:hAnsi="Segoe UI" w:eastAsia="Segoe UI"/>
-                <w:b/>
+                <w:rFonts w:ascii="Times New Roman" w:hAnsi="Times New Roman" w:eastAsia="Times New Roman"/>
+                <w:b w:val="0"/>
                 <w:i w:val="0"/>
-                <w:color w:val="111111"/>
+                <w:color w:val="000000"/>
                 <w:sz w:val="18"/>
               </w:rPr>
               <w:t>{SDT}</w:t>
@@ -415,56 +395,38 @@
       <w:tr>
         <w:tc>
           <w:tcPr>
-            <w:tcW w:type="dxa" w:w="6803"/>
-            <w:vAlign w:val="center"/>
+            <w:tcW w:type="dxa" w:w="10771"/>
+            <w:gridSpan w:val="2"/>
             <w:tcMar>
               <w:top w:w="40" w:type="dxa"/>
               <w:start w:w="80" w:type="dxa"/>
               <w:bottom w:w="40" w:type="dxa"/>
               <w:end w:w="80" w:type="dxa"/>
             </w:tcMar>
-            <w:shd w:fill="FAF7F0"/>
+            <w:shd w:fill="FAF6EE"/>
           </w:tcPr>
           <w:p>
-            <w:pPr>
-              <w:spacing w:before="0" w:after="0" w:line="276" w:lineRule="auto"/>
-              <w:jc w:val="left"/>
-            </w:pPr>
             <w:r>
               <w:rPr>
-                <w:rFonts w:ascii="Segoe UI" w:hAnsi="Segoe UI" w:eastAsia="Segoe UI"/>
-                <w:b/>
+                <w:rFonts w:ascii="Times New Roman" w:hAnsi="Times New Roman" w:eastAsia="Times New Roman"/>
+                <w:b w:val="0"/>
                 <w:i w:val="0"/>
-                <w:color w:val="646464"/>
+                <w:color w:val="5A5A5A"/>
                 <w:sz w:val="17"/>
               </w:rPr>
               <w:t xml:space="preserve">DIỄN GIẢI  </w:t>
             </w:r>
             <w:r>
               <w:rPr>
-                <w:rFonts w:ascii="Segoe UI" w:hAnsi="Segoe UI" w:eastAsia="Segoe UI"/>
+                <w:rFonts w:ascii="Times New Roman" w:hAnsi="Times New Roman" w:eastAsia="Times New Roman"/>
                 <w:b w:val="0"/>
                 <w:i w:val="0"/>
-                <w:color w:val="111111"/>
+                <w:color w:val="000000"/>
                 <w:sz w:val="18"/>
               </w:rPr>
               <w:t>{DienGiai}</w:t>
             </w:r>
           </w:p>
-        </w:tc>
-        <w:tc>
-          <w:tcPr>
-            <w:tcW w:type="dxa" w:w="3968"/>
-            <w:vAlign w:val="center"/>
-            <w:tcMar>
-              <w:top w:w="40" w:type="dxa"/>
-              <w:start w:w="80" w:type="dxa"/>
-              <w:bottom w:w="40" w:type="dxa"/>
-              <w:end w:w="80" w:type="dxa"/>
-            </w:tcMar>
-            <w:shd w:fill="FAF7F0"/>
-          </w:tcPr>
-          <w:p/>
         </w:tc>
       </w:tr>
     </w:tbl>
@@ -480,12 +442,12 @@
         <w:tblLayout w:type="fixed"/>
         <w:tblLook w:firstColumn="1" w:firstRow="1" w:lastColumn="0" w:lastRow="0" w:noHBand="0" w:noVBand="1" w:val="04A0"/>
         <w:tblBorders>
-          <w:top w:val="single" w:sz="6" w:space="0" w:color="D0D0D0"/>
-          <w:left w:val="single" w:sz="6" w:space="0" w:color="D0D0D0"/>
-          <w:bottom w:val="single" w:sz="6" w:space="0" w:color="D0D0D0"/>
-          <w:right w:val="single" w:sz="6" w:space="0" w:color="D0D0D0"/>
-          <w:insideH w:val="single" w:sz="6" w:space="0" w:color="D0D0D0"/>
-          <w:insideV w:val="single" w:sz="6" w:space="0" w:color="D0D0D0"/>
+          <w:top w:val="single" w:sz="6" w:space="0" w:color="B0B0B0"/>
+          <w:left w:val="single" w:sz="6" w:space="0" w:color="B0B0B0"/>
+          <w:bottom w:val="single" w:sz="6" w:space="0" w:color="B0B0B0"/>
+          <w:right w:val="single" w:sz="6" w:space="0" w:color="B0B0B0"/>
+          <w:insideH w:val="single" w:sz="6" w:space="0" w:color="B0B0B0"/>
+          <w:insideV w:val="single" w:sz="6" w:space="0" w:color="B0B0B0"/>
         </w:tblBorders>
       </w:tblPr>
       <w:tblGrid>
@@ -498,7 +460,7 @@
       <w:tr>
         <w:tc>
           <w:tcPr>
-            <w:tcW w:type="dxa" w:w="566"/>
+            <w:tcW w:type="dxa" w:w="510"/>
             <w:vAlign w:val="center"/>
             <w:shd w:fill="FFFFFF"/>
             <w:tcMar>
@@ -515,10 +477,10 @@
             </w:pPr>
             <w:r>
               <w:rPr>
-                <w:rFonts w:ascii="Segoe UI" w:hAnsi="Segoe UI" w:eastAsia="Segoe UI"/>
+                <w:rFonts w:ascii="Times New Roman" w:hAnsi="Times New Roman" w:eastAsia="Times New Roman"/>
                 <w:b/>
                 <w:i w:val="0"/>
-                <w:color w:val="111111"/>
+                <w:color w:val="000000"/>
                 <w:sz w:val="18"/>
               </w:rPr>
               <w:t>STT</w:t>
@@ -527,7 +489,7 @@
         </w:tc>
         <w:tc>
           <w:tcPr>
-            <w:tcW w:type="dxa" w:w="3118"/>
+            <w:tcW w:type="dxa" w:w="3288"/>
             <w:vAlign w:val="center"/>
             <w:shd w:fill="FFFFFF"/>
             <w:tcMar>
@@ -544,10 +506,10 @@
             </w:pPr>
             <w:r>
               <w:rPr>
-                <w:rFonts w:ascii="Segoe UI" w:hAnsi="Segoe UI" w:eastAsia="Segoe UI"/>
+                <w:rFonts w:ascii="Times New Roman" w:hAnsi="Times New Roman" w:eastAsia="Times New Roman"/>
                 <w:b/>
                 <w:i w:val="0"/>
-                <w:color w:val="111111"/>
+                <w:color w:val="000000"/>
                 <w:sz w:val="18"/>
               </w:rPr>
               <w:t>SẢN PHẨM</w:t>
@@ -556,7 +518,7 @@
         </w:tc>
         <w:tc>
           <w:tcPr>
-            <w:tcW w:type="dxa" w:w="3741"/>
+            <w:tcW w:type="dxa" w:w="3685"/>
             <w:vAlign w:val="center"/>
             <w:shd w:fill="FFFFFF"/>
             <w:tcMar>
@@ -573,10 +535,10 @@
             </w:pPr>
             <w:r>
               <w:rPr>
-                <w:rFonts w:ascii="Segoe UI" w:hAnsi="Segoe UI" w:eastAsia="Segoe UI"/>
+                <w:rFonts w:ascii="Times New Roman" w:hAnsi="Times New Roman" w:eastAsia="Times New Roman"/>
                 <w:b/>
                 <w:i w:val="0"/>
-                <w:color w:val="111111"/>
+                <w:color w:val="000000"/>
                 <w:sz w:val="18"/>
               </w:rPr>
               <w:t>SIZE × SỐ LƯỢNG</w:t>
@@ -602,10 +564,10 @@
             </w:pPr>
             <w:r>
               <w:rPr>
-                <w:rFonts w:ascii="Segoe UI" w:hAnsi="Segoe UI" w:eastAsia="Segoe UI"/>
+                <w:rFonts w:ascii="Times New Roman" w:hAnsi="Times New Roman" w:eastAsia="Times New Roman"/>
                 <w:b/>
                 <w:i w:val="0"/>
-                <w:color w:val="111111"/>
+                <w:color w:val="000000"/>
                 <w:sz w:val="18"/>
               </w:rPr>
               <w:t>TỔNG</w:t>
@@ -614,7 +576,7 @@
         </w:tc>
         <w:tc>
           <w:tcPr>
-            <w:tcW w:type="dxa" w:w="2324"/>
+            <w:tcW w:type="dxa" w:w="2267"/>
             <w:vAlign w:val="center"/>
             <w:shd w:fill="FFFFFF"/>
             <w:tcMar>
@@ -631,10 +593,10 @@
             </w:pPr>
             <w:r>
               <w:rPr>
-                <w:rFonts w:ascii="Segoe UI" w:hAnsi="Segoe UI" w:eastAsia="Segoe UI"/>
+                <w:rFonts w:ascii="Times New Roman" w:hAnsi="Times New Roman" w:eastAsia="Times New Roman"/>
                 <w:b/>
                 <w:i w:val="0"/>
-                <w:color w:val="111111"/>
+                <w:color w:val="000000"/>
                 <w:sz w:val="18"/>
               </w:rPr>
               <w:t>THÀNH TIỀN</w:t>
@@ -645,7 +607,7 @@
       <w:tr>
         <w:tc>
           <w:tcPr>
-            <w:tcW w:type="dxa" w:w="566"/>
+            <w:tcW w:type="dxa" w:w="510"/>
             <w:vAlign w:val="center"/>
             <w:tcMar>
               <w:top w:w="60" w:type="dxa"/>
@@ -661,10 +623,10 @@
             </w:pPr>
             <w:r>
               <w:rPr>
-                <w:rFonts w:ascii="Segoe UI" w:hAnsi="Segoe UI" w:eastAsia="Segoe UI"/>
+                <w:rFonts w:ascii="Times New Roman" w:hAnsi="Times New Roman" w:eastAsia="Times New Roman"/>
                 <w:b/>
                 <w:i w:val="0"/>
-                <w:color w:val="111111"/>
+                <w:color w:val="000000"/>
                 <w:sz w:val="18"/>
               </w:rPr>
               <w:t>{#ChiTietDonHang}{STT}</w:t>
@@ -673,7 +635,7 @@
         </w:tc>
         <w:tc>
           <w:tcPr>
-            <w:tcW w:type="dxa" w:w="3118"/>
+            <w:tcW w:type="dxa" w:w="3288"/>
             <w:vAlign w:val="center"/>
             <w:tcMar>
               <w:top w:w="60" w:type="dxa"/>
@@ -688,7 +650,7 @@
             </w:pPr>
             <w:r>
               <w:rPr>
-                <w:rFonts w:ascii="Segoe UI" w:hAnsi="Segoe UI" w:eastAsia="Segoe UI"/>
+                <w:rFonts w:ascii="Times New Roman" w:hAnsi="Times New Roman" w:eastAsia="Times New Roman"/>
                 <w:b/>
                 <w:i w:val="0"/>
                 <w:color w:val="9C6B30"/>
@@ -699,10 +661,10 @@
             </w:r>
             <w:r>
               <w:rPr>
-                <w:rFonts w:ascii="Segoe UI" w:hAnsi="Segoe UI" w:eastAsia="Segoe UI"/>
+                <w:rFonts w:ascii="Times New Roman" w:hAnsi="Times New Roman" w:eastAsia="Times New Roman"/>
                 <w:b w:val="0"/>
                 <w:i w:val="0"/>
-                <w:color w:val="3C3C3C"/>
+                <w:color w:val="323232"/>
                 <w:sz w:val="17"/>
               </w:rPr>
               <w:t>{ten_hang_goc}</w:t>
@@ -710,10 +672,10 @@
             </w:r>
             <w:r>
               <w:rPr>
-                <w:rFonts w:ascii="Segoe UI" w:hAnsi="Segoe UI" w:eastAsia="Segoe UI"/>
+                <w:rFonts w:ascii="Times New Roman" w:hAnsi="Times New Roman" w:eastAsia="Times New Roman"/>
                 <w:b w:val="0"/>
                 <w:i w:val="0"/>
-                <w:color w:val="787878"/>
+                <w:color w:val="646464"/>
                 <w:sz w:val="17"/>
               </w:rPr>
               <w:t>Màu: {mau}</w:t>
@@ -722,7 +684,7 @@
         </w:tc>
         <w:tc>
           <w:tcPr>
-            <w:tcW w:type="dxa" w:w="3741"/>
+            <w:tcW w:type="dxa" w:w="3685"/>
             <w:vAlign w:val="center"/>
             <w:tcMar>
               <w:top w:w="60" w:type="dxa"/>
@@ -738,10 +700,10 @@
             </w:pPr>
             <w:r>
               <w:rPr>
-                <w:rFonts w:ascii="Segoe UI" w:hAnsi="Segoe UI" w:eastAsia="Segoe UI"/>
+                <w:rFonts w:ascii="Times New Roman" w:hAnsi="Times New Roman" w:eastAsia="Times New Roman"/>
                 <w:b w:val="0"/>
                 <w:i w:val="0"/>
-                <w:color w:val="111111"/>
+                <w:color w:val="000000"/>
                 <w:sz w:val="18"/>
               </w:rPr>
               <w:t>{size_qty_text}</w:t>
@@ -766,10 +728,10 @@
             </w:pPr>
             <w:r>
               <w:rPr>
-                <w:rFonts w:ascii="Segoe UI" w:hAnsi="Segoe UI" w:eastAsia="Segoe UI"/>
+                <w:rFonts w:ascii="Times New Roman" w:hAnsi="Times New Roman" w:eastAsia="Times New Roman"/>
                 <w:b/>
                 <w:i w:val="0"/>
-                <w:color w:val="111111"/>
+                <w:color w:val="000000"/>
                 <w:sz w:val="19"/>
               </w:rPr>
               <w:t>{SoLuong}</w:t>
@@ -778,7 +740,7 @@
         </w:tc>
         <w:tc>
           <w:tcPr>
-            <w:tcW w:type="dxa" w:w="2324"/>
+            <w:tcW w:type="dxa" w:w="2267"/>
             <w:vAlign w:val="center"/>
             <w:tcMar>
               <w:top w:w="60" w:type="dxa"/>
@@ -794,10 +756,10 @@
             </w:pPr>
             <w:r>
               <w:rPr>
-                <w:rFonts w:ascii="Segoe UI" w:hAnsi="Segoe UI" w:eastAsia="Segoe UI"/>
+                <w:rFonts w:ascii="Times New Roman" w:hAnsi="Times New Roman" w:eastAsia="Times New Roman"/>
                 <w:b/>
                 <w:i w:val="0"/>
-                <w:color w:val="111111"/>
+                <w:color w:val="000000"/>
                 <w:sz w:val="19"/>
               </w:rPr>
               <w:t>{ThanhTien} đ{/ChiTietDonHang}</w:t>
@@ -844,20 +806,20 @@
             </w:pPr>
             <w:r>
               <w:rPr>
-                <w:rFonts w:ascii="Segoe UI" w:hAnsi="Segoe UI" w:eastAsia="Segoe UI"/>
+                <w:rFonts w:ascii="Times New Roman" w:hAnsi="Times New Roman" w:eastAsia="Times New Roman"/>
                 <w:b/>
                 <w:i w:val="0"/>
-                <w:color w:val="323232"/>
+                <w:color w:val="282828"/>
                 <w:sz w:val="18"/>
               </w:rPr>
               <w:t xml:space="preserve">Tổng theo size: </w:t>
             </w:r>
             <w:r>
               <w:rPr>
-                <w:rFonts w:ascii="Segoe UI" w:hAnsi="Segoe UI" w:eastAsia="Segoe UI"/>
+                <w:rFonts w:ascii="Times New Roman" w:hAnsi="Times New Roman" w:eastAsia="Times New Roman"/>
                 <w:b w:val="0"/>
                 <w:i w:val="0"/>
-                <w:color w:val="1E1E1E"/>
+                <w:color w:val="141414"/>
                 <w:sz w:val="18"/>
               </w:rPr>
               <w:t>{tong_theo_size}</w:t>
@@ -904,20 +866,20 @@
           <w:p>
             <w:r>
               <w:rPr>
-                <w:rFonts w:ascii="Segoe UI" w:hAnsi="Segoe UI" w:eastAsia="Segoe UI"/>
+                <w:rFonts w:ascii="Times New Roman" w:hAnsi="Times New Roman" w:eastAsia="Times New Roman"/>
                 <w:b/>
                 <w:i w:val="0"/>
-                <w:color w:val="111111"/>
+                <w:color w:val="000000"/>
                 <w:sz w:val="19"/>
               </w:rPr>
               <w:t xml:space="preserve">Tổng số lượng: </w:t>
             </w:r>
             <w:r>
               <w:rPr>
-                <w:rFonts w:ascii="Segoe UI" w:hAnsi="Segoe UI" w:eastAsia="Segoe UI"/>
+                <w:rFonts w:ascii="Times New Roman" w:hAnsi="Times New Roman" w:eastAsia="Times New Roman"/>
                 <w:b/>
                 <w:i w:val="0"/>
-                <w:color w:val="111111"/>
+                <w:color w:val="000000"/>
                 <w:sz w:val="19"/>
               </w:rPr>
               <w:t>{TongSoLuong} sản phẩm</w:t>
@@ -940,7 +902,7 @@
             </w:pPr>
             <w:r>
               <w:rPr>
-                <w:rFonts w:ascii="Segoe UI" w:hAnsi="Segoe UI" w:eastAsia="Segoe UI"/>
+                <w:rFonts w:ascii="Times New Roman" w:hAnsi="Times New Roman" w:eastAsia="Times New Roman"/>
                 <w:b/>
                 <w:i w:val="0"/>
                 <w:color w:val="505050"/>
@@ -950,10 +912,10 @@
             </w:r>
             <w:r>
               <w:rPr>
-                <w:rFonts w:ascii="Segoe UI" w:hAnsi="Segoe UI" w:eastAsia="Segoe UI"/>
+                <w:rFonts w:ascii="Times New Roman" w:hAnsi="Times New Roman" w:eastAsia="Times New Roman"/>
                 <w:b/>
                 <w:i w:val="0"/>
-                <w:color w:val="111111"/>
+                <w:color w:val="000000"/>
                 <w:sz w:val="19"/>
               </w:rPr>
               <w:t>{TongTienHang} đ</w:t>
@@ -975,7 +937,7 @@
           <w:p>
             <w:r>
               <w:rPr>
-                <w:rFonts w:ascii="Segoe UI" w:hAnsi="Segoe UI" w:eastAsia="Segoe UI"/>
+                <w:rFonts w:ascii="Times New Roman" w:hAnsi="Times New Roman" w:eastAsia="Times New Roman"/>
                 <w:b w:val="0"/>
                 <w:i/>
                 <w:color w:val="505050"/>
@@ -985,7 +947,7 @@
             </w:r>
             <w:r>
               <w:rPr>
-                <w:rFonts w:ascii="Segoe UI" w:hAnsi="Segoe UI" w:eastAsia="Segoe UI"/>
+                <w:rFonts w:ascii="Times New Roman" w:hAnsi="Times New Roman" w:eastAsia="Times New Roman"/>
                 <w:b w:val="0"/>
                 <w:i/>
                 <w:color w:val="505050"/>
@@ -1011,7 +973,7 @@
             </w:pPr>
             <w:r>
               <w:rPr>
-                <w:rFonts w:ascii="Segoe UI" w:hAnsi="Segoe UI" w:eastAsia="Segoe UI"/>
+                <w:rFonts w:ascii="Times New Roman" w:hAnsi="Times New Roman" w:eastAsia="Times New Roman"/>
                 <w:b w:val="0"/>
                 <w:i w:val="0"/>
                 <w:color w:val="505050"/>
@@ -1021,10 +983,10 @@
             </w:r>
             <w:r>
               <w:rPr>
-                <w:rFonts w:ascii="Segoe UI" w:hAnsi="Segoe UI" w:eastAsia="Segoe UI"/>
+                <w:rFonts w:ascii="Times New Roman" w:hAnsi="Times New Roman" w:eastAsia="Times New Roman"/>
                 <w:b/>
                 <w:i w:val="0"/>
-                <w:color w:val="111111"/>
+                <w:color w:val="000000"/>
                 <w:sz w:val="18"/>
               </w:rPr>
               <w:t>{TienChietKhau} đ</w:t>
@@ -1061,7 +1023,7 @@
             </w:pPr>
             <w:r>
               <w:rPr>
-                <w:rFonts w:ascii="Segoe UI" w:hAnsi="Segoe UI" w:eastAsia="Segoe UI"/>
+                <w:rFonts w:ascii="Times New Roman" w:hAnsi="Times New Roman" w:eastAsia="Times New Roman"/>
                 <w:b w:val="0"/>
                 <w:i w:val="0"/>
                 <w:color w:val="505050"/>
@@ -1071,10 +1033,10 @@
             </w:r>
             <w:r>
               <w:rPr>
-                <w:rFonts w:ascii="Segoe UI" w:hAnsi="Segoe UI" w:eastAsia="Segoe UI"/>
+                <w:rFonts w:ascii="Times New Roman" w:hAnsi="Times New Roman" w:eastAsia="Times New Roman"/>
                 <w:b/>
                 <w:i w:val="0"/>
-                <w:color w:val="111111"/>
+                <w:color w:val="000000"/>
                 <w:sz w:val="18"/>
               </w:rPr>
               <w:t>{ChietKhauKhac} đ</w:t>
@@ -1111,10 +1073,10 @@
             </w:pPr>
             <w:r>
               <w:rPr>
-                <w:rFonts w:ascii="Segoe UI" w:hAnsi="Segoe UI" w:eastAsia="Segoe UI"/>
+                <w:rFonts w:ascii="Times New Roman" w:hAnsi="Times New Roman" w:eastAsia="Times New Roman"/>
                 <w:b/>
                 <w:i w:val="0"/>
-                <w:color w:val="111111"/>
+                <w:color w:val="000000"/>
                 <w:sz w:val="20"/>
               </w:rPr>
               <w:t>TỔNG THANH TOÁN:</w:t>
@@ -1122,7 +1084,7 @@
             </w:r>
             <w:r>
               <w:rPr>
-                <w:rFonts w:ascii="Segoe UI" w:hAnsi="Segoe UI" w:eastAsia="Segoe UI"/>
+                <w:rFonts w:ascii="Times New Roman" w:hAnsi="Times New Roman" w:eastAsia="Times New Roman"/>
                 <w:b/>
                 <w:i w:val="0"/>
                 <w:color w:val="9C6B30"/>
@@ -1174,10 +1136,10 @@
             </w:pPr>
             <w:r>
               <w:rPr>
-                <w:rFonts w:ascii="Segoe UI" w:hAnsi="Segoe UI" w:eastAsia="Segoe UI"/>
+                <w:rFonts w:ascii="Times New Roman" w:hAnsi="Times New Roman" w:eastAsia="Times New Roman"/>
                 <w:b/>
                 <w:i w:val="0"/>
-                <w:color w:val="111111"/>
+                <w:color w:val="000000"/>
                 <w:sz w:val="19"/>
               </w:rPr>
               <w:t>Người nhận</w:t>
@@ -1196,10 +1158,10 @@
             </w:pPr>
             <w:r>
               <w:rPr>
-                <w:rFonts w:ascii="Segoe UI" w:hAnsi="Segoe UI" w:eastAsia="Segoe UI"/>
+                <w:rFonts w:ascii="Times New Roman" w:hAnsi="Times New Roman" w:eastAsia="Times New Roman"/>
                 <w:b/>
                 <w:i w:val="0"/>
-                <w:color w:val="111111"/>
+                <w:color w:val="000000"/>
                 <w:sz w:val="19"/>
               </w:rPr>
               <w:t>Người giao</w:t>
@@ -1218,10 +1180,10 @@
             </w:pPr>
             <w:r>
               <w:rPr>
-                <w:rFonts w:ascii="Segoe UI" w:hAnsi="Segoe UI" w:eastAsia="Segoe UI"/>
+                <w:rFonts w:ascii="Times New Roman" w:hAnsi="Times New Roman" w:eastAsia="Times New Roman"/>
                 <w:b/>
                 <w:i w:val="0"/>
-                <w:color w:val="111111"/>
+                <w:color w:val="000000"/>
                 <w:sz w:val="19"/>
               </w:rPr>
               <w:t>Thủ kho</w:t>
@@ -1240,10 +1202,10 @@
             </w:pPr>
             <w:r>
               <w:rPr>
-                <w:rFonts w:ascii="Segoe UI" w:hAnsi="Segoe UI" w:eastAsia="Segoe UI"/>
+                <w:rFonts w:ascii="Times New Roman" w:hAnsi="Times New Roman" w:eastAsia="Times New Roman"/>
                 <w:b/>
                 <w:i w:val="0"/>
-                <w:color w:val="111111"/>
+                <w:color w:val="000000"/>
                 <w:sz w:val="19"/>
               </w:rPr>
               <w:t>Kế toán</w:t>
@@ -1262,10 +1224,10 @@
             </w:pPr>
             <w:r>
               <w:rPr>
-                <w:rFonts w:ascii="Segoe UI" w:hAnsi="Segoe UI" w:eastAsia="Segoe UI"/>
+                <w:rFonts w:ascii="Times New Roman" w:hAnsi="Times New Roman" w:eastAsia="Times New Roman"/>
                 <w:b/>
                 <w:i w:val="0"/>
-                <w:color w:val="111111"/>
+                <w:color w:val="000000"/>
                 <w:sz w:val="19"/>
               </w:rPr>
               <w:t>Thủ trưởng</w:t>
@@ -1286,7 +1248,7 @@
             </w:pPr>
             <w:r>
               <w:rPr>
-                <w:rFonts w:ascii="Segoe UI" w:hAnsi="Segoe UI" w:eastAsia="Segoe UI"/>
+                <w:rFonts w:ascii="Times New Roman" w:hAnsi="Times New Roman" w:eastAsia="Times New Roman"/>
                 <w:b w:val="0"/>
                 <w:i/>
                 <w:color w:val="787878"/>
@@ -1308,7 +1270,7 @@
             </w:pPr>
             <w:r>
               <w:rPr>
-                <w:rFonts w:ascii="Segoe UI" w:hAnsi="Segoe UI" w:eastAsia="Segoe UI"/>
+                <w:rFonts w:ascii="Times New Roman" w:hAnsi="Times New Roman" w:eastAsia="Times New Roman"/>
                 <w:b w:val="0"/>
                 <w:i/>
                 <w:color w:val="787878"/>
@@ -1330,7 +1292,7 @@
             </w:pPr>
             <w:r>
               <w:rPr>
-                <w:rFonts w:ascii="Segoe UI" w:hAnsi="Segoe UI" w:eastAsia="Segoe UI"/>
+                <w:rFonts w:ascii="Times New Roman" w:hAnsi="Times New Roman" w:eastAsia="Times New Roman"/>
                 <w:b w:val="0"/>
                 <w:i/>
                 <w:color w:val="787878"/>
@@ -1352,7 +1314,7 @@
             </w:pPr>
             <w:r>
               <w:rPr>
-                <w:rFonts w:ascii="Segoe UI" w:hAnsi="Segoe UI" w:eastAsia="Segoe UI"/>
+                <w:rFonts w:ascii="Times New Roman" w:hAnsi="Times New Roman" w:eastAsia="Times New Roman"/>
                 <w:b w:val="0"/>
                 <w:i/>
                 <w:color w:val="787878"/>
@@ -1374,7 +1336,7 @@
             </w:pPr>
             <w:r>
               <w:rPr>
-                <w:rFonts w:ascii="Segoe UI" w:hAnsi="Segoe UI" w:eastAsia="Segoe UI"/>
+                <w:rFonts w:ascii="Times New Roman" w:hAnsi="Times New Roman" w:eastAsia="Times New Roman"/>
                 <w:b w:val="0"/>
                 <w:i/>
                 <w:color w:val="787878"/>
@@ -1398,7 +1360,7 @@
       </w:pPr>
       <w:r>
         <w:rPr>
-          <w:rFonts w:ascii="Segoe UI" w:hAnsi="Segoe UI" w:eastAsia="Segoe UI"/>
+          <w:rFonts w:ascii="Times New Roman" w:hAnsi="Times New Roman" w:eastAsia="Times New Roman"/>
           <w:b w:val="0"/>
           <w:i/>
           <w:color w:val="828282"/>
@@ -1781,7 +1743,7 @@
     <w:qFormat/>
     <w:rsid w:val="00FC693F"/>
     <w:rPr>
-      <w:rFonts w:ascii="Segoe UI" w:hAnsi="Segoe UI" w:eastAsia="Segoe UI"/>
+      <w:rFonts w:ascii="Times New Roman" w:hAnsi="Times New Roman" w:eastAsia="Times New Roman"/>
       <w:sz w:val="19"/>
     </w:rPr>
   </w:style>

</xml_diff>

<commit_message>
feat: add script to generate order docx templates and include initial sample file
</commit_message>
<xml_diff>
--- a/backend-app/samples/In Don dat hang.docx
+++ b/backend-app/samples/In Don dat hang.docx
@@ -29,6 +29,14 @@
       </w:tblGrid>
       <w:tr>
         <w:tblPrEx>
+          <w:tblBorders>
+            <w:top w:val="none" w:color="auto" w:sz="0" w:space="0"/>
+            <w:left w:val="none" w:color="auto" w:sz="0" w:space="0"/>
+            <w:bottom w:val="none" w:color="auto" w:sz="0" w:space="0"/>
+            <w:right w:val="none" w:color="auto" w:sz="0" w:space="0"/>
+            <w:insideH w:val="none" w:color="auto" w:sz="0" w:space="0"/>
+            <w:insideV w:val="none" w:color="auto" w:sz="0" w:space="0"/>
+          </w:tblBorders>
           <w:tblCellMar>
             <w:top w:w="0" w:type="dxa"/>
             <w:left w:w="108" w:type="dxa"/>
@@ -58,8 +66,8 @@
             <w:r>
               <w:drawing>
                 <wp:inline distT="0" distB="0" distL="114300" distR="114300">
-                  <wp:extent cx="1367790" cy="861060"/>
-                  <wp:effectExtent l="0" t="0" r="3810" b="2540"/>
+                  <wp:extent cx="971550" cy="1118235"/>
+                  <wp:effectExtent l="0" t="0" r="6350" b="12065"/>
                   <wp:docPr id="1" name="Picture 1"/>
                   <wp:cNvGraphicFramePr>
                     <a:graphicFrameLocks xmlns:a="http://schemas.openxmlformats.org/drawingml/2006/main" noChangeAspect="1"/>
@@ -82,7 +90,7 @@
                         <pic:spPr>
                           <a:xfrm>
                             <a:off x="0" y="0"/>
-                            <a:ext cx="1368000" cy="861269"/>
+                            <a:ext cx="972000" cy="1118363"/>
                           </a:xfrm>
                           <a:prstGeom prst="rect">
                             <a:avLst/>
@@ -340,7 +348,7 @@
         </w:trPr>
         <w:tc>
           <w:tcPr>
-            <w:tcW w:w="7029" w:type="dxa"/>
+            <w:tcW w:w="5666" w:type="dxa"/>
             <w:shd w:val="clear" w:color="auto" w:fill="F7F7F5"/>
             <w:tcMar>
               <w:top w:w="25" w:type="dxa"/>
@@ -356,17 +364,38 @@
             <w:r>
               <w:rPr>
                 <w:rFonts w:ascii="Segoe UI" w:hAnsi="Segoe UI" w:eastAsia="Segoe UI"/>
-                <w:b w:val="0"/>
+                <w:b/>
                 <w:i w:val="0"/>
                 <w:color w:val="5A5A5A"/>
                 <w:sz w:val="17"/>
               </w:rPr>
-              <w:t xml:space="preserve">KHÁCH HÀNG  </w:t>
+              <w:t>KHÁCH HÀNG</w:t>
+            </w:r>
+            <w:r>
+              <w:rPr>
+                <w:rFonts w:hint="default"/>
+                <w:b/>
+                <w:i w:val="0"/>
+                <w:color w:val="5A5A5A"/>
+                <w:sz w:val="17"/>
+                <w:lang w:val="en-US"/>
+              </w:rPr>
+              <w:t>:</w:t>
             </w:r>
             <w:r>
               <w:rPr>
                 <w:rFonts w:ascii="Segoe UI" w:hAnsi="Segoe UI" w:eastAsia="Segoe UI"/>
-                <w:b w:val="0"/>
+                <w:b/>
+                <w:i w:val="0"/>
+                <w:color w:val="5A5A5A"/>
+                <w:sz w:val="17"/>
+              </w:rPr>
+              <w:t xml:space="preserve">  </w:t>
+            </w:r>
+            <w:r>
+              <w:rPr>
+                <w:rFonts w:ascii="Segoe UI" w:hAnsi="Segoe UI" w:eastAsia="Segoe UI"/>
+                <w:b/>
                 <w:i w:val="0"/>
                 <w:color w:val="111111"/>
                 <w:sz w:val="17"/>
@@ -377,7 +406,7 @@
         </w:tc>
         <w:tc>
           <w:tcPr>
-            <w:tcW w:w="3968" w:type="dxa"/>
+            <w:tcW w:w="5666" w:type="dxa"/>
             <w:shd w:val="clear" w:color="auto" w:fill="F7F7F5"/>
             <w:tcMar>
               <w:top w:w="25" w:type="dxa"/>
@@ -393,17 +422,38 @@
             <w:r>
               <w:rPr>
                 <w:rFonts w:ascii="Segoe UI" w:hAnsi="Segoe UI" w:eastAsia="Segoe UI"/>
-                <w:b w:val="0"/>
+                <w:b/>
                 <w:i w:val="0"/>
                 <w:color w:val="5A5A5A"/>
                 <w:sz w:val="17"/>
               </w:rPr>
-              <w:t xml:space="preserve">MÃ KHÁCH HÀNG  </w:t>
+              <w:t>MÃ KHÁCH HÀNG</w:t>
+            </w:r>
+            <w:r>
+              <w:rPr>
+                <w:rFonts w:hint="default"/>
+                <w:b/>
+                <w:i w:val="0"/>
+                <w:color w:val="5A5A5A"/>
+                <w:sz w:val="17"/>
+                <w:lang w:val="en-US"/>
+              </w:rPr>
+              <w:t>:</w:t>
             </w:r>
             <w:r>
               <w:rPr>
                 <w:rFonts w:ascii="Segoe UI" w:hAnsi="Segoe UI" w:eastAsia="Segoe UI"/>
-                <w:b w:val="0"/>
+                <w:b/>
+                <w:i w:val="0"/>
+                <w:color w:val="5A5A5A"/>
+                <w:sz w:val="17"/>
+              </w:rPr>
+              <w:t xml:space="preserve">  </w:t>
+            </w:r>
+            <w:r>
+              <w:rPr>
+                <w:rFonts w:ascii="Segoe UI" w:hAnsi="Segoe UI" w:eastAsia="Segoe UI"/>
+                <w:b/>
                 <w:i w:val="0"/>
                 <w:color w:val="111111"/>
                 <w:sz w:val="17"/>
@@ -435,7 +485,7 @@
         </w:trPr>
         <w:tc>
           <w:tcPr>
-            <w:tcW w:w="7029" w:type="dxa"/>
+            <w:tcW w:w="5666" w:type="dxa"/>
             <w:shd w:val="clear" w:color="auto" w:fill="F7F7F5"/>
             <w:tcMar>
               <w:top w:w="25" w:type="dxa"/>
@@ -451,12 +501,33 @@
             <w:r>
               <w:rPr>
                 <w:rFonts w:ascii="Segoe UI" w:hAnsi="Segoe UI" w:eastAsia="Segoe UI"/>
-                <w:b w:val="0"/>
+                <w:b/>
                 <w:i w:val="0"/>
                 <w:color w:val="5A5A5A"/>
                 <w:sz w:val="17"/>
               </w:rPr>
-              <w:t xml:space="preserve">ĐỊA CHỈ  </w:t>
+              <w:t>ĐỊA CHỈ</w:t>
+            </w:r>
+            <w:r>
+              <w:rPr>
+                <w:rFonts w:hint="default"/>
+                <w:b/>
+                <w:i w:val="0"/>
+                <w:color w:val="5A5A5A"/>
+                <w:sz w:val="17"/>
+                <w:lang w:val="en-US"/>
+              </w:rPr>
+              <w:t>:</w:t>
+            </w:r>
+            <w:r>
+              <w:rPr>
+                <w:rFonts w:ascii="Segoe UI" w:hAnsi="Segoe UI" w:eastAsia="Segoe UI"/>
+                <w:b/>
+                <w:i w:val="0"/>
+                <w:color w:val="5A5A5A"/>
+                <w:sz w:val="17"/>
+              </w:rPr>
+              <w:t xml:space="preserve">  </w:t>
             </w:r>
             <w:r>
               <w:rPr>
@@ -472,7 +543,7 @@
         </w:tc>
         <w:tc>
           <w:tcPr>
-            <w:tcW w:w="3968" w:type="dxa"/>
+            <w:tcW w:w="5666" w:type="dxa"/>
             <w:shd w:val="clear" w:color="auto" w:fill="F7F7F5"/>
             <w:tcMar>
               <w:top w:w="25" w:type="dxa"/>
@@ -488,17 +559,38 @@
             <w:r>
               <w:rPr>
                 <w:rFonts w:ascii="Segoe UI" w:hAnsi="Segoe UI" w:eastAsia="Segoe UI"/>
-                <w:b w:val="0"/>
+                <w:b/>
                 <w:i w:val="0"/>
                 <w:color w:val="5A5A5A"/>
                 <w:sz w:val="17"/>
               </w:rPr>
-              <w:t xml:space="preserve">SỐ ĐIỆN THOẠI  </w:t>
+              <w:t>SỐ ĐIỆN THOẠI</w:t>
+            </w:r>
+            <w:r>
+              <w:rPr>
+                <w:rFonts w:hint="default"/>
+                <w:b/>
+                <w:i w:val="0"/>
+                <w:color w:val="5A5A5A"/>
+                <w:sz w:val="17"/>
+                <w:lang w:val="en-US"/>
+              </w:rPr>
+              <w:t>:</w:t>
             </w:r>
             <w:r>
               <w:rPr>
                 <w:rFonts w:ascii="Segoe UI" w:hAnsi="Segoe UI" w:eastAsia="Segoe UI"/>
-                <w:b w:val="0"/>
+                <w:b/>
+                <w:i w:val="0"/>
+                <w:color w:val="5A5A5A"/>
+                <w:sz w:val="17"/>
+              </w:rPr>
+              <w:t xml:space="preserve">  </w:t>
+            </w:r>
+            <w:r>
+              <w:rPr>
+                <w:rFonts w:ascii="Segoe UI" w:hAnsi="Segoe UI" w:eastAsia="Segoe UI"/>
+                <w:b/>
                 <w:i w:val="0"/>
                 <w:color w:val="111111"/>
                 <w:sz w:val="17"/>
@@ -530,7 +622,7 @@
         </w:trPr>
         <w:tc>
           <w:tcPr>
-            <w:tcW w:w="10997" w:type="dxa"/>
+            <w:tcW w:w="11332" w:type="dxa"/>
             <w:gridSpan w:val="2"/>
             <w:shd w:val="clear" w:color="auto" w:fill="FAF6EE"/>
             <w:tcMar>
@@ -547,12 +639,12 @@
             <w:r>
               <w:rPr>
                 <w:rFonts w:ascii="Segoe UI" w:hAnsi="Segoe UI" w:eastAsia="Segoe UI"/>
-                <w:b w:val="0"/>
+                <w:b/>
                 <w:i w:val="0"/>
                 <w:color w:val="5A5A5A"/>
                 <w:sz w:val="17"/>
               </w:rPr>
-              <w:t xml:space="preserve">DIỄN GIẢI  </w:t>
+              <w:t xml:space="preserve">DIỄN GIẢI: </w:t>
             </w:r>
             <w:r>
               <w:rPr>
@@ -596,10 +688,10 @@
       </w:tblPr>
       <w:tblGrid>
         <w:gridCol w:w="30"/>
-        <w:gridCol w:w="2266"/>
-        <w:gridCol w:w="2266"/>
-        <w:gridCol w:w="2266"/>
-        <w:gridCol w:w="2266"/>
+        <w:gridCol w:w="1284"/>
+        <w:gridCol w:w="3248"/>
+        <w:gridCol w:w="2876"/>
+        <w:gridCol w:w="1656"/>
         <w:gridCol w:w="2238"/>
         <w:gridCol w:w="28"/>
       </w:tblGrid>
@@ -622,11 +714,12 @@
         </w:tblPrEx>
         <w:trPr>
           <w:gridBefore w:val="1"/>
+          <w:wBefore w:w="30" w:type="dxa"/>
           <w:jc w:val="center"/>
         </w:trPr>
         <w:tc>
           <w:tcPr>
-            <w:tcW w:w="510" w:type="dxa"/>
+            <w:tcW w:w="1284" w:type="dxa"/>
             <w:shd w:val="clear" w:color="auto" w:fill="FFFFFF"/>
             <w:tcMar>
               <w:top w:w="45" w:type="dxa"/>
@@ -655,7 +748,7 @@
         </w:tc>
         <w:tc>
           <w:tcPr>
-            <w:tcW w:w="3344" w:type="dxa"/>
+            <w:tcW w:w="3248" w:type="dxa"/>
             <w:shd w:val="clear" w:color="auto" w:fill="FFFFFF"/>
             <w:tcMar>
               <w:top w:w="45" w:type="dxa"/>
@@ -684,7 +777,7 @@
         </w:tc>
         <w:tc>
           <w:tcPr>
-            <w:tcW w:w="3855" w:type="dxa"/>
+            <w:tcW w:w="2876" w:type="dxa"/>
             <w:shd w:val="clear" w:color="auto" w:fill="FFFFFF"/>
             <w:tcMar>
               <w:top w:w="45" w:type="dxa"/>
@@ -713,7 +806,7 @@
         </w:tc>
         <w:tc>
           <w:tcPr>
-            <w:tcW w:w="1020" w:type="dxa"/>
+            <w:tcW w:w="1656" w:type="dxa"/>
             <w:shd w:val="clear" w:color="auto" w:fill="FFFFFF"/>
             <w:tcMar>
               <w:top w:w="45" w:type="dxa"/>
@@ -728,6 +821,8 @@
               <w:spacing w:before="0" w:after="0" w:line="252" w:lineRule="auto"/>
               <w:jc w:val="center"/>
             </w:pPr>
+            <w:bookmarkStart w:id="0" w:name="_GoBack"/>
+            <w:bookmarkEnd w:id="0"/>
             <w:r>
               <w:rPr>
                 <w:rFonts w:ascii="Segoe UI" w:hAnsi="Segoe UI" w:eastAsia="Segoe UI"/>
@@ -742,7 +837,7 @@
         </w:tc>
         <w:tc>
           <w:tcPr>
-            <w:tcW w:w="2267" w:type="dxa"/>
+            <w:tcW w:w="2266" w:type="dxa"/>
             <w:gridSpan w:val="2"/>
             <w:shd w:val="clear" w:color="auto" w:fill="FFFFFF"/>
             <w:tcMar>
@@ -790,11 +885,12 @@
         </w:tblPrEx>
         <w:trPr>
           <w:gridBefore w:val="1"/>
+          <w:wBefore w:w="30" w:type="dxa"/>
           <w:jc w:val="center"/>
         </w:trPr>
         <w:tc>
           <w:tcPr>
-            <w:tcW w:w="510" w:type="dxa"/>
+            <w:tcW w:w="1284" w:type="dxa"/>
             <w:tcMar>
               <w:top w:w="35" w:type="dxa"/>
               <w:left w:w="20" w:type="dxa"/>
@@ -822,7 +918,7 @@
         </w:tc>
         <w:tc>
           <w:tcPr>
-            <w:tcW w:w="3344" w:type="dxa"/>
+            <w:tcW w:w="3248" w:type="dxa"/>
             <w:tcMar>
               <w:top w:w="35" w:type="dxa"/>
               <w:left w:w="60" w:type="dxa"/>
@@ -889,7 +985,7 @@
         </w:tc>
         <w:tc>
           <w:tcPr>
-            <w:tcW w:w="3855" w:type="dxa"/>
+            <w:tcW w:w="2876" w:type="dxa"/>
             <w:tcMar>
               <w:top w:w="35" w:type="dxa"/>
               <w:left w:w="60" w:type="dxa"/>
@@ -917,7 +1013,7 @@
         </w:tc>
         <w:tc>
           <w:tcPr>
-            <w:tcW w:w="1020" w:type="dxa"/>
+            <w:tcW w:w="1656" w:type="dxa"/>
             <w:tcMar>
               <w:top w:w="35" w:type="dxa"/>
               <w:left w:w="20" w:type="dxa"/>
@@ -945,7 +1041,7 @@
         </w:tc>
         <w:tc>
           <w:tcPr>
-            <w:tcW w:w="2267" w:type="dxa"/>
+            <w:tcW w:w="2266" w:type="dxa"/>
             <w:gridSpan w:val="2"/>
             <w:tcMar>
               <w:top w:w="35" w:type="dxa"/>
@@ -992,11 +1088,12 @@
         </w:tblPrEx>
         <w:trPr>
           <w:gridAfter w:val="1"/>
+          <w:wAfter w:w="28" w:type="dxa"/>
           <w:jc w:val="center"/>
         </w:trPr>
         <w:tc>
           <w:tcPr>
-            <w:tcW w:w="10998" w:type="dxa"/>
+            <w:tcW w:w="11332" w:type="dxa"/>
             <w:gridSpan w:val="6"/>
             <w:shd w:val="clear" w:color="auto" w:fill="F4F4F2"/>
             <w:tcMar>
@@ -1339,6 +1436,9 @@
         <w:tc>
           <w:tcPr>
             <w:tcW w:w="4251" w:type="dxa"/>
+            <w:tcBorders>
+              <w:top w:val="single" w:color="AAAAAA" w:sz="8" w:space="0"/>
+            </w:tcBorders>
             <w:tcMar>
               <w:top w:w="10" w:type="dxa"/>
               <w:left w:w="60" w:type="dxa"/>
@@ -1348,7 +1448,7 @@
           </w:tcPr>
           <w:p>
             <w:pPr>
-              <w:spacing w:line="252" w:lineRule="auto"/>
+              <w:spacing w:before="40" w:line="252" w:lineRule="auto"/>
               <w:jc w:val="right"/>
             </w:pPr>
             <w:r>
@@ -1745,8 +1845,22 @@
       <w:pPr>
         <w:spacing w:before="160" w:after="40"/>
       </w:pPr>
-      <w:bookmarkStart w:id="0" w:name="_GoBack"/>
-      <w:bookmarkEnd w:id="0"/>
+    </w:p>
+    <w:p>
+      <w:pPr>
+        <w:spacing w:before="40" w:after="20"/>
+        <w:jc w:val="center"/>
+      </w:pPr>
+      <w:r>
+        <w:rPr>
+          <w:rFonts w:ascii="Segoe UI" w:hAnsi="Segoe UI" w:eastAsia="Segoe UI"/>
+          <w:b w:val="0"/>
+          <w:i/>
+          <w:color w:val="828282"/>
+          <w:sz w:val="16"/>
+        </w:rPr>
+        <w:t>Mẫu trình bày gọn "Size × Số lượng" giúp giữ hóa đơn trong một trang A4 mà không thu nhỏ chữ quá mức.</w:t>
+      </w:r>
     </w:p>
     <w:sectPr>
       <w:pgSz w:w="12240" w:h="15840"/>
@@ -1990,8 +2104,8 @@
     <w:lsdException w:uiPriority="99" w:name="Normal Indent"/>
     <w:lsdException w:uiPriority="99" w:name="footnote text"/>
     <w:lsdException w:uiPriority="99" w:name="annotation text"/>
-    <w:lsdException w:uiPriority="99" w:semiHidden="0" w:name="header"/>
-    <w:lsdException w:uiPriority="99" w:semiHidden="0" w:name="footer"/>
+    <w:lsdException w:qFormat="1" w:uiPriority="99" w:semiHidden="0" w:name="header"/>
+    <w:lsdException w:qFormat="1" w:uiPriority="99" w:semiHidden="0" w:name="footer"/>
     <w:lsdException w:uiPriority="99" w:name="index heading"/>
     <w:lsdException w:qFormat="1" w:uiPriority="35" w:name="caption"/>
     <w:lsdException w:uiPriority="99" w:name="table of figures"/>
@@ -2010,7 +2124,7 @@
     <w:lsdException w:qFormat="1" w:uiPriority="99" w:semiHidden="0" w:name="List Bullet"/>
     <w:lsdException w:qFormat="1" w:uiPriority="99" w:semiHidden="0" w:name="List Number"/>
     <w:lsdException w:qFormat="1" w:uiPriority="99" w:semiHidden="0" w:name="List 2"/>
-    <w:lsdException w:uiPriority="99" w:semiHidden="0" w:name="List 3"/>
+    <w:lsdException w:qFormat="1" w:uiPriority="99" w:semiHidden="0" w:name="List 3"/>
     <w:lsdException w:uiPriority="99" w:name="List 4"/>
     <w:lsdException w:uiPriority="99" w:name="List 5"/>
     <w:lsdException w:qFormat="1" w:uiPriority="99" w:semiHidden="0" w:name="List Bullet 2"/>
@@ -2024,7 +2138,7 @@
     <w:lsdException w:qFormat="1" w:unhideWhenUsed="0" w:uiPriority="10" w:semiHidden="0" w:name="Title"/>
     <w:lsdException w:uiPriority="99" w:name="Closing"/>
     <w:lsdException w:uiPriority="99" w:name="Signature"/>
-    <w:lsdException w:qFormat="1" w:uiPriority="1" w:name="Default Paragraph Font"/>
+    <w:lsdException w:uiPriority="1" w:name="Default Paragraph Font"/>
     <w:lsdException w:qFormat="1" w:uiPriority="99" w:semiHidden="0" w:name="Body Text"/>
     <w:lsdException w:uiPriority="99" w:name="Body Text Indent"/>
     <w:lsdException w:qFormat="1" w:uiPriority="99" w:semiHidden="0" w:name="List Continue"/>
@@ -2039,7 +2153,7 @@
     <w:lsdException w:uiPriority="99" w:name="Body Text First Indent"/>
     <w:lsdException w:uiPriority="99" w:name="Body Text First Indent 2"/>
     <w:lsdException w:uiPriority="99" w:name="Note Heading"/>
-    <w:lsdException w:uiPriority="99" w:semiHidden="0" w:name="Body Text 2"/>
+    <w:lsdException w:qFormat="1" w:uiPriority="99" w:semiHidden="0" w:name="Body Text 2"/>
     <w:lsdException w:qFormat="1" w:uiPriority="99" w:semiHidden="0" w:name="Body Text 3"/>
     <w:lsdException w:uiPriority="99" w:name="Body Text Indent 2"/>
     <w:lsdException w:uiPriority="99" w:name="Body Text Indent 3"/>
@@ -2062,7 +2176,7 @@
     <w:lsdException w:uiPriority="99" w:name="HTML Sample"/>
     <w:lsdException w:uiPriority="99" w:name="HTML Typewriter"/>
     <w:lsdException w:uiPriority="99" w:name="HTML Variable"/>
-    <w:lsdException w:qFormat="1" w:uiPriority="99" w:name="Normal Table"/>
+    <w:lsdException w:uiPriority="99" w:name="Normal Table"/>
     <w:lsdException w:uiPriority="99" w:name="annotation subject"/>
     <w:lsdException w:uiPriority="99" w:name="Table Simple 1"/>
     <w:lsdException w:uiPriority="99" w:name="Table Simple 2"/>
@@ -2113,7 +2227,7 @@
     <w:lsdException w:qFormat="1" w:unhideWhenUsed="0" w:uiPriority="60" w:semiHidden="0" w:name="Light Shading"/>
     <w:lsdException w:qFormat="1" w:unhideWhenUsed="0" w:uiPriority="61" w:semiHidden="0" w:name="Light List"/>
     <w:lsdException w:qFormat="1" w:unhideWhenUsed="0" w:uiPriority="62" w:semiHidden="0" w:name="Light Grid"/>
-    <w:lsdException w:unhideWhenUsed="0" w:uiPriority="63" w:semiHidden="0" w:name="Medium Shading 1"/>
+    <w:lsdException w:qFormat="1" w:unhideWhenUsed="0" w:uiPriority="63" w:semiHidden="0" w:name="Medium Shading 1"/>
     <w:lsdException w:unhideWhenUsed="0" w:uiPriority="64" w:semiHidden="0" w:name="Medium Shading 2"/>
     <w:lsdException w:unhideWhenUsed="0" w:uiPriority="65" w:semiHidden="0" w:name="Medium List 1"/>
     <w:lsdException w:unhideWhenUsed="0" w:uiPriority="66" w:semiHidden="0" w:name="Medium List 2"/>
@@ -2126,8 +2240,8 @@
     <w:lsdException w:unhideWhenUsed="0" w:uiPriority="73" w:semiHidden="0" w:name="Colorful Grid"/>
     <w:lsdException w:qFormat="1" w:unhideWhenUsed="0" w:uiPriority="60" w:semiHidden="0" w:name="Light Shading Accent 1"/>
     <w:lsdException w:qFormat="1" w:unhideWhenUsed="0" w:uiPriority="61" w:semiHidden="0" w:name="Light List Accent 1"/>
-    <w:lsdException w:qFormat="1" w:unhideWhenUsed="0" w:uiPriority="62" w:semiHidden="0" w:name="Light Grid Accent 1"/>
-    <w:lsdException w:unhideWhenUsed="0" w:uiPriority="63" w:semiHidden="0" w:name="Medium Shading 1 Accent 1"/>
+    <w:lsdException w:unhideWhenUsed="0" w:uiPriority="62" w:semiHidden="0" w:name="Light Grid Accent 1"/>
+    <w:lsdException w:qFormat="1" w:unhideWhenUsed="0" w:uiPriority="63" w:semiHidden="0" w:name="Medium Shading 1 Accent 1"/>
     <w:lsdException w:unhideWhenUsed="0" w:uiPriority="64" w:semiHidden="0" w:name="Medium Shading 2 Accent 1"/>
     <w:lsdException w:unhideWhenUsed="0" w:uiPriority="65" w:semiHidden="0" w:name="Medium List 1 Accent 1"/>
     <w:lsdException w:qFormat="1" w:unhideWhenUsed="0" w:uiPriority="34" w:semiHidden="0" w:name="List Paragraph"/>
@@ -2143,7 +2257,7 @@
     <w:lsdException w:unhideWhenUsed="0" w:uiPriority="73" w:semiHidden="0" w:name="Colorful Grid Accent 1"/>
     <w:lsdException w:qFormat="1" w:unhideWhenUsed="0" w:uiPriority="60" w:semiHidden="0" w:name="Light Shading Accent 2"/>
     <w:lsdException w:qFormat="1" w:unhideWhenUsed="0" w:uiPriority="61" w:semiHidden="0" w:name="Light List Accent 2"/>
-    <w:lsdException w:unhideWhenUsed="0" w:uiPriority="62" w:semiHidden="0" w:name="Light Grid Accent 2"/>
+    <w:lsdException w:qFormat="1" w:unhideWhenUsed="0" w:uiPriority="62" w:semiHidden="0" w:name="Light Grid Accent 2"/>
     <w:lsdException w:unhideWhenUsed="0" w:uiPriority="63" w:semiHidden="0" w:name="Medium Shading 1 Accent 2"/>
     <w:lsdException w:unhideWhenUsed="0" w:uiPriority="64" w:semiHidden="0" w:name="Medium Shading 2 Accent 2"/>
     <w:lsdException w:unhideWhenUsed="0" w:uiPriority="65" w:semiHidden="0" w:name="Medium List 1 Accent 2"/>
@@ -2157,7 +2271,7 @@
     <w:lsdException w:unhideWhenUsed="0" w:uiPriority="73" w:semiHidden="0" w:name="Colorful Grid Accent 2"/>
     <w:lsdException w:qFormat="1" w:unhideWhenUsed="0" w:uiPriority="60" w:semiHidden="0" w:name="Light Shading Accent 3"/>
     <w:lsdException w:qFormat="1" w:unhideWhenUsed="0" w:uiPriority="61" w:semiHidden="0" w:name="Light List Accent 3"/>
-    <w:lsdException w:unhideWhenUsed="0" w:uiPriority="62" w:semiHidden="0" w:name="Light Grid Accent 3"/>
+    <w:lsdException w:qFormat="1" w:unhideWhenUsed="0" w:uiPriority="62" w:semiHidden="0" w:name="Light Grid Accent 3"/>
     <w:lsdException w:unhideWhenUsed="0" w:uiPriority="63" w:semiHidden="0" w:name="Medium Shading 1 Accent 3"/>
     <w:lsdException w:unhideWhenUsed="0" w:uiPriority="64" w:semiHidden="0" w:name="Medium Shading 2 Accent 3"/>
     <w:lsdException w:unhideWhenUsed="0" w:uiPriority="65" w:semiHidden="0" w:name="Medium List 1 Accent 3"/>
@@ -2171,7 +2285,7 @@
     <w:lsdException w:unhideWhenUsed="0" w:uiPriority="73" w:semiHidden="0" w:name="Colorful Grid Accent 3"/>
     <w:lsdException w:qFormat="1" w:unhideWhenUsed="0" w:uiPriority="60" w:semiHidden="0" w:name="Light Shading Accent 4"/>
     <w:lsdException w:qFormat="1" w:unhideWhenUsed="0" w:uiPriority="61" w:semiHidden="0" w:name="Light List Accent 4"/>
-    <w:lsdException w:qFormat="1" w:unhideWhenUsed="0" w:uiPriority="62" w:semiHidden="0" w:name="Light Grid Accent 4"/>
+    <w:lsdException w:unhideWhenUsed="0" w:uiPriority="62" w:semiHidden="0" w:name="Light Grid Accent 4"/>
     <w:lsdException w:unhideWhenUsed="0" w:uiPriority="63" w:semiHidden="0" w:name="Medium Shading 1 Accent 4"/>
     <w:lsdException w:unhideWhenUsed="0" w:uiPriority="64" w:semiHidden="0" w:name="Medium Shading 2 Accent 4"/>
     <w:lsdException w:unhideWhenUsed="0" w:uiPriority="65" w:semiHidden="0" w:name="Medium List 1 Accent 4"/>
@@ -2466,14 +2580,12 @@
     <w:name w:val="Default Paragraph Font"/>
     <w:semiHidden/>
     <w:unhideWhenUsed/>
-    <w:qFormat/>
     <w:uiPriority w:val="1"/>
   </w:style>
   <w:style w:type="table" w:default="1" w:styleId="12">
     <w:name w:val="Normal Table"/>
     <w:semiHidden/>
     <w:unhideWhenUsed/>
-    <w:qFormat/>
     <w:uiPriority w:val="99"/>
     <w:tblPr>
       <w:tblCellMar>
@@ -2500,6 +2612,7 @@
     <w:basedOn w:val="1"/>
     <w:link w:val="145"/>
     <w:unhideWhenUsed/>
+    <w:qFormat/>
     <w:uiPriority w:val="99"/>
     <w:pPr>
       <w:spacing w:after="120" w:line="480" w:lineRule="auto"/>
@@ -2559,6 +2672,7 @@
     <w:basedOn w:val="1"/>
     <w:link w:val="136"/>
     <w:unhideWhenUsed/>
+    <w:qFormat/>
     <w:uiPriority w:val="99"/>
     <w:pPr>
       <w:tabs>
@@ -2573,6 +2687,7 @@
     <w:basedOn w:val="1"/>
     <w:link w:val="135"/>
     <w:unhideWhenUsed/>
+    <w:qFormat/>
     <w:uiPriority w:val="99"/>
     <w:pPr>
       <w:tabs>
@@ -2608,6 +2723,7 @@
     <w:name w:val="List 3"/>
     <w:basedOn w:val="1"/>
     <w:unhideWhenUsed/>
+    <w:qFormat/>
     <w:uiPriority w:val="99"/>
     <w:pPr>
       <w:ind w:left="1080" w:hanging="360"/>
@@ -4327,7 +4443,6 @@
   <w:style w:type="table" w:styleId="52">
     <w:name w:val="Light Grid Accent 1"/>
     <w:basedOn w:val="12"/>
-    <w:qFormat/>
     <w:uiPriority w:val="62"/>
     <w:pPr>
       <w:spacing w:after="0" w:line="240" w:lineRule="auto"/>
@@ -4454,6 +4569,7 @@
   <w:style w:type="table" w:styleId="53">
     <w:name w:val="Light Grid Accent 2"/>
     <w:basedOn w:val="12"/>
+    <w:qFormat/>
     <w:uiPriority w:val="62"/>
     <w:pPr>
       <w:spacing w:after="0" w:line="240" w:lineRule="auto"/>
@@ -4580,6 +4696,7 @@
   <w:style w:type="table" w:styleId="54">
     <w:name w:val="Light Grid Accent 3"/>
     <w:basedOn w:val="12"/>
+    <w:qFormat/>
     <w:uiPriority w:val="62"/>
     <w:pPr>
       <w:spacing w:after="0" w:line="240" w:lineRule="auto"/>
@@ -4706,7 +4823,6 @@
   <w:style w:type="table" w:styleId="55">
     <w:name w:val="Light Grid Accent 4"/>
     <w:basedOn w:val="12"/>
-    <w:qFormat/>
     <w:uiPriority w:val="62"/>
     <w:pPr>
       <w:spacing w:after="0" w:line="240" w:lineRule="auto"/>
@@ -5087,6 +5203,7 @@
   <w:style w:type="table" w:styleId="58">
     <w:name w:val="Medium Shading 1"/>
     <w:basedOn w:val="12"/>
+    <w:qFormat/>
     <w:uiPriority w:val="63"/>
     <w:pPr>
       <w:spacing w:after="0" w:line="240" w:lineRule="auto"/>
@@ -5194,6 +5311,7 @@
   <w:style w:type="table" w:styleId="59">
     <w:name w:val="Medium Shading 1 Accent 1"/>
     <w:basedOn w:val="12"/>
+    <w:qFormat/>
     <w:uiPriority w:val="63"/>
     <w:pPr>
       <w:spacing w:after="0" w:line="240" w:lineRule="auto"/>
@@ -14272,7 +14390,6 @@
     <w:name w:val="Footer Char"/>
     <w:basedOn w:val="11"/>
     <w:link w:val="18"/>
-    <w:qFormat/>
     <w:uiPriority w:val="99"/>
   </w:style>
   <w:style w:type="paragraph" w:styleId="137">
@@ -14293,7 +14410,6 @@
     <w:name w:val="Heading 1 Char"/>
     <w:basedOn w:val="11"/>
     <w:link w:val="2"/>
-    <w:qFormat/>
     <w:uiPriority w:val="9"/>
     <w:rPr>
       <w:rFonts w:asciiTheme="majorHAnsi" w:hAnsiTheme="majorHAnsi" w:eastAsiaTheme="majorEastAsia" w:cstheme="majorBidi"/>
@@ -14328,7 +14444,6 @@
     <w:name w:val="Heading 3 Char"/>
     <w:basedOn w:val="11"/>
     <w:link w:val="4"/>
-    <w:qFormat/>
     <w:uiPriority w:val="9"/>
     <w:rPr>
       <w:rFonts w:asciiTheme="majorHAnsi" w:hAnsiTheme="majorHAnsi" w:eastAsiaTheme="majorEastAsia" w:cstheme="majorBidi"/>

</xml_diff>

<commit_message>
feat: add sample order document to backend templates
</commit_message>
<xml_diff>
--- a/backend-app/samples/In Don dat hang.docx
+++ b/backend-app/samples/In Don dat hang.docx
@@ -577,8 +577,6 @@
               </w:rPr>
               <w:t>:</w:t>
             </w:r>
-            <w:bookmarkStart w:id="0" w:name="_GoBack"/>
-            <w:bookmarkEnd w:id="0"/>
             <w:r>
               <w:rPr>
                 <w:rFonts w:ascii="Segoe UI" w:hAnsi="Segoe UI" w:eastAsia="Segoe UI"/>
@@ -1845,22 +1843,8 @@
       <w:pPr>
         <w:spacing w:before="160" w:after="40"/>
       </w:pPr>
-    </w:p>
-    <w:p>
-      <w:pPr>
-        <w:spacing w:before="40" w:after="20"/>
-        <w:jc w:val="center"/>
-      </w:pPr>
-      <w:r>
-        <w:rPr>
-          <w:rFonts w:ascii="Segoe UI" w:hAnsi="Segoe UI" w:eastAsia="Segoe UI"/>
-          <w:b w:val="0"/>
-          <w:i/>
-          <w:color w:val="828282"/>
-          <w:sz w:val="16"/>
-        </w:rPr>
-        <w:t>Mẫu trình bày gọn "Size × Số lượng" giúp giữ hóa đơn trong một trang A4 mà không thu nhỏ chữ quá mức.</w:t>
-      </w:r>
+      <w:bookmarkStart w:id="0" w:name="_GoBack"/>
+      <w:bookmarkEnd w:id="0"/>
     </w:p>
     <w:sectPr>
       <w:pgSz w:w="12240" w:h="15840"/>

</xml_diff>

<commit_message>
feat: add sample order document to backend-app samples directory
</commit_message>
<xml_diff>
--- a/backend-app/samples/In Don dat hang.docx
+++ b/backend-app/samples/In Don dat hang.docx
@@ -37,12 +37,6 @@
             <w:insideH w:val="none" w:color="auto" w:sz="0" w:space="0"/>
             <w:insideV w:val="none" w:color="auto" w:sz="0" w:space="0"/>
           </w:tblBorders>
-          <w:tblCellMar>
-            <w:top w:w="0" w:type="dxa"/>
-            <w:left w:w="108" w:type="dxa"/>
-            <w:bottom w:w="0" w:type="dxa"/>
-            <w:right w:w="108" w:type="dxa"/>
-          </w:tblCellMar>
         </w:tblPrEx>
         <w:trPr>
           <w:jc w:val="center"/>
@@ -63,6 +57,8 @@
               <w:spacing w:before="0" w:after="0"/>
               <w:jc w:val="left"/>
             </w:pPr>
+            <w:bookmarkStart w:id="0" w:name="_GoBack"/>
+            <w:bookmarkEnd w:id="0"/>
             <w:r>
               <w:drawing>
                 <wp:inline distT="0" distB="0" distL="114300" distR="114300">
@@ -1158,8 +1154,8 @@
         </w:tblCellMar>
       </w:tblPr>
       <w:tblGrid>
-        <w:gridCol w:w="5666"/>
-        <w:gridCol w:w="5666"/>
+        <w:gridCol w:w="6506"/>
+        <w:gridCol w:w="4826"/>
       </w:tblGrid>
       <w:tr>
         <w:tblPrEx>
@@ -1183,7 +1179,7 @@
         </w:trPr>
         <w:tc>
           <w:tcPr>
-            <w:tcW w:w="6746" w:type="dxa"/>
+            <w:tcW w:w="6506" w:type="dxa"/>
             <w:tcMar>
               <w:top w:w="10" w:type="dxa"/>
               <w:left w:w="60" w:type="dxa"/>
@@ -1209,7 +1205,7 @@
         </w:tc>
         <w:tc>
           <w:tcPr>
-            <w:tcW w:w="4251" w:type="dxa"/>
+            <w:tcW w:w="4826" w:type="dxa"/>
             <w:tcMar>
               <w:top w:w="10" w:type="dxa"/>
               <w:left w:w="60" w:type="dxa"/>
@@ -1267,7 +1263,7 @@
         </w:trPr>
         <w:tc>
           <w:tcPr>
-            <w:tcW w:w="6746" w:type="dxa"/>
+            <w:tcW w:w="6506" w:type="dxa"/>
             <w:tcMar>
               <w:top w:w="10" w:type="dxa"/>
               <w:left w:w="60" w:type="dxa"/>
@@ -1293,7 +1289,7 @@
         </w:tc>
         <w:tc>
           <w:tcPr>
-            <w:tcW w:w="4251" w:type="dxa"/>
+            <w:tcW w:w="4826" w:type="dxa"/>
             <w:tcMar>
               <w:top w:w="10" w:type="dxa"/>
               <w:left w:w="60" w:type="dxa"/>
@@ -1351,7 +1347,7 @@
         </w:trPr>
         <w:tc>
           <w:tcPr>
-            <w:tcW w:w="6746" w:type="dxa"/>
+            <w:tcW w:w="6506" w:type="dxa"/>
             <w:tcMar>
               <w:top w:w="10" w:type="dxa"/>
               <w:left w:w="60" w:type="dxa"/>
@@ -1363,7 +1359,7 @@
         </w:tc>
         <w:tc>
           <w:tcPr>
-            <w:tcW w:w="4251" w:type="dxa"/>
+            <w:tcW w:w="4826" w:type="dxa"/>
             <w:tcMar>
               <w:top w:w="10" w:type="dxa"/>
               <w:left w:w="60" w:type="dxa"/>
@@ -1421,7 +1417,7 @@
         </w:trPr>
         <w:tc>
           <w:tcPr>
-            <w:tcW w:w="6746" w:type="dxa"/>
+            <w:tcW w:w="6506" w:type="dxa"/>
             <w:tcMar>
               <w:top w:w="10" w:type="dxa"/>
               <w:left w:w="60" w:type="dxa"/>
@@ -1433,7 +1429,7 @@
         </w:tc>
         <w:tc>
           <w:tcPr>
-            <w:tcW w:w="4251" w:type="dxa"/>
+            <w:tcW w:w="4826" w:type="dxa"/>
             <w:tcBorders>
               <w:top w:val="single" w:color="AAAAAA" w:sz="8" w:space="0"/>
             </w:tcBorders>
@@ -1843,8 +1839,6 @@
       <w:pPr>
         <w:spacing w:before="160" w:after="40"/>
       </w:pPr>
-      <w:bookmarkStart w:id="0" w:name="_GoBack"/>
-      <w:bookmarkEnd w:id="0"/>
     </w:p>
     <w:sectPr>
       <w:pgSz w:w="12240" w:h="15840"/>
@@ -2123,7 +2117,7 @@
     <w:lsdException w:uiPriority="99" w:name="Closing"/>
     <w:lsdException w:uiPriority="99" w:name="Signature"/>
     <w:lsdException w:qFormat="1" w:uiPriority="1" w:name="Default Paragraph Font"/>
-    <w:lsdException w:uiPriority="99" w:semiHidden="0" w:name="Body Text"/>
+    <w:lsdException w:qFormat="1" w:uiPriority="99" w:semiHidden="0" w:name="Body Text"/>
     <w:lsdException w:uiPriority="99" w:name="Body Text Indent"/>
     <w:lsdException w:qFormat="1" w:uiPriority="99" w:semiHidden="0" w:name="List Continue"/>
     <w:lsdException w:qFormat="1" w:uiPriority="99" w:semiHidden="0" w:name="List Continue 2"/>
@@ -2587,6 +2581,7 @@
     <w:basedOn w:val="1"/>
     <w:link w:val="144"/>
     <w:unhideWhenUsed/>
+    <w:qFormat/>
     <w:uiPriority w:val="99"/>
     <w:pPr>
       <w:spacing w:after="120"/>

</xml_diff>

<commit_message>
feat: add sample order document for testing backend integration
</commit_message>
<xml_diff>
--- a/backend-app/samples/In Don dat hang.docx
+++ b/backend-app/samples/In Don dat hang.docx
@@ -37,6 +37,12 @@
             <w:insideH w:val="none" w:color="auto" w:sz="0" w:space="0"/>
             <w:insideV w:val="none" w:color="auto" w:sz="0" w:space="0"/>
           </w:tblBorders>
+          <w:tblCellMar>
+            <w:top w:w="0" w:type="dxa"/>
+            <w:left w:w="108" w:type="dxa"/>
+            <w:bottom w:w="0" w:type="dxa"/>
+            <w:right w:w="108" w:type="dxa"/>
+          </w:tblCellMar>
         </w:tblPrEx>
         <w:trPr>
           <w:jc w:val="center"/>
@@ -57,8 +63,6 @@
               <w:spacing w:before="0" w:after="0"/>
               <w:jc w:val="left"/>
             </w:pPr>
-            <w:bookmarkStart w:id="0" w:name="_GoBack"/>
-            <w:bookmarkEnd w:id="0"/>
             <w:r>
               <w:drawing>
                 <wp:inline distT="0" distB="0" distL="114300" distR="114300">
@@ -1487,8 +1491,10 @@
     <w:tbl>
       <w:tblPr>
         <w:tblStyle w:val="12"/>
+        <w:tblpPr w:leftFromText="180" w:rightFromText="180" w:vertAnchor="text" w:horzAnchor="page" w:tblpX="9562" w:tblpY="116"/>
+        <w:tblOverlap w:val="never"/>
         <w:tblW w:w="0" w:type="auto"/>
-        <w:jc w:val="center"/>
+        <w:tblInd w:w="0" w:type="dxa"/>
         <w:tblBorders>
           <w:top w:val="none" w:color="auto" w:sz="0" w:space="0"/>
           <w:left w:val="none" w:color="auto" w:sz="0" w:space="0"/>
@@ -1507,21 +1513,9 @@
       </w:tblPr>
       <w:tblGrid>
         <w:gridCol w:w="2266"/>
-        <w:gridCol w:w="2266"/>
-        <w:gridCol w:w="2266"/>
-        <w:gridCol w:w="2266"/>
-        <w:gridCol w:w="2266"/>
       </w:tblGrid>
       <w:tr>
         <w:tblPrEx>
-          <w:tblBorders>
-            <w:top w:val="none" w:color="auto" w:sz="0" w:space="0"/>
-            <w:left w:val="none" w:color="auto" w:sz="0" w:space="0"/>
-            <w:bottom w:val="none" w:color="auto" w:sz="0" w:space="0"/>
-            <w:right w:val="none" w:color="auto" w:sz="0" w:space="0"/>
-            <w:insideH w:val="none" w:color="auto" w:sz="0" w:space="0"/>
-            <w:insideV w:val="none" w:color="auto" w:sz="0" w:space="0"/>
-          </w:tblBorders>
           <w:tblCellMar>
             <w:top w:w="0" w:type="dxa"/>
             <w:left w:w="108" w:type="dxa"/>
@@ -1529,12 +1523,9 @@
             <w:right w:w="108" w:type="dxa"/>
           </w:tblCellMar>
         </w:tblPrEx>
-        <w:trPr>
-          <w:jc w:val="center"/>
-        </w:trPr>
         <w:tc>
           <w:tcPr>
-            <w:tcW w:w="2199" w:type="dxa"/>
+            <w:tcW w:w="2266" w:type="dxa"/>
             <w:tcMar>
               <w:top w:w="10" w:type="dxa"/>
               <w:left w:w="60" w:type="dxa"/>
@@ -1548,90 +1539,8 @@
               <w:spacing w:before="0" w:after="0" w:line="252" w:lineRule="auto"/>
               <w:jc w:val="center"/>
             </w:pPr>
-            <w:r>
-              <w:rPr>
-                <w:rFonts w:ascii="Segoe UI" w:hAnsi="Segoe UI" w:eastAsia="Segoe UI"/>
-                <w:b/>
-                <w:i w:val="0"/>
-                <w:color w:val="111111"/>
-                <w:sz w:val="18"/>
-              </w:rPr>
-              <w:t>Người nhận</w:t>
-            </w:r>
-          </w:p>
-        </w:tc>
-        <w:tc>
-          <w:tcPr>
-            <w:tcW w:w="2199" w:type="dxa"/>
-            <w:tcMar>
-              <w:top w:w="10" w:type="dxa"/>
-              <w:left w:w="60" w:type="dxa"/>
-              <w:bottom w:w="10" w:type="dxa"/>
-              <w:right w:w="60" w:type="dxa"/>
-            </w:tcMar>
-            <w:vAlign w:val="center"/>
-          </w:tcPr>
-          <w:p>
-            <w:pPr>
-              <w:spacing w:before="0" w:after="0" w:line="252" w:lineRule="auto"/>
-              <w:jc w:val="center"/>
-            </w:pPr>
-            <w:r>
-              <w:rPr>
-                <w:rFonts w:ascii="Segoe UI" w:hAnsi="Segoe UI" w:eastAsia="Segoe UI"/>
-                <w:b/>
-                <w:i w:val="0"/>
-                <w:color w:val="111111"/>
-                <w:sz w:val="18"/>
-              </w:rPr>
-              <w:t>Người giao</w:t>
-            </w:r>
-          </w:p>
-        </w:tc>
-        <w:tc>
-          <w:tcPr>
-            <w:tcW w:w="2199" w:type="dxa"/>
-            <w:tcMar>
-              <w:top w:w="10" w:type="dxa"/>
-              <w:left w:w="60" w:type="dxa"/>
-              <w:bottom w:w="10" w:type="dxa"/>
-              <w:right w:w="60" w:type="dxa"/>
-            </w:tcMar>
-            <w:vAlign w:val="center"/>
-          </w:tcPr>
-          <w:p>
-            <w:pPr>
-              <w:spacing w:before="0" w:after="0" w:line="252" w:lineRule="auto"/>
-              <w:jc w:val="center"/>
-            </w:pPr>
-            <w:r>
-              <w:rPr>
-                <w:rFonts w:ascii="Segoe UI" w:hAnsi="Segoe UI" w:eastAsia="Segoe UI"/>
-                <w:b/>
-                <w:i w:val="0"/>
-                <w:color w:val="111111"/>
-                <w:sz w:val="18"/>
-              </w:rPr>
-              <w:t>Thủ kho</w:t>
-            </w:r>
-          </w:p>
-        </w:tc>
-        <w:tc>
-          <w:tcPr>
-            <w:tcW w:w="2199" w:type="dxa"/>
-            <w:tcMar>
-              <w:top w:w="10" w:type="dxa"/>
-              <w:left w:w="60" w:type="dxa"/>
-              <w:bottom w:w="10" w:type="dxa"/>
-              <w:right w:w="60" w:type="dxa"/>
-            </w:tcMar>
-            <w:vAlign w:val="center"/>
-          </w:tcPr>
-          <w:p>
-            <w:pPr>
-              <w:spacing w:before="0" w:after="0" w:line="252" w:lineRule="auto"/>
-              <w:jc w:val="center"/>
-            </w:pPr>
+            <w:bookmarkStart w:id="0" w:name="_GoBack"/>
+            <w:bookmarkEnd w:id="0"/>
             <w:r>
               <w:rPr>
                 <w:rFonts w:ascii="Segoe UI" w:hAnsi="Segoe UI" w:eastAsia="Segoe UI"/>
@@ -1641,34 +1550,6 @@
                 <w:sz w:val="18"/>
               </w:rPr>
               <w:t>Kế toán</w:t>
-            </w:r>
-          </w:p>
-        </w:tc>
-        <w:tc>
-          <w:tcPr>
-            <w:tcW w:w="2199" w:type="dxa"/>
-            <w:tcMar>
-              <w:top w:w="10" w:type="dxa"/>
-              <w:left w:w="60" w:type="dxa"/>
-              <w:bottom w:w="10" w:type="dxa"/>
-              <w:right w:w="60" w:type="dxa"/>
-            </w:tcMar>
-            <w:vAlign w:val="center"/>
-          </w:tcPr>
-          <w:p>
-            <w:pPr>
-              <w:spacing w:before="0" w:after="0" w:line="252" w:lineRule="auto"/>
-              <w:jc w:val="center"/>
-            </w:pPr>
-            <w:r>
-              <w:rPr>
-                <w:rFonts w:ascii="Segoe UI" w:hAnsi="Segoe UI" w:eastAsia="Segoe UI"/>
-                <w:b/>
-                <w:i w:val="0"/>
-                <w:color w:val="111111"/>
-                <w:sz w:val="18"/>
-              </w:rPr>
-              <w:t>Thủ trưởng</w:t>
             </w:r>
           </w:p>
         </w:tc>
@@ -1690,124 +1571,9 @@
             <w:right w:w="108" w:type="dxa"/>
           </w:tblCellMar>
         </w:tblPrEx>
-        <w:trPr>
-          <w:jc w:val="center"/>
-        </w:trPr>
         <w:tc>
           <w:tcPr>
-            <w:tcW w:w="2199" w:type="dxa"/>
-            <w:tcMar>
-              <w:top w:w="10" w:type="dxa"/>
-              <w:left w:w="60" w:type="dxa"/>
-              <w:bottom w:w="10" w:type="dxa"/>
-              <w:right w:w="60" w:type="dxa"/>
-            </w:tcMar>
-            <w:vAlign w:val="center"/>
-          </w:tcPr>
-          <w:p>
-            <w:pPr>
-              <w:spacing w:before="0" w:after="0" w:line="252" w:lineRule="auto"/>
-              <w:jc w:val="center"/>
-            </w:pPr>
-            <w:r>
-              <w:rPr>
-                <w:rFonts w:ascii="Segoe UI" w:hAnsi="Segoe UI" w:eastAsia="Segoe UI"/>
-                <w:b w:val="0"/>
-                <w:i/>
-                <w:color w:val="787878"/>
-                <w:sz w:val="16"/>
-              </w:rPr>
-              <w:t>(Ký / họ tên)</w:t>
-            </w:r>
-          </w:p>
-        </w:tc>
-        <w:tc>
-          <w:tcPr>
-            <w:tcW w:w="2199" w:type="dxa"/>
-            <w:tcMar>
-              <w:top w:w="10" w:type="dxa"/>
-              <w:left w:w="60" w:type="dxa"/>
-              <w:bottom w:w="10" w:type="dxa"/>
-              <w:right w:w="60" w:type="dxa"/>
-            </w:tcMar>
-            <w:vAlign w:val="center"/>
-          </w:tcPr>
-          <w:p>
-            <w:pPr>
-              <w:spacing w:before="0" w:after="0" w:line="252" w:lineRule="auto"/>
-              <w:jc w:val="center"/>
-            </w:pPr>
-            <w:r>
-              <w:rPr>
-                <w:rFonts w:ascii="Segoe UI" w:hAnsi="Segoe UI" w:eastAsia="Segoe UI"/>
-                <w:b w:val="0"/>
-                <w:i/>
-                <w:color w:val="787878"/>
-                <w:sz w:val="16"/>
-              </w:rPr>
-              <w:t>(Ký / họ tên)</w:t>
-            </w:r>
-          </w:p>
-        </w:tc>
-        <w:tc>
-          <w:tcPr>
-            <w:tcW w:w="2199" w:type="dxa"/>
-            <w:tcMar>
-              <w:top w:w="10" w:type="dxa"/>
-              <w:left w:w="60" w:type="dxa"/>
-              <w:bottom w:w="10" w:type="dxa"/>
-              <w:right w:w="60" w:type="dxa"/>
-            </w:tcMar>
-            <w:vAlign w:val="center"/>
-          </w:tcPr>
-          <w:p>
-            <w:pPr>
-              <w:spacing w:before="0" w:after="0" w:line="252" w:lineRule="auto"/>
-              <w:jc w:val="center"/>
-            </w:pPr>
-            <w:r>
-              <w:rPr>
-                <w:rFonts w:ascii="Segoe UI" w:hAnsi="Segoe UI" w:eastAsia="Segoe UI"/>
-                <w:b w:val="0"/>
-                <w:i/>
-                <w:color w:val="787878"/>
-                <w:sz w:val="16"/>
-              </w:rPr>
-              <w:t>(Ký / họ tên)</w:t>
-            </w:r>
-          </w:p>
-        </w:tc>
-        <w:tc>
-          <w:tcPr>
-            <w:tcW w:w="2199" w:type="dxa"/>
-            <w:tcMar>
-              <w:top w:w="10" w:type="dxa"/>
-              <w:left w:w="60" w:type="dxa"/>
-              <w:bottom w:w="10" w:type="dxa"/>
-              <w:right w:w="60" w:type="dxa"/>
-            </w:tcMar>
-            <w:vAlign w:val="center"/>
-          </w:tcPr>
-          <w:p>
-            <w:pPr>
-              <w:spacing w:before="0" w:after="0" w:line="252" w:lineRule="auto"/>
-              <w:jc w:val="center"/>
-            </w:pPr>
-            <w:r>
-              <w:rPr>
-                <w:rFonts w:ascii="Segoe UI" w:hAnsi="Segoe UI" w:eastAsia="Segoe UI"/>
-                <w:b w:val="0"/>
-                <w:i/>
-                <w:color w:val="787878"/>
-                <w:sz w:val="16"/>
-              </w:rPr>
-              <w:t>(Ký / họ tên)</w:t>
-            </w:r>
-          </w:p>
-        </w:tc>
-        <w:tc>
-          <w:tcPr>
-            <w:tcW w:w="2199" w:type="dxa"/>
+            <w:tcW w:w="2266" w:type="dxa"/>
             <w:tcMar>
               <w:top w:w="10" w:type="dxa"/>
               <w:left w:w="60" w:type="dxa"/>
@@ -2082,8 +1848,8 @@
     <w:lsdException w:uiPriority="99" w:name="Normal Indent"/>
     <w:lsdException w:uiPriority="99" w:name="footnote text"/>
     <w:lsdException w:uiPriority="99" w:name="annotation text"/>
-    <w:lsdException w:uiPriority="99" w:semiHidden="0" w:name="header"/>
-    <w:lsdException w:uiPriority="99" w:semiHidden="0" w:name="footer"/>
+    <w:lsdException w:qFormat="1" w:uiPriority="99" w:semiHidden="0" w:name="header"/>
+    <w:lsdException w:qFormat="1" w:uiPriority="99" w:semiHidden="0" w:name="footer"/>
     <w:lsdException w:uiPriority="99" w:name="index heading"/>
     <w:lsdException w:qFormat="1" w:uiPriority="35" w:name="caption"/>
     <w:lsdException w:uiPriority="99" w:name="table of figures"/>
@@ -2652,6 +2418,7 @@
     <w:basedOn w:val="1"/>
     <w:link w:val="136"/>
     <w:unhideWhenUsed/>
+    <w:qFormat/>
     <w:uiPriority w:val="99"/>
     <w:pPr>
       <w:tabs>
@@ -2666,6 +2433,7 @@
     <w:basedOn w:val="1"/>
     <w:link w:val="135"/>
     <w:unhideWhenUsed/>
+    <w:qFormat/>
     <w:uiPriority w:val="99"/>
     <w:pPr>
       <w:tabs>

</xml_diff>

<commit_message>
feat: add sample order document for backend reference
</commit_message>
<xml_diff>
--- a/backend-app/samples/In Don dat hang.docx
+++ b/backend-app/samples/In Don dat hang.docx
@@ -135,16 +135,46 @@
             <w:pPr>
               <w:spacing w:after="0" w:line="252" w:lineRule="auto"/>
               <w:jc w:val="right"/>
-            </w:pPr>
-            <w:r>
               <w:rPr>
-                <w:rFonts w:ascii="Segoe UI" w:hAnsi="Segoe UI" w:eastAsia="Segoe UI"/>
+                <w:rFonts w:hint="default" w:ascii="Segoe UI" w:hAnsi="Segoe UI" w:eastAsia="Segoe UI"/>
                 <w:b w:val="0"/>
                 <w:i w:val="0"/>
                 <w:color w:val="505050"/>
                 <w:sz w:val="16"/>
               </w:rPr>
-              <w:t>Số 48, Phố Lạc Trung, Q. Hai Bà Trưng, Hà Nội</w:t>
+            </w:pPr>
+            <w:r>
+              <w:rPr>
+                <w:rFonts w:hint="default" w:ascii="Segoe UI" w:hAnsi="Segoe UI" w:eastAsia="Segoe UI"/>
+                <w:b w:val="0"/>
+                <w:i w:val="0"/>
+                <w:color w:val="505050"/>
+                <w:sz w:val="16"/>
+              </w:rPr>
+              <w:t>Tầng 3, Helios Tower, 75 Tam Trinh, Hoàng Mai, Hà Nội</w:t>
+            </w:r>
+          </w:p>
+          <w:p>
+            <w:pPr>
+              <w:spacing w:after="0" w:line="252" w:lineRule="auto"/>
+              <w:jc w:val="right"/>
+              <w:rPr>
+                <w:rFonts w:hint="default" w:ascii="Segoe UI" w:hAnsi="Segoe UI" w:eastAsia="Segoe UI"/>
+                <w:b w:val="0"/>
+                <w:i w:val="0"/>
+                <w:color w:val="505050"/>
+                <w:sz w:val="16"/>
+              </w:rPr>
+            </w:pPr>
+            <w:r>
+              <w:rPr>
+                <w:rFonts w:hint="default" w:ascii="Segoe UI" w:hAnsi="Segoe UI" w:eastAsia="Segoe UI"/>
+                <w:b w:val="0"/>
+                <w:i w:val="0"/>
+                <w:color w:val="505050"/>
+                <w:sz w:val="16"/>
+              </w:rPr>
+              <w:t>Tel: (024) 3204 9988, Fax: (024) 3215 1142</w:t>
             </w:r>
           </w:p>
           <w:p>
@@ -160,14 +190,21 @@
                 <w:color w:val="505050"/>
                 <w:sz w:val="16"/>
               </w:rPr>
-              <w:t>Tel: (024) 3204 9988  |  Fax: (024) 3215 1142</w:t>
+              <w:t>Email: info@santino.com.vn</w:t>
             </w:r>
-          </w:p>
-          <w:p>
-            <w:pPr>
-              <w:spacing w:after="0" w:line="252" w:lineRule="auto"/>
-              <w:jc w:val="right"/>
-            </w:pPr>
+            <w:r>
+              <w:rPr>
+                <w:rFonts w:hint="default"/>
+                <w:b w:val="0"/>
+                <w:i w:val="0"/>
+                <w:color w:val="505050"/>
+                <w:sz w:val="16"/>
+                <w:lang w:val="en-US"/>
+              </w:rPr>
+              <w:t xml:space="preserve">, </w:t>
+            </w:r>
+            <w:bookmarkStart w:id="0" w:name="_GoBack"/>
+            <w:bookmarkEnd w:id="0"/>
             <w:r>
               <w:rPr>
                 <w:rFonts w:ascii="Segoe UI" w:hAnsi="Segoe UI" w:eastAsia="Segoe UI"/>
@@ -176,7 +213,7 @@
                 <w:color w:val="505050"/>
                 <w:sz w:val="16"/>
               </w:rPr>
-              <w:t>Email: info@santino.com.vn  |  www.santino.com.vn</w:t>
+              <w:t>www.santino.com.vn</w:t>
             </w:r>
           </w:p>
         </w:tc>
@@ -1516,6 +1553,14 @@
       </w:tblGrid>
       <w:tr>
         <w:tblPrEx>
+          <w:tblBorders>
+            <w:top w:val="none" w:color="auto" w:sz="0" w:space="0"/>
+            <w:left w:val="none" w:color="auto" w:sz="0" w:space="0"/>
+            <w:bottom w:val="none" w:color="auto" w:sz="0" w:space="0"/>
+            <w:right w:val="none" w:color="auto" w:sz="0" w:space="0"/>
+            <w:insideH w:val="none" w:color="auto" w:sz="0" w:space="0"/>
+            <w:insideV w:val="none" w:color="auto" w:sz="0" w:space="0"/>
+          </w:tblBorders>
           <w:tblCellMar>
             <w:top w:w="0" w:type="dxa"/>
             <w:left w:w="108" w:type="dxa"/>
@@ -1539,8 +1584,6 @@
               <w:spacing w:before="0" w:after="0" w:line="252" w:lineRule="auto"/>
               <w:jc w:val="center"/>
             </w:pPr>
-            <w:bookmarkStart w:id="0" w:name="_GoBack"/>
-            <w:bookmarkEnd w:id="0"/>
             <w:r>
               <w:rPr>
                 <w:rFonts w:ascii="Segoe UI" w:hAnsi="Segoe UI" w:eastAsia="Segoe UI"/>
@@ -1965,15 +2008,15 @@
     <w:lsdException w:uiPriority="99" w:name="Table Web 2"/>
     <w:lsdException w:uiPriority="99" w:name="Table Web 3"/>
     <w:lsdException w:uiPriority="99" w:name="Balloon Text"/>
-    <w:lsdException w:unhideWhenUsed="0" w:uiPriority="59" w:semiHidden="0" w:name="Table Grid"/>
+    <w:lsdException w:qFormat="1" w:unhideWhenUsed="0" w:uiPriority="59" w:semiHidden="0" w:name="Table Grid"/>
     <w:lsdException w:uiPriority="99" w:name="Table Theme"/>
     <w:lsdException w:qFormat="1" w:unhideWhenUsed="0" w:uiPriority="1" w:semiHidden="0" w:name="No Spacing"/>
-    <w:lsdException w:unhideWhenUsed="0" w:uiPriority="60" w:semiHidden="0" w:name="Light Shading"/>
+    <w:lsdException w:qFormat="1" w:unhideWhenUsed="0" w:uiPriority="60" w:semiHidden="0" w:name="Light Shading"/>
     <w:lsdException w:unhideWhenUsed="0" w:uiPriority="61" w:semiHidden="0" w:name="Light List"/>
-    <w:lsdException w:unhideWhenUsed="0" w:uiPriority="62" w:semiHidden="0" w:name="Light Grid"/>
-    <w:lsdException w:unhideWhenUsed="0" w:uiPriority="63" w:semiHidden="0" w:name="Medium Shading 1"/>
+    <w:lsdException w:qFormat="1" w:unhideWhenUsed="0" w:uiPriority="62" w:semiHidden="0" w:name="Light Grid"/>
+    <w:lsdException w:qFormat="1" w:unhideWhenUsed="0" w:uiPriority="63" w:semiHidden="0" w:name="Medium Shading 1"/>
     <w:lsdException w:unhideWhenUsed="0" w:uiPriority="64" w:semiHidden="0" w:name="Medium Shading 2"/>
-    <w:lsdException w:unhideWhenUsed="0" w:uiPriority="65" w:semiHidden="0" w:name="Medium List 1"/>
+    <w:lsdException w:qFormat="1" w:unhideWhenUsed="0" w:uiPriority="65" w:semiHidden="0" w:name="Medium List 1"/>
     <w:lsdException w:unhideWhenUsed="0" w:uiPriority="66" w:semiHidden="0" w:name="Medium List 2"/>
     <w:lsdException w:unhideWhenUsed="0" w:uiPriority="67" w:semiHidden="0" w:name="Medium Grid 1"/>
     <w:lsdException w:unhideWhenUsed="0" w:uiPriority="68" w:semiHidden="0" w:name="Medium Grid 2"/>
@@ -1985,9 +2028,9 @@
     <w:lsdException w:unhideWhenUsed="0" w:uiPriority="60" w:semiHidden="0" w:name="Light Shading Accent 1"/>
     <w:lsdException w:unhideWhenUsed="0" w:uiPriority="61" w:semiHidden="0" w:name="Light List Accent 1"/>
     <w:lsdException w:unhideWhenUsed="0" w:uiPriority="62" w:semiHidden="0" w:name="Light Grid Accent 1"/>
-    <w:lsdException w:unhideWhenUsed="0" w:uiPriority="63" w:semiHidden="0" w:name="Medium Shading 1 Accent 1"/>
+    <w:lsdException w:qFormat="1" w:unhideWhenUsed="0" w:uiPriority="63" w:semiHidden="0" w:name="Medium Shading 1 Accent 1"/>
     <w:lsdException w:unhideWhenUsed="0" w:uiPriority="64" w:semiHidden="0" w:name="Medium Shading 2 Accent 1"/>
-    <w:lsdException w:unhideWhenUsed="0" w:uiPriority="65" w:semiHidden="0" w:name="Medium List 1 Accent 1"/>
+    <w:lsdException w:qFormat="1" w:unhideWhenUsed="0" w:uiPriority="65" w:semiHidden="0" w:name="Medium List 1 Accent 1"/>
     <w:lsdException w:qFormat="1" w:unhideWhenUsed="0" w:uiPriority="34" w:semiHidden="0" w:name="List Paragraph"/>
     <w:lsdException w:qFormat="1" w:unhideWhenUsed="0" w:uiPriority="29" w:semiHidden="0" w:name="Quote"/>
     <w:lsdException w:qFormat="1" w:unhideWhenUsed="0" w:uiPriority="30" w:semiHidden="0" w:name="Intense Quote"/>
@@ -2013,8 +2056,8 @@
     <w:lsdException w:unhideWhenUsed="0" w:uiPriority="71" w:semiHidden="0" w:name="Colorful Shading Accent 2"/>
     <w:lsdException w:unhideWhenUsed="0" w:uiPriority="72" w:semiHidden="0" w:name="Colorful List Accent 2"/>
     <w:lsdException w:unhideWhenUsed="0" w:uiPriority="73" w:semiHidden="0" w:name="Colorful Grid Accent 2"/>
-    <w:lsdException w:unhideWhenUsed="0" w:uiPriority="60" w:semiHidden="0" w:name="Light Shading Accent 3"/>
-    <w:lsdException w:unhideWhenUsed="0" w:uiPriority="61" w:semiHidden="0" w:name="Light List Accent 3"/>
+    <w:lsdException w:qFormat="1" w:unhideWhenUsed="0" w:uiPriority="60" w:semiHidden="0" w:name="Light Shading Accent 3"/>
+    <w:lsdException w:qFormat="1" w:unhideWhenUsed="0" w:uiPriority="61" w:semiHidden="0" w:name="Light List Accent 3"/>
     <w:lsdException w:unhideWhenUsed="0" w:uiPriority="62" w:semiHidden="0" w:name="Light Grid Accent 3"/>
     <w:lsdException w:unhideWhenUsed="0" w:uiPriority="63" w:semiHidden="0" w:name="Medium Shading 1 Accent 3"/>
     <w:lsdException w:unhideWhenUsed="0" w:uiPriority="64" w:semiHidden="0" w:name="Medium Shading 2 Accent 3"/>
@@ -2027,7 +2070,7 @@
     <w:lsdException w:unhideWhenUsed="0" w:uiPriority="71" w:semiHidden="0" w:name="Colorful Shading Accent 3"/>
     <w:lsdException w:unhideWhenUsed="0" w:uiPriority="72" w:semiHidden="0" w:name="Colorful List Accent 3"/>
     <w:lsdException w:unhideWhenUsed="0" w:uiPriority="73" w:semiHidden="0" w:name="Colorful Grid Accent 3"/>
-    <w:lsdException w:unhideWhenUsed="0" w:uiPriority="60" w:semiHidden="0" w:name="Light Shading Accent 4"/>
+    <w:lsdException w:qFormat="1" w:unhideWhenUsed="0" w:uiPriority="60" w:semiHidden="0" w:name="Light Shading Accent 4"/>
     <w:lsdException w:unhideWhenUsed="0" w:uiPriority="61" w:semiHidden="0" w:name="Light List Accent 4"/>
     <w:lsdException w:unhideWhenUsed="0" w:uiPriority="62" w:semiHidden="0" w:name="Light Grid Accent 4"/>
     <w:lsdException w:unhideWhenUsed="0" w:uiPriority="63" w:semiHidden="0" w:name="Medium Shading 1 Accent 4"/>
@@ -2041,12 +2084,12 @@
     <w:lsdException w:unhideWhenUsed="0" w:uiPriority="71" w:semiHidden="0" w:name="Colorful Shading Accent 4"/>
     <w:lsdException w:unhideWhenUsed="0" w:uiPriority="72" w:semiHidden="0" w:name="Colorful List Accent 4"/>
     <w:lsdException w:unhideWhenUsed="0" w:uiPriority="73" w:semiHidden="0" w:name="Colorful Grid Accent 4"/>
-    <w:lsdException w:unhideWhenUsed="0" w:uiPriority="60" w:semiHidden="0" w:name="Light Shading Accent 5"/>
-    <w:lsdException w:unhideWhenUsed="0" w:uiPriority="61" w:semiHidden="0" w:name="Light List Accent 5"/>
+    <w:lsdException w:qFormat="1" w:unhideWhenUsed="0" w:uiPriority="60" w:semiHidden="0" w:name="Light Shading Accent 5"/>
+    <w:lsdException w:qFormat="1" w:unhideWhenUsed="0" w:uiPriority="61" w:semiHidden="0" w:name="Light List Accent 5"/>
     <w:lsdException w:unhideWhenUsed="0" w:uiPriority="62" w:semiHidden="0" w:name="Light Grid Accent 5"/>
     <w:lsdException w:unhideWhenUsed="0" w:uiPriority="63" w:semiHidden="0" w:name="Medium Shading 1 Accent 5"/>
     <w:lsdException w:unhideWhenUsed="0" w:uiPriority="64" w:semiHidden="0" w:name="Medium Shading 2 Accent 5"/>
-    <w:lsdException w:unhideWhenUsed="0" w:uiPriority="65" w:semiHidden="0" w:name="Medium List 1 Accent 5"/>
+    <w:lsdException w:qFormat="1" w:unhideWhenUsed="0" w:uiPriority="65" w:semiHidden="0" w:name="Medium List 1 Accent 5"/>
     <w:lsdException w:unhideWhenUsed="0" w:uiPriority="66" w:semiHidden="0" w:name="Medium List 2 Accent 5"/>
     <w:lsdException w:unhideWhenUsed="0" w:uiPriority="67" w:semiHidden="0" w:name="Medium Grid 1 Accent 5"/>
     <w:lsdException w:unhideWhenUsed="0" w:uiPriority="68" w:semiHidden="0" w:name="Medium Grid 2 Accent 5"/>
@@ -2655,6 +2698,7 @@
   <w:style w:type="table" w:styleId="35">
     <w:name w:val="Table Grid"/>
     <w:basedOn w:val="12"/>
+    <w:qFormat/>
     <w:uiPriority w:val="59"/>
     <w:pPr>
       <w:spacing w:after="0" w:line="240" w:lineRule="auto"/>
@@ -2702,6 +2746,7 @@
   <w:style w:type="table" w:styleId="37">
     <w:name w:val="Light Shading"/>
     <w:basedOn w:val="12"/>
+    <w:qFormat/>
     <w:uiPriority w:val="60"/>
     <w:pPr>
       <w:spacing w:after="0" w:line="240" w:lineRule="auto"/>
@@ -2999,6 +3044,7 @@
   <w:style w:type="table" w:styleId="40">
     <w:name w:val="Light Shading Accent 3"/>
     <w:basedOn w:val="12"/>
+    <w:qFormat/>
     <w:uiPriority w:val="60"/>
     <w:pPr>
       <w:spacing w:after="0" w:line="240" w:lineRule="auto"/>
@@ -3098,6 +3144,7 @@
   <w:style w:type="table" w:styleId="41">
     <w:name w:val="Light Shading Accent 4"/>
     <w:basedOn w:val="12"/>
+    <w:qFormat/>
     <w:uiPriority w:val="60"/>
     <w:pPr>
       <w:spacing w:after="0" w:line="240" w:lineRule="auto"/>
@@ -3197,6 +3244,7 @@
   <w:style w:type="table" w:styleId="42">
     <w:name w:val="Light Shading Accent 5"/>
     <w:basedOn w:val="12"/>
+    <w:qFormat/>
     <w:uiPriority w:val="60"/>
     <w:pPr>
       <w:spacing w:after="0" w:line="240" w:lineRule="auto"/>
@@ -3674,6 +3722,7 @@
   <w:style w:type="table" w:styleId="47">
     <w:name w:val="Light List Accent 3"/>
     <w:basedOn w:val="12"/>
+    <w:qFormat/>
     <w:uiPriority w:val="61"/>
     <w:pPr>
       <w:spacing w:after="0" w:line="240" w:lineRule="auto"/>
@@ -3860,6 +3909,7 @@
   <w:style w:type="table" w:styleId="49">
     <w:name w:val="Light List Accent 5"/>
     <w:basedOn w:val="12"/>
+    <w:qFormat/>
     <w:uiPriority w:val="61"/>
     <w:pPr>
       <w:spacing w:after="0" w:line="240" w:lineRule="auto"/>
@@ -4046,6 +4096,7 @@
   <w:style w:type="table" w:styleId="51">
     <w:name w:val="Light Grid"/>
     <w:basedOn w:val="12"/>
+    <w:qFormat/>
     <w:uiPriority w:val="62"/>
     <w:pPr>
       <w:spacing w:after="0" w:line="240" w:lineRule="auto"/>
@@ -4928,6 +4979,7 @@
   <w:style w:type="table" w:styleId="58">
     <w:name w:val="Medium Shading 1"/>
     <w:basedOn w:val="12"/>
+    <w:qFormat/>
     <w:uiPriority w:val="63"/>
     <w:pPr>
       <w:spacing w:after="0" w:line="240" w:lineRule="auto"/>
@@ -5035,6 +5087,7 @@
   <w:style w:type="table" w:styleId="59">
     <w:name w:val="Medium Shading 1 Accent 1"/>
     <w:basedOn w:val="12"/>
+    <w:qFormat/>
     <w:uiPriority w:val="63"/>
     <w:pPr>
       <w:spacing w:after="0" w:line="240" w:lineRule="auto"/>
@@ -6832,6 +6885,7 @@
   <w:style w:type="table" w:styleId="72">
     <w:name w:val="Medium List 1"/>
     <w:basedOn w:val="12"/>
+    <w:qFormat/>
     <w:uiPriority w:val="65"/>
     <w:pPr>
       <w:spacing w:after="0" w:line="240" w:lineRule="auto"/>
@@ -6922,6 +6976,7 @@
   <w:style w:type="table" w:styleId="73">
     <w:name w:val="Medium List 1 Accent 1"/>
     <w:basedOn w:val="12"/>
+    <w:qFormat/>
     <w:uiPriority w:val="65"/>
     <w:pPr>
       <w:spacing w:after="0" w:line="240" w:lineRule="auto"/>
@@ -7282,6 +7337,7 @@
   <w:style w:type="table" w:styleId="77">
     <w:name w:val="Medium List 1 Accent 5"/>
     <w:basedOn w:val="12"/>
+    <w:qFormat/>
     <w:uiPriority w:val="65"/>
     <w:pPr>
       <w:spacing w:after="0" w:line="240" w:lineRule="auto"/>

</xml_diff>

<commit_message>
feat: add OrderPrintService to handle document generation with backend integration and SQL procedure support
</commit_message>
<xml_diff>
--- a/backend-app/samples/In Don dat hang.docx
+++ b/backend-app/samples/In Don dat hang.docx
@@ -1,6 +1,6 @@
 
 <file path=word/document.xml><?xml version="1.0" encoding="utf-8"?>
-<w:document xmlns:wpc="http://schemas.microsoft.com/office/word/2010/wordprocessingCanvas" xmlns:mc="http://schemas.openxmlformats.org/markup-compatibility/2006" xmlns:o="urn:schemas-microsoft-com:office:office" xmlns:r="http://schemas.openxmlformats.org/officeDocument/2006/relationships" xmlns:m="http://schemas.openxmlformats.org/officeDocument/2006/math" xmlns:v="urn:schemas-microsoft-com:vml" xmlns:wp14="http://schemas.microsoft.com/office/word/2010/wordprocessingDrawing" xmlns:wp="http://schemas.openxmlformats.org/drawingml/2006/wordprocessingDrawing" xmlns:w="http://schemas.openxmlformats.org/wordprocessingml/2006/main" xmlns:w14="http://schemas.microsoft.com/office/word/2010/wordml" xmlns:w10="urn:schemas-microsoft-com:office:word" xmlns:w15="http://schemas.microsoft.com/office/word/2012/wordml" xmlns:wpg="http://schemas.microsoft.com/office/word/2010/wordprocessingGroup" xmlns:wpi="http://schemas.microsoft.com/office/word/2010/wordprocessingInk" xmlns:wne="http://schemas.microsoft.com/office/word/2006/wordml" xmlns:wps="http://schemas.microsoft.com/office/word/2010/wordprocessingShape" xmlns:wpsCustomData="http://www.wps.cn/officeDocument/2013/wpsCustomData" mc:Ignorable="w14 w15 wp14">
+<w:document xmlns:wpc="http://schemas.microsoft.com/office/word/2010/wordprocessingCanvas" xmlns:cx="http://schemas.microsoft.com/office/drawing/2014/chartex" xmlns:cx1="http://schemas.microsoft.com/office/drawing/2015/9/8/chartex" xmlns:cx2="http://schemas.microsoft.com/office/drawing/2015/10/21/chartex" xmlns:cx3="http://schemas.microsoft.com/office/drawing/2016/5/9/chartex" xmlns:cx4="http://schemas.microsoft.com/office/drawing/2016/5/10/chartex" xmlns:cx5="http://schemas.microsoft.com/office/drawing/2016/5/11/chartex" xmlns:cx6="http://schemas.microsoft.com/office/drawing/2016/5/12/chartex" xmlns:cx7="http://schemas.microsoft.com/office/drawing/2016/5/13/chartex" xmlns:cx8="http://schemas.microsoft.com/office/drawing/2016/5/14/chartex" xmlns:mc="http://schemas.openxmlformats.org/markup-compatibility/2006" xmlns:o="urn:schemas-microsoft-com:office:office" xmlns:r="http://schemas.openxmlformats.org/officeDocument/2006/relationships" xmlns:m="http://schemas.openxmlformats.org/officeDocument/2006/math" xmlns:v="urn:schemas-microsoft-com:vml" xmlns:wp14="http://schemas.microsoft.com/office/word/2010/wordprocessingDrawing" xmlns:wp="http://schemas.openxmlformats.org/drawingml/2006/wordprocessingDrawing" xmlns:w="http://schemas.openxmlformats.org/wordprocessingml/2006/main" xmlns:w14="http://schemas.microsoft.com/office/word/2010/wordml" xmlns:w10="urn:schemas-microsoft-com:office:word" xmlns:w15="http://schemas.microsoft.com/office/word/2012/wordml" xmlns:wpg="http://schemas.microsoft.com/office/word/2010/wordprocessingGroup" xmlns:wpi="http://schemas.microsoft.com/office/word/2010/wordprocessingInk" xmlns:wne="http://schemas.microsoft.com/office/word/2006/wordml" xmlns:wps="http://schemas.microsoft.com/office/word/2010/wordprocessingShape" xmlns:wpsCustomData="http://www.wps.cn/officeDocument/2013/wpsCustomData" mc:Ignorable="w14 w15 wp14">
   <w:body>
     <w:tbl>
       <w:tblPr>
@@ -63,6 +63,8 @@
               <w:spacing w:before="0" w:after="0"/>
               <w:jc w:val="left"/>
             </w:pPr>
+            <w:bookmarkStart w:id="0" w:name="_GoBack"/>
+            <w:bookmarkEnd w:id="0"/>
             <w:r>
               <w:drawing>
                 <wp:inline distT="0" distB="0" distL="114300" distR="114300">
@@ -203,8 +205,6 @@
               </w:rPr>
               <w:t xml:space="preserve">, </w:t>
             </w:r>
-            <w:bookmarkStart w:id="0" w:name="_GoBack"/>
-            <w:bookmarkEnd w:id="0"/>
             <w:r>
               <w:rPr>
                 <w:rFonts w:ascii="Segoe UI" w:hAnsi="Segoe UI" w:eastAsia="Segoe UI"/>
@@ -742,12 +742,6 @@
             <w:insideH w:val="single" w:color="C0C0C0" w:sz="6" w:space="0"/>
             <w:insideV w:val="single" w:color="C0C0C0" w:sz="6" w:space="0"/>
           </w:tblBorders>
-          <w:tblCellMar>
-            <w:top w:w="0" w:type="dxa"/>
-            <w:left w:w="108" w:type="dxa"/>
-            <w:bottom w:w="0" w:type="dxa"/>
-            <w:right w:w="108" w:type="dxa"/>
-          </w:tblCellMar>
         </w:tblPrEx>
         <w:trPr>
           <w:gridBefore w:val="1"/>
@@ -1195,8 +1189,8 @@
         </w:tblCellMar>
       </w:tblPr>
       <w:tblGrid>
-        <w:gridCol w:w="6506"/>
-        <w:gridCol w:w="4826"/>
+        <w:gridCol w:w="7005"/>
+        <w:gridCol w:w="4327"/>
       </w:tblGrid>
       <w:tr>
         <w:tblPrEx>
@@ -1208,19 +1202,13 @@
             <w:insideH w:val="none" w:color="auto" w:sz="0" w:space="0"/>
             <w:insideV w:val="none" w:color="auto" w:sz="0" w:space="0"/>
           </w:tblBorders>
-          <w:tblCellMar>
-            <w:top w:w="0" w:type="dxa"/>
-            <w:left w:w="108" w:type="dxa"/>
-            <w:bottom w:w="0" w:type="dxa"/>
-            <w:right w:w="108" w:type="dxa"/>
-          </w:tblCellMar>
         </w:tblPrEx>
         <w:trPr>
           <w:jc w:val="center"/>
         </w:trPr>
         <w:tc>
           <w:tcPr>
-            <w:tcW w:w="6506" w:type="dxa"/>
+            <w:tcW w:w="7005" w:type="dxa"/>
             <w:tcMar>
               <w:top w:w="10" w:type="dxa"/>
               <w:left w:w="60" w:type="dxa"/>
@@ -1246,7 +1234,7 @@
         </w:tc>
         <w:tc>
           <w:tcPr>
-            <w:tcW w:w="4826" w:type="dxa"/>
+            <w:tcW w:w="4327" w:type="dxa"/>
             <w:tcMar>
               <w:top w:w="10" w:type="dxa"/>
               <w:left w:w="60" w:type="dxa"/>
@@ -1304,7 +1292,7 @@
         </w:trPr>
         <w:tc>
           <w:tcPr>
-            <w:tcW w:w="6506" w:type="dxa"/>
+            <w:tcW w:w="7005" w:type="dxa"/>
             <w:tcMar>
               <w:top w:w="10" w:type="dxa"/>
               <w:left w:w="60" w:type="dxa"/>
@@ -1330,7 +1318,7 @@
         </w:tc>
         <w:tc>
           <w:tcPr>
-            <w:tcW w:w="4826" w:type="dxa"/>
+            <w:tcW w:w="4327" w:type="dxa"/>
             <w:tcMar>
               <w:top w:w="10" w:type="dxa"/>
               <w:left w:w="60" w:type="dxa"/>
@@ -1388,7 +1376,7 @@
         </w:trPr>
         <w:tc>
           <w:tcPr>
-            <w:tcW w:w="6506" w:type="dxa"/>
+            <w:tcW w:w="7005" w:type="dxa"/>
             <w:tcMar>
               <w:top w:w="10" w:type="dxa"/>
               <w:left w:w="60" w:type="dxa"/>
@@ -1400,7 +1388,7 @@
         </w:tc>
         <w:tc>
           <w:tcPr>
-            <w:tcW w:w="4826" w:type="dxa"/>
+            <w:tcW w:w="4327" w:type="dxa"/>
             <w:tcMar>
               <w:top w:w="10" w:type="dxa"/>
               <w:left w:w="60" w:type="dxa"/>
@@ -1458,7 +1446,7 @@
         </w:trPr>
         <w:tc>
           <w:tcPr>
-            <w:tcW w:w="6506" w:type="dxa"/>
+            <w:tcW w:w="7005" w:type="dxa"/>
             <w:tcMar>
               <w:top w:w="10" w:type="dxa"/>
               <w:left w:w="60" w:type="dxa"/>
@@ -1470,7 +1458,7 @@
         </w:tc>
         <w:tc>
           <w:tcPr>
-            <w:tcW w:w="4826" w:type="dxa"/>
+            <w:tcW w:w="4327" w:type="dxa"/>
             <w:tcBorders>
               <w:top w:val="single" w:color="AAAAAA" w:sz="8" w:space="0"/>
             </w:tcBorders>
@@ -2015,21 +2003,21 @@
     <w:lsdException w:unhideWhenUsed="0" w:uiPriority="61" w:semiHidden="0" w:name="Light List"/>
     <w:lsdException w:qFormat="1" w:unhideWhenUsed="0" w:uiPriority="62" w:semiHidden="0" w:name="Light Grid"/>
     <w:lsdException w:qFormat="1" w:unhideWhenUsed="0" w:uiPriority="63" w:semiHidden="0" w:name="Medium Shading 1"/>
-    <w:lsdException w:unhideWhenUsed="0" w:uiPriority="64" w:semiHidden="0" w:name="Medium Shading 2"/>
+    <w:lsdException w:qFormat="1" w:unhideWhenUsed="0" w:uiPriority="64" w:semiHidden="0" w:name="Medium Shading 2"/>
     <w:lsdException w:qFormat="1" w:unhideWhenUsed="0" w:uiPriority="65" w:semiHidden="0" w:name="Medium List 1"/>
-    <w:lsdException w:unhideWhenUsed="0" w:uiPriority="66" w:semiHidden="0" w:name="Medium List 2"/>
-    <w:lsdException w:unhideWhenUsed="0" w:uiPriority="67" w:semiHidden="0" w:name="Medium Grid 1"/>
+    <w:lsdException w:qFormat="1" w:unhideWhenUsed="0" w:uiPriority="66" w:semiHidden="0" w:name="Medium List 2"/>
+    <w:lsdException w:qFormat="1" w:unhideWhenUsed="0" w:uiPriority="67" w:semiHidden="0" w:name="Medium Grid 1"/>
     <w:lsdException w:unhideWhenUsed="0" w:uiPriority="68" w:semiHidden="0" w:name="Medium Grid 2"/>
     <w:lsdException w:unhideWhenUsed="0" w:uiPriority="69" w:semiHidden="0" w:name="Medium Grid 3"/>
-    <w:lsdException w:unhideWhenUsed="0" w:uiPriority="70" w:semiHidden="0" w:name="Dark List"/>
-    <w:lsdException w:unhideWhenUsed="0" w:uiPriority="71" w:semiHidden="0" w:name="Colorful Shading"/>
+    <w:lsdException w:qFormat="1" w:unhideWhenUsed="0" w:uiPriority="70" w:semiHidden="0" w:name="Dark List"/>
+    <w:lsdException w:qFormat="1" w:unhideWhenUsed="0" w:uiPriority="71" w:semiHidden="0" w:name="Colorful Shading"/>
     <w:lsdException w:unhideWhenUsed="0" w:uiPriority="72" w:semiHidden="0" w:name="Colorful List"/>
-    <w:lsdException w:unhideWhenUsed="0" w:uiPriority="73" w:semiHidden="0" w:name="Colorful Grid"/>
+    <w:lsdException w:qFormat="1" w:unhideWhenUsed="0" w:uiPriority="73" w:semiHidden="0" w:name="Colorful Grid"/>
     <w:lsdException w:unhideWhenUsed="0" w:uiPriority="60" w:semiHidden="0" w:name="Light Shading Accent 1"/>
     <w:lsdException w:unhideWhenUsed="0" w:uiPriority="61" w:semiHidden="0" w:name="Light List Accent 1"/>
     <w:lsdException w:unhideWhenUsed="0" w:uiPriority="62" w:semiHidden="0" w:name="Light Grid Accent 1"/>
     <w:lsdException w:qFormat="1" w:unhideWhenUsed="0" w:uiPriority="63" w:semiHidden="0" w:name="Medium Shading 1 Accent 1"/>
-    <w:lsdException w:unhideWhenUsed="0" w:uiPriority="64" w:semiHidden="0" w:name="Medium Shading 2 Accent 1"/>
+    <w:lsdException w:qFormat="1" w:unhideWhenUsed="0" w:uiPriority="64" w:semiHidden="0" w:name="Medium Shading 2 Accent 1"/>
     <w:lsdException w:qFormat="1" w:unhideWhenUsed="0" w:uiPriority="65" w:semiHidden="0" w:name="Medium List 1 Accent 1"/>
     <w:lsdException w:qFormat="1" w:unhideWhenUsed="0" w:uiPriority="34" w:semiHidden="0" w:name="List Paragraph"/>
     <w:lsdException w:qFormat="1" w:unhideWhenUsed="0" w:uiPriority="29" w:semiHidden="0" w:name="Quote"/>
@@ -2037,31 +2025,31 @@
     <w:lsdException w:unhideWhenUsed="0" w:uiPriority="66" w:semiHidden="0" w:name="Medium List 2 Accent 1"/>
     <w:lsdException w:unhideWhenUsed="0" w:uiPriority="67" w:semiHidden="0" w:name="Medium Grid 1 Accent 1"/>
     <w:lsdException w:unhideWhenUsed="0" w:uiPriority="68" w:semiHidden="0" w:name="Medium Grid 2 Accent 1"/>
-    <w:lsdException w:unhideWhenUsed="0" w:uiPriority="69" w:semiHidden="0" w:name="Medium Grid 3 Accent 1"/>
+    <w:lsdException w:qFormat="1" w:unhideWhenUsed="0" w:uiPriority="69" w:semiHidden="0" w:name="Medium Grid 3 Accent 1"/>
     <w:lsdException w:unhideWhenUsed="0" w:uiPriority="70" w:semiHidden="0" w:name="Dark List Accent 1"/>
     <w:lsdException w:unhideWhenUsed="0" w:uiPriority="71" w:semiHidden="0" w:name="Colorful Shading Accent 1"/>
     <w:lsdException w:unhideWhenUsed="0" w:uiPriority="72" w:semiHidden="0" w:name="Colorful List Accent 1"/>
     <w:lsdException w:unhideWhenUsed="0" w:uiPriority="73" w:semiHidden="0" w:name="Colorful Grid Accent 1"/>
     <w:lsdException w:unhideWhenUsed="0" w:uiPriority="60" w:semiHidden="0" w:name="Light Shading Accent 2"/>
     <w:lsdException w:unhideWhenUsed="0" w:uiPriority="61" w:semiHidden="0" w:name="Light List Accent 2"/>
-    <w:lsdException w:unhideWhenUsed="0" w:uiPriority="62" w:semiHidden="0" w:name="Light Grid Accent 2"/>
+    <w:lsdException w:qFormat="1" w:unhideWhenUsed="0" w:uiPriority="62" w:semiHidden="0" w:name="Light Grid Accent 2"/>
     <w:lsdException w:unhideWhenUsed="0" w:uiPriority="63" w:semiHidden="0" w:name="Medium Shading 1 Accent 2"/>
-    <w:lsdException w:unhideWhenUsed="0" w:uiPriority="64" w:semiHidden="0" w:name="Medium Shading 2 Accent 2"/>
-    <w:lsdException w:unhideWhenUsed="0" w:uiPriority="65" w:semiHidden="0" w:name="Medium List 1 Accent 2"/>
-    <w:lsdException w:unhideWhenUsed="0" w:uiPriority="66" w:semiHidden="0" w:name="Medium List 2 Accent 2"/>
+    <w:lsdException w:qFormat="1" w:unhideWhenUsed="0" w:uiPriority="64" w:semiHidden="0" w:name="Medium Shading 2 Accent 2"/>
+    <w:lsdException w:qFormat="1" w:unhideWhenUsed="0" w:uiPriority="65" w:semiHidden="0" w:name="Medium List 1 Accent 2"/>
+    <w:lsdException w:qFormat="1" w:unhideWhenUsed="0" w:uiPriority="66" w:semiHidden="0" w:name="Medium List 2 Accent 2"/>
     <w:lsdException w:unhideWhenUsed="0" w:uiPriority="67" w:semiHidden="0" w:name="Medium Grid 1 Accent 2"/>
     <w:lsdException w:unhideWhenUsed="0" w:uiPriority="68" w:semiHidden="0" w:name="Medium Grid 2 Accent 2"/>
     <w:lsdException w:unhideWhenUsed="0" w:uiPriority="69" w:semiHidden="0" w:name="Medium Grid 3 Accent 2"/>
-    <w:lsdException w:unhideWhenUsed="0" w:uiPriority="70" w:semiHidden="0" w:name="Dark List Accent 2"/>
+    <w:lsdException w:qFormat="1" w:unhideWhenUsed="0" w:uiPriority="70" w:semiHidden="0" w:name="Dark List Accent 2"/>
     <w:lsdException w:unhideWhenUsed="0" w:uiPriority="71" w:semiHidden="0" w:name="Colorful Shading Accent 2"/>
     <w:lsdException w:unhideWhenUsed="0" w:uiPriority="72" w:semiHidden="0" w:name="Colorful List Accent 2"/>
-    <w:lsdException w:unhideWhenUsed="0" w:uiPriority="73" w:semiHidden="0" w:name="Colorful Grid Accent 2"/>
+    <w:lsdException w:qFormat="1" w:unhideWhenUsed="0" w:uiPriority="73" w:semiHidden="0" w:name="Colorful Grid Accent 2"/>
     <w:lsdException w:qFormat="1" w:unhideWhenUsed="0" w:uiPriority="60" w:semiHidden="0" w:name="Light Shading Accent 3"/>
     <w:lsdException w:qFormat="1" w:unhideWhenUsed="0" w:uiPriority="61" w:semiHidden="0" w:name="Light List Accent 3"/>
-    <w:lsdException w:unhideWhenUsed="0" w:uiPriority="62" w:semiHidden="0" w:name="Light Grid Accent 3"/>
+    <w:lsdException w:qFormat="1" w:unhideWhenUsed="0" w:uiPriority="62" w:semiHidden="0" w:name="Light Grid Accent 3"/>
     <w:lsdException w:unhideWhenUsed="0" w:uiPriority="63" w:semiHidden="0" w:name="Medium Shading 1 Accent 3"/>
-    <w:lsdException w:unhideWhenUsed="0" w:uiPriority="64" w:semiHidden="0" w:name="Medium Shading 2 Accent 3"/>
-    <w:lsdException w:unhideWhenUsed="0" w:uiPriority="65" w:semiHidden="0" w:name="Medium List 1 Accent 3"/>
+    <w:lsdException w:qFormat="1" w:unhideWhenUsed="0" w:uiPriority="64" w:semiHidden="0" w:name="Medium Shading 2 Accent 3"/>
+    <w:lsdException w:qFormat="1" w:unhideWhenUsed="0" w:uiPriority="65" w:semiHidden="0" w:name="Medium List 1 Accent 3"/>
     <w:lsdException w:unhideWhenUsed="0" w:uiPriority="66" w:semiHidden="0" w:name="Medium List 2 Accent 3"/>
     <w:lsdException w:unhideWhenUsed="0" w:uiPriority="67" w:semiHidden="0" w:name="Medium Grid 1 Accent 3"/>
     <w:lsdException w:unhideWhenUsed="0" w:uiPriority="68" w:semiHidden="0" w:name="Medium Grid 2 Accent 3"/>
@@ -2072,44 +2060,44 @@
     <w:lsdException w:unhideWhenUsed="0" w:uiPriority="73" w:semiHidden="0" w:name="Colorful Grid Accent 3"/>
     <w:lsdException w:qFormat="1" w:unhideWhenUsed="0" w:uiPriority="60" w:semiHidden="0" w:name="Light Shading Accent 4"/>
     <w:lsdException w:unhideWhenUsed="0" w:uiPriority="61" w:semiHidden="0" w:name="Light List Accent 4"/>
-    <w:lsdException w:unhideWhenUsed="0" w:uiPriority="62" w:semiHidden="0" w:name="Light Grid Accent 4"/>
-    <w:lsdException w:unhideWhenUsed="0" w:uiPriority="63" w:semiHidden="0" w:name="Medium Shading 1 Accent 4"/>
+    <w:lsdException w:qFormat="1" w:unhideWhenUsed="0" w:uiPriority="62" w:semiHidden="0" w:name="Light Grid Accent 4"/>
+    <w:lsdException w:qFormat="1" w:unhideWhenUsed="0" w:uiPriority="63" w:semiHidden="0" w:name="Medium Shading 1 Accent 4"/>
     <w:lsdException w:unhideWhenUsed="0" w:uiPriority="64" w:semiHidden="0" w:name="Medium Shading 2 Accent 4"/>
     <w:lsdException w:unhideWhenUsed="0" w:uiPriority="65" w:semiHidden="0" w:name="Medium List 1 Accent 4"/>
     <w:lsdException w:unhideWhenUsed="0" w:uiPriority="66" w:semiHidden="0" w:name="Medium List 2 Accent 4"/>
-    <w:lsdException w:unhideWhenUsed="0" w:uiPriority="67" w:semiHidden="0" w:name="Medium Grid 1 Accent 4"/>
-    <w:lsdException w:unhideWhenUsed="0" w:uiPriority="68" w:semiHidden="0" w:name="Medium Grid 2 Accent 4"/>
+    <w:lsdException w:qFormat="1" w:unhideWhenUsed="0" w:uiPriority="67" w:semiHidden="0" w:name="Medium Grid 1 Accent 4"/>
+    <w:lsdException w:qFormat="1" w:unhideWhenUsed="0" w:uiPriority="68" w:semiHidden="0" w:name="Medium Grid 2 Accent 4"/>
     <w:lsdException w:unhideWhenUsed="0" w:uiPriority="69" w:semiHidden="0" w:name="Medium Grid 3 Accent 4"/>
     <w:lsdException w:unhideWhenUsed="0" w:uiPriority="70" w:semiHidden="0" w:name="Dark List Accent 4"/>
-    <w:lsdException w:unhideWhenUsed="0" w:uiPriority="71" w:semiHidden="0" w:name="Colorful Shading Accent 4"/>
+    <w:lsdException w:qFormat="1" w:unhideWhenUsed="0" w:uiPriority="71" w:semiHidden="0" w:name="Colorful Shading Accent 4"/>
     <w:lsdException w:unhideWhenUsed="0" w:uiPriority="72" w:semiHidden="0" w:name="Colorful List Accent 4"/>
-    <w:lsdException w:unhideWhenUsed="0" w:uiPriority="73" w:semiHidden="0" w:name="Colorful Grid Accent 4"/>
+    <w:lsdException w:qFormat="1" w:unhideWhenUsed="0" w:uiPriority="73" w:semiHidden="0" w:name="Colorful Grid Accent 4"/>
     <w:lsdException w:qFormat="1" w:unhideWhenUsed="0" w:uiPriority="60" w:semiHidden="0" w:name="Light Shading Accent 5"/>
     <w:lsdException w:qFormat="1" w:unhideWhenUsed="0" w:uiPriority="61" w:semiHidden="0" w:name="Light List Accent 5"/>
     <w:lsdException w:unhideWhenUsed="0" w:uiPriority="62" w:semiHidden="0" w:name="Light Grid Accent 5"/>
     <w:lsdException w:unhideWhenUsed="0" w:uiPriority="63" w:semiHidden="0" w:name="Medium Shading 1 Accent 5"/>
     <w:lsdException w:unhideWhenUsed="0" w:uiPriority="64" w:semiHidden="0" w:name="Medium Shading 2 Accent 5"/>
     <w:lsdException w:qFormat="1" w:unhideWhenUsed="0" w:uiPriority="65" w:semiHidden="0" w:name="Medium List 1 Accent 5"/>
-    <w:lsdException w:unhideWhenUsed="0" w:uiPriority="66" w:semiHidden="0" w:name="Medium List 2 Accent 5"/>
+    <w:lsdException w:qFormat="1" w:unhideWhenUsed="0" w:uiPriority="66" w:semiHidden="0" w:name="Medium List 2 Accent 5"/>
     <w:lsdException w:unhideWhenUsed="0" w:uiPriority="67" w:semiHidden="0" w:name="Medium Grid 1 Accent 5"/>
     <w:lsdException w:unhideWhenUsed="0" w:uiPriority="68" w:semiHidden="0" w:name="Medium Grid 2 Accent 5"/>
-    <w:lsdException w:unhideWhenUsed="0" w:uiPriority="69" w:semiHidden="0" w:name="Medium Grid 3 Accent 5"/>
+    <w:lsdException w:qFormat="1" w:unhideWhenUsed="0" w:uiPriority="69" w:semiHidden="0" w:name="Medium Grid 3 Accent 5"/>
     <w:lsdException w:unhideWhenUsed="0" w:uiPriority="70" w:semiHidden="0" w:name="Dark List Accent 5"/>
-    <w:lsdException w:unhideWhenUsed="0" w:uiPriority="71" w:semiHidden="0" w:name="Colorful Shading Accent 5"/>
+    <w:lsdException w:qFormat="1" w:unhideWhenUsed="0" w:uiPriority="71" w:semiHidden="0" w:name="Colorful Shading Accent 5"/>
     <w:lsdException w:unhideWhenUsed="0" w:uiPriority="72" w:semiHidden="0" w:name="Colorful List Accent 5"/>
     <w:lsdException w:unhideWhenUsed="0" w:uiPriority="73" w:semiHidden="0" w:name="Colorful Grid Accent 5"/>
     <w:lsdException w:unhideWhenUsed="0" w:uiPriority="60" w:semiHidden="0" w:name="Light Shading Accent 6"/>
     <w:lsdException w:unhideWhenUsed="0" w:uiPriority="61" w:semiHidden="0" w:name="Light List Accent 6"/>
-    <w:lsdException w:unhideWhenUsed="0" w:uiPriority="62" w:semiHidden="0" w:name="Light Grid Accent 6"/>
-    <w:lsdException w:unhideWhenUsed="0" w:uiPriority="63" w:semiHidden="0" w:name="Medium Shading 1 Accent 6"/>
+    <w:lsdException w:qFormat="1" w:unhideWhenUsed="0" w:uiPriority="62" w:semiHidden="0" w:name="Light Grid Accent 6"/>
+    <w:lsdException w:qFormat="1" w:unhideWhenUsed="0" w:uiPriority="63" w:semiHidden="0" w:name="Medium Shading 1 Accent 6"/>
     <w:lsdException w:unhideWhenUsed="0" w:uiPriority="64" w:semiHidden="0" w:name="Medium Shading 2 Accent 6"/>
     <w:lsdException w:unhideWhenUsed="0" w:uiPriority="65" w:semiHidden="0" w:name="Medium List 1 Accent 6"/>
     <w:lsdException w:unhideWhenUsed="0" w:uiPriority="66" w:semiHidden="0" w:name="Medium List 2 Accent 6"/>
-    <w:lsdException w:unhideWhenUsed="0" w:uiPriority="67" w:semiHidden="0" w:name="Medium Grid 1 Accent 6"/>
-    <w:lsdException w:unhideWhenUsed="0" w:uiPriority="68" w:semiHidden="0" w:name="Medium Grid 2 Accent 6"/>
+    <w:lsdException w:qFormat="1" w:unhideWhenUsed="0" w:uiPriority="67" w:semiHidden="0" w:name="Medium Grid 1 Accent 6"/>
+    <w:lsdException w:qFormat="1" w:unhideWhenUsed="0" w:uiPriority="68" w:semiHidden="0" w:name="Medium Grid 2 Accent 6"/>
     <w:lsdException w:unhideWhenUsed="0" w:uiPriority="69" w:semiHidden="0" w:name="Medium Grid 3 Accent 6"/>
     <w:lsdException w:unhideWhenUsed="0" w:uiPriority="70" w:semiHidden="0" w:name="Dark List Accent 6"/>
-    <w:lsdException w:unhideWhenUsed="0" w:uiPriority="71" w:semiHidden="0" w:name="Colorful Shading Accent 6"/>
+    <w:lsdException w:qFormat="1" w:unhideWhenUsed="0" w:uiPriority="71" w:semiHidden="0" w:name="Colorful Shading Accent 6"/>
     <w:lsdException w:unhideWhenUsed="0" w:uiPriority="72" w:semiHidden="0" w:name="Colorful List Accent 6"/>
     <w:lsdException w:unhideWhenUsed="0" w:uiPriority="73" w:semiHidden="0" w:name="Colorful Grid Accent 6"/>
   </w:latentStyles>
@@ -4349,6 +4337,7 @@
   <w:style w:type="table" w:styleId="53">
     <w:name w:val="Light Grid Accent 2"/>
     <w:basedOn w:val="12"/>
+    <w:qFormat/>
     <w:uiPriority w:val="62"/>
     <w:pPr>
       <w:spacing w:after="0" w:line="240" w:lineRule="auto"/>
@@ -4475,6 +4464,7 @@
   <w:style w:type="table" w:styleId="54">
     <w:name w:val="Light Grid Accent 3"/>
     <w:basedOn w:val="12"/>
+    <w:qFormat/>
     <w:uiPriority w:val="62"/>
     <w:pPr>
       <w:spacing w:after="0" w:line="240" w:lineRule="auto"/>
@@ -4601,6 +4591,7 @@
   <w:style w:type="table" w:styleId="55">
     <w:name w:val="Light Grid Accent 4"/>
     <w:basedOn w:val="12"/>
+    <w:qFormat/>
     <w:uiPriority w:val="62"/>
     <w:pPr>
       <w:spacing w:after="0" w:line="240" w:lineRule="auto"/>
@@ -4853,6 +4844,7 @@
   <w:style w:type="table" w:styleId="57">
     <w:name w:val="Light Grid Accent 6"/>
     <w:basedOn w:val="12"/>
+    <w:qFormat/>
     <w:uiPriority w:val="62"/>
     <w:pPr>
       <w:spacing w:after="0" w:line="240" w:lineRule="auto"/>
@@ -5409,6 +5401,7 @@
   <w:style w:type="table" w:styleId="62">
     <w:name w:val="Medium Shading 1 Accent 4"/>
     <w:basedOn w:val="12"/>
+    <w:qFormat/>
     <w:uiPriority w:val="63"/>
     <w:pPr>
       <w:spacing w:after="0" w:line="240" w:lineRule="auto"/>
@@ -5623,6 +5616,7 @@
   <w:style w:type="table" w:styleId="64">
     <w:name w:val="Medium Shading 1 Accent 6"/>
     <w:basedOn w:val="12"/>
+    <w:qFormat/>
     <w:uiPriority w:val="63"/>
     <w:pPr>
       <w:spacing w:after="0" w:line="240" w:lineRule="auto"/>
@@ -5730,6 +5724,7 @@
   <w:style w:type="table" w:styleId="65">
     <w:name w:val="Medium Shading 2"/>
     <w:basedOn w:val="12"/>
+    <w:qFormat/>
     <w:uiPriority w:val="64"/>
     <w:pPr>
       <w:spacing w:after="0" w:line="240" w:lineRule="auto"/>
@@ -5895,6 +5890,7 @@
   <w:style w:type="table" w:styleId="66">
     <w:name w:val="Medium Shading 2 Accent 1"/>
     <w:basedOn w:val="12"/>
+    <w:qFormat/>
     <w:uiPriority w:val="64"/>
     <w:pPr>
       <w:spacing w:after="0" w:line="240" w:lineRule="auto"/>
@@ -6060,6 +6056,7 @@
   <w:style w:type="table" w:styleId="67">
     <w:name w:val="Medium Shading 2 Accent 2"/>
     <w:basedOn w:val="12"/>
+    <w:qFormat/>
     <w:uiPriority w:val="64"/>
     <w:pPr>
       <w:spacing w:after="0" w:line="240" w:lineRule="auto"/>
@@ -6225,6 +6222,7 @@
   <w:style w:type="table" w:styleId="68">
     <w:name w:val="Medium Shading 2 Accent 3"/>
     <w:basedOn w:val="12"/>
+    <w:qFormat/>
     <w:uiPriority w:val="64"/>
     <w:pPr>
       <w:spacing w:after="0" w:line="240" w:lineRule="auto"/>
@@ -7067,6 +7065,7 @@
   <w:style w:type="table" w:styleId="74">
     <w:name w:val="Medium List 1 Accent 2"/>
     <w:basedOn w:val="12"/>
+    <w:qFormat/>
     <w:uiPriority w:val="65"/>
     <w:pPr>
       <w:spacing w:after="0" w:line="240" w:lineRule="auto"/>
@@ -7157,6 +7156,7 @@
   <w:style w:type="table" w:styleId="75">
     <w:name w:val="Medium List 1 Accent 3"/>
     <w:basedOn w:val="12"/>
+    <w:qFormat/>
     <w:uiPriority w:val="65"/>
     <w:pPr>
       <w:spacing w:after="0" w:line="240" w:lineRule="auto"/>
@@ -7518,6 +7518,7 @@
   <w:style w:type="table" w:styleId="79">
     <w:name w:val="Medium List 2"/>
     <w:basedOn w:val="12"/>
+    <w:qFormat/>
     <w:uiPriority w:val="66"/>
     <w:pPr>
       <w:spacing w:after="0" w:line="240" w:lineRule="auto"/>
@@ -7776,6 +7777,7 @@
   <w:style w:type="table" w:styleId="81">
     <w:name w:val="Medium List 2 Accent 2"/>
     <w:basedOn w:val="12"/>
+    <w:qFormat/>
     <w:uiPriority w:val="66"/>
     <w:pPr>
       <w:spacing w:after="0" w:line="240" w:lineRule="auto"/>
@@ -8163,6 +8165,7 @@
   <w:style w:type="table" w:styleId="84">
     <w:name w:val="Medium List 2 Accent 5"/>
     <w:basedOn w:val="12"/>
+    <w:qFormat/>
     <w:uiPriority w:val="66"/>
     <w:pPr>
       <w:spacing w:after="0" w:line="240" w:lineRule="auto"/>
@@ -8421,6 +8424,7 @@
   <w:style w:type="table" w:styleId="86">
     <w:name w:val="Medium Grid 1"/>
     <w:basedOn w:val="12"/>
+    <w:qFormat/>
     <w:uiPriority w:val="67"/>
     <w:pPr>
       <w:spacing w:after="0" w:line="240" w:lineRule="auto"/>
@@ -8697,6 +8701,7 @@
   <w:style w:type="table" w:styleId="90">
     <w:name w:val="Medium Grid 1 Accent 4"/>
     <w:basedOn w:val="12"/>
+    <w:qFormat/>
     <w:uiPriority w:val="67"/>
     <w:pPr>
       <w:spacing w:after="0" w:line="240" w:lineRule="auto"/>
@@ -8835,6 +8840,7 @@
   <w:style w:type="table" w:styleId="92">
     <w:name w:val="Medium Grid 1 Accent 6"/>
     <w:basedOn w:val="12"/>
+    <w:qFormat/>
     <w:uiPriority w:val="67"/>
     <w:pPr>
       <w:spacing w:after="0" w:line="240" w:lineRule="auto"/>
@@ -9488,6 +9494,7 @@
   <w:style w:type="table" w:styleId="97">
     <w:name w:val="Medium Grid 2 Accent 4"/>
     <w:basedOn w:val="12"/>
+    <w:qFormat/>
     <w:uiPriority w:val="68"/>
     <w:pPr>
       <w:spacing w:after="0" w:line="240" w:lineRule="auto"/>
@@ -9780,6 +9787,7 @@
   <w:style w:type="table" w:styleId="99">
     <w:name w:val="Medium Grid 2 Accent 6"/>
     <w:basedOn w:val="12"/>
+    <w:qFormat/>
     <w:uiPriority w:val="68"/>
     <w:pPr>
       <w:spacing w:after="0" w:line="240" w:lineRule="auto"/>
@@ -10083,6 +10091,7 @@
   <w:style w:type="table" w:styleId="101">
     <w:name w:val="Medium Grid 3 Accent 1"/>
     <w:basedOn w:val="12"/>
+    <w:qFormat/>
     <w:uiPriority w:val="69"/>
     <w:pPr>
       <w:spacing w:after="0" w:line="240" w:lineRule="auto"/>
@@ -10711,6 +10720,7 @@
   <w:style w:type="table" w:styleId="105">
     <w:name w:val="Medium Grid 3 Accent 5"/>
     <w:basedOn w:val="12"/>
+    <w:qFormat/>
     <w:uiPriority w:val="69"/>
     <w:pPr>
       <w:spacing w:after="0" w:line="240" w:lineRule="auto"/>
@@ -11025,6 +11035,7 @@
   <w:style w:type="table" w:styleId="107">
     <w:name w:val="Dark List"/>
     <w:basedOn w:val="12"/>
+    <w:qFormat/>
     <w:uiPriority w:val="70"/>
     <w:pPr>
       <w:spacing w:after="0" w:line="240" w:lineRule="auto"/>
@@ -11255,6 +11266,7 @@
   <w:style w:type="table" w:styleId="109">
     <w:name w:val="Dark List Accent 2"/>
     <w:basedOn w:val="12"/>
+    <w:qFormat/>
     <w:uiPriority w:val="70"/>
     <w:pPr>
       <w:spacing w:after="0" w:line="240" w:lineRule="auto"/>
@@ -11830,6 +11842,7 @@
   <w:style w:type="table" w:styleId="114">
     <w:name w:val="Colorful Shading"/>
     <w:basedOn w:val="12"/>
+    <w:qFormat/>
     <w:uiPriority w:val="71"/>
     <w:pPr>
       <w:spacing w:after="0" w:line="240" w:lineRule="auto"/>
@@ -12402,6 +12415,7 @@
   <w:style w:type="table" w:styleId="118">
     <w:name w:val="Colorful Shading Accent 4"/>
     <w:basedOn w:val="12"/>
+    <w:qFormat/>
     <w:uiPriority w:val="71"/>
     <w:pPr>
       <w:spacing w:after="0" w:line="240" w:lineRule="auto"/>
@@ -12550,6 +12564,7 @@
   <w:style w:type="table" w:styleId="119">
     <w:name w:val="Colorful Shading Accent 5"/>
     <w:basedOn w:val="12"/>
+    <w:qFormat/>
     <w:uiPriority w:val="71"/>
     <w:pPr>
       <w:spacing w:after="0" w:line="240" w:lineRule="auto"/>
@@ -12698,6 +12713,7 @@
   <w:style w:type="table" w:styleId="120">
     <w:name w:val="Colorful Shading Accent 6"/>
     <w:basedOn w:val="12"/>
+    <w:qFormat/>
     <w:uiPriority w:val="71"/>
     <w:pPr>
       <w:spacing w:after="0" w:line="240" w:lineRule="auto"/>
@@ -13490,6 +13506,7 @@
   <w:style w:type="table" w:styleId="128">
     <w:name w:val="Colorful Grid"/>
     <w:basedOn w:val="12"/>
+    <w:qFormat/>
     <w:uiPriority w:val="73"/>
     <w:pPr>
       <w:spacing w:after="0" w:line="240" w:lineRule="auto"/>
@@ -13682,6 +13699,7 @@
   <w:style w:type="table" w:styleId="130">
     <w:name w:val="Colorful Grid Accent 2"/>
     <w:basedOn w:val="12"/>
+    <w:qFormat/>
     <w:uiPriority w:val="73"/>
     <w:pPr>
       <w:spacing w:after="0" w:line="240" w:lineRule="auto"/>
@@ -13874,6 +13892,7 @@
   <w:style w:type="table" w:styleId="132">
     <w:name w:val="Colorful Grid Accent 4"/>
     <w:basedOn w:val="12"/>
+    <w:qFormat/>
     <w:uiPriority w:val="73"/>
     <w:pPr>
       <w:spacing w:after="0" w:line="240" w:lineRule="auto"/>

</xml_diff>